<commit_message>
Figure 4: expand into a three-panel result/measurement/mechanism set
Turn the single lambda_c(rho12) plot into a coherent triptych sharing the
teal/coral/blue palette: (a) the exact rho(N)=1 threshold vs the bootstrap of
the Gillespie measurement; (b) the subcritical 1/chi->0 extrapolation behind
each box, colour-coded by rho12, whose x-intercept is lambda_c; (c) the
next-generation spectral radius rho(N) at fixed lambda crossing unity as rho12
grows, which is why the threshold falls. Panel (c)'s lambda=lambda_c(0) line
crosses rho(N)=1 at rho12=0 to machine precision. Caption rewritten for the
three panels; section and combined documents regenerated.

Co-Authored-By: Claude Opus 4.8 <noreply@anthropic.com>
Claude-Session: https://claude.ai/code/session_01GMqZS1ZXii3SRe677Qn7Mk
</commit_message>
<xml_diff>
--- a/multiplex-hypergraph-sir/combined_cn.docx
+++ b/multiplex-hypergraph-sir/combined_cn.docx
@@ -9358,7 +9358,7 @@
       <w:r>
         <w:drawing>
           <wp:inline distT="0" distB="0" distL="0" distR="0">
-            <wp:extent cx="3810000" cy="2790825"/>
+            <wp:extent cx="4629150" cy="1438275"/>
             <wp:effectExtent t="0" r="0" b="0" l="0"/>
             <wp:docPr id="1" name="" descr="" title=""/>
             <wp:cNvGraphicFramePr>
@@ -9383,7 +9383,7 @@
                   <pic:spPr bwMode="auto">
                     <a:xfrm>
                       <a:off x="0" y="0"/>
-                      <a:ext cx="3810000" cy="2790825"/>
+                      <a:ext cx="4629150" cy="1438275"/>
                     </a:xfrm>
                     <a:prstGeom prst="rect">
                       <a:avLst/>
@@ -9512,7 +9512,7 @@
           <w:sz w:val="18"/>
           <w:szCs w:val="18"/>
         </w:rPr>
-        <w:t xml:space="preserve">。蓝线为 </w:t>
+        <w:t xml:space="preserve">。（a）结果：蓝线为 </w:t>
       </w:r>
       <w:r>
         <w:rPr>
@@ -9530,25 +9530,7 @@
           <w:sz w:val="18"/>
           <w:szCs w:val="18"/>
         </w:rPr>
-        <w:t xml:space="preserve"> 的精确阈值，箱线图为多重超图上直接 Gillespie 仿真所得阈值的自助分布（亚临界簇规模外推 </w:t>
-      </w:r>
-      <w:r>
-        <w:rPr>
-          <w:rFonts w:ascii="Cambria Math" w:cs="Cambria Math" w:eastAsia="Cambria Math" w:hAnsi="Cambria Math"/>
-          <w:color w:val="000000"/>
-          <w:sz w:val="18"/>
-          <w:szCs w:val="18"/>
-        </w:rPr>
-        <w:t xml:space="preserve">1/χ→0</w:t>
-      </w:r>
-      <w:r>
-        <w:rPr>
-          <w:rFonts w:ascii="SimSun" w:cs="SimSun" w:eastAsia="SimSun" w:hAnsi="SimSun"/>
-          <w:color w:val="000000"/>
-          <w:sz w:val="18"/>
-          <w:szCs w:val="18"/>
-        </w:rPr>
-        <w:t xml:space="preserve">、</w:t>
+        <w:t xml:space="preserve"> 的精确阈值，箱线为多重超图上直接 Gillespie 仿真所得阈值的自助分布（</w:t>
       </w:r>
       <w:r>
         <w:rPr>
@@ -9576,7 +9558,7 @@
           <w:sz w:val="18"/>
           <w:szCs w:val="18"/>
         </w:rPr>
-        <w:t xml:space="preserve">；箱体为四分位距、须为 5–95 百分位、中线为中位数）。</w:t>
+        <w:t xml:space="preserve">；箱体为四分位距、须为 5–95 百分位、中线为中位数），</w:t>
       </w:r>
       <w:r>
         <w:rPr>
@@ -9632,7 +9614,301 @@
           <w:sz w:val="18"/>
           <w:szCs w:val="18"/>
         </w:rPr>
-        <w:t xml:space="preserve"> 单调下降约 12.5%，理论与仿真在六点上一致至 1.9σ。</w:t>
+        <w:t xml:space="preserve"> 单调下降约 12.5%，六点上一致至 1.9σ。（b）测量：各 </w:t>
+      </w:r>
+      <w:r>
+        <w:rPr>
+          <w:rFonts w:ascii="Cambria Math" w:cs="Cambria Math" w:eastAsia="Cambria Math" w:hAnsi="Cambria Math"/>
+          <w:color w:val="000000"/>
+          <w:sz w:val="18"/>
+          <w:szCs w:val="18"/>
+        </w:rPr>
+        <w:t xml:space="preserve">ρ</w:t>
+      </w:r>
+      <w:r>
+        <w:rPr>
+          <w:rFonts w:ascii="Cambria Math" w:cs="Cambria Math" w:eastAsia="Cambria Math" w:hAnsi="Cambria Math"/>
+          <w:color w:val="000000"/>
+          <w:sz w:val="18"/>
+          <w:szCs w:val="18"/>
+          <w:vertAlign w:val="subscript"/>
+        </w:rPr>
+        <w:t xml:space="preserve">12</w:t>
+      </w:r>
+      <w:r>
+        <w:rPr>
+          <w:rFonts w:ascii="SimSun" w:cs="SimSun" w:eastAsia="SimSun" w:hAnsi="SimSun"/>
+          <w:color w:val="000000"/>
+          <w:sz w:val="18"/>
+          <w:szCs w:val="18"/>
+        </w:rPr>
+        <w:t xml:space="preserve"> 下亚临界逆平均簇规模 </w:t>
+      </w:r>
+      <w:r>
+        <w:rPr>
+          <w:rFonts w:ascii="Cambria Math" w:cs="Cambria Math" w:eastAsia="Cambria Math" w:hAnsi="Cambria Math"/>
+          <w:color w:val="000000"/>
+          <w:sz w:val="18"/>
+          <w:szCs w:val="18"/>
+        </w:rPr>
+        <w:t xml:space="preserve">1/χ</w:t>
+      </w:r>
+      <w:r>
+        <w:rPr>
+          <w:rFonts w:ascii="SimSun" w:cs="SimSun" w:eastAsia="SimSun" w:hAnsi="SimSun"/>
+          <w:color w:val="000000"/>
+          <w:sz w:val="18"/>
+          <w:szCs w:val="18"/>
+        </w:rPr>
+        <w:t xml:space="preserve"> 随 </w:t>
+      </w:r>
+      <w:r>
+        <w:rPr>
+          <w:rFonts w:ascii="Cambria Math" w:cs="Cambria Math" w:eastAsia="Cambria Math" w:hAnsi="Cambria Math"/>
+          <w:color w:val="000000"/>
+          <w:sz w:val="18"/>
+          <w:szCs w:val="18"/>
+        </w:rPr>
+        <w:t xml:space="preserve">λ</w:t>
+      </w:r>
+      <w:r>
+        <w:rPr>
+          <w:rFonts w:ascii="SimSun" w:cs="SimSun" w:eastAsia="SimSun" w:hAnsi="SimSun"/>
+          <w:color w:val="000000"/>
+          <w:sz w:val="18"/>
+          <w:szCs w:val="18"/>
+        </w:rPr>
+        <w:t xml:space="preserve"> 线性趋零，其 </w:t>
+      </w:r>
+      <w:r>
+        <w:rPr>
+          <w:rFonts w:ascii="Cambria Math" w:cs="Cambria Math" w:eastAsia="Cambria Math" w:hAnsi="Cambria Math"/>
+          <w:color w:val="000000"/>
+          <w:sz w:val="18"/>
+          <w:szCs w:val="18"/>
+        </w:rPr>
+        <w:t xml:space="preserve">x</w:t>
+      </w:r>
+      <w:r>
+        <w:rPr>
+          <w:rFonts w:ascii="SimSun" w:cs="SimSun" w:eastAsia="SimSun" w:hAnsi="SimSun"/>
+          <w:color w:val="000000"/>
+          <w:sz w:val="18"/>
+          <w:szCs w:val="18"/>
+        </w:rPr>
+        <w:t xml:space="preserve"> 截距（空心圈）即 </w:t>
+      </w:r>
+      <w:r>
+        <w:rPr>
+          <w:rFonts w:ascii="Cambria Math" w:cs="Cambria Math" w:eastAsia="Cambria Math" w:hAnsi="Cambria Math"/>
+          <w:color w:val="000000"/>
+          <w:sz w:val="18"/>
+          <w:szCs w:val="18"/>
+        </w:rPr>
+        <w:t xml:space="preserve">λ</w:t>
+      </w:r>
+      <w:r>
+        <w:rPr>
+          <w:rFonts w:ascii="Cambria Math" w:cs="Cambria Math" w:eastAsia="Cambria Math" w:hAnsi="Cambria Math"/>
+          <w:color w:val="000000"/>
+          <w:sz w:val="18"/>
+          <w:szCs w:val="18"/>
+          <w:vertAlign w:val="subscript"/>
+        </w:rPr>
+        <w:t xml:space="preserve">c</w:t>
+      </w:r>
+      <w:r>
+        <w:rPr>
+          <w:rFonts w:ascii="SimSun" w:cs="SimSun" w:eastAsia="SimSun" w:hAnsi="SimSun"/>
+          <w:color w:val="000000"/>
+          <w:sz w:val="18"/>
+          <w:szCs w:val="18"/>
+        </w:rPr>
+        <w:t xml:space="preserve">，按 </w:t>
+      </w:r>
+      <w:r>
+        <w:rPr>
+          <w:rFonts w:ascii="Cambria Math" w:cs="Cambria Math" w:eastAsia="Cambria Math" w:hAnsi="Cambria Math"/>
+          <w:color w:val="000000"/>
+          <w:sz w:val="18"/>
+          <w:szCs w:val="18"/>
+        </w:rPr>
+        <w:t xml:space="preserve">ρ</w:t>
+      </w:r>
+      <w:r>
+        <w:rPr>
+          <w:rFonts w:ascii="Cambria Math" w:cs="Cambria Math" w:eastAsia="Cambria Math" w:hAnsi="Cambria Math"/>
+          <w:color w:val="000000"/>
+          <w:sz w:val="18"/>
+          <w:szCs w:val="18"/>
+          <w:vertAlign w:val="subscript"/>
+        </w:rPr>
+        <w:t xml:space="preserve">12</w:t>
+      </w:r>
+      <w:r>
+        <w:rPr>
+          <w:rFonts w:ascii="SimSun" w:cs="SimSun" w:eastAsia="SimSun" w:hAnsi="SimSun"/>
+          <w:color w:val="000000"/>
+          <w:sz w:val="18"/>
+          <w:szCs w:val="18"/>
+        </w:rPr>
+        <w:t xml:space="preserve"> 着色即（a）中各箱之来源。（c）机制：固定 </w:t>
+      </w:r>
+      <w:r>
+        <w:rPr>
+          <w:rFonts w:ascii="Cambria Math" w:cs="Cambria Math" w:eastAsia="Cambria Math" w:hAnsi="Cambria Math"/>
+          <w:color w:val="000000"/>
+          <w:sz w:val="18"/>
+          <w:szCs w:val="18"/>
+        </w:rPr>
+        <w:t xml:space="preserve">λ</w:t>
+      </w:r>
+      <w:r>
+        <w:rPr>
+          <w:rFonts w:ascii="SimSun" w:cs="SimSun" w:eastAsia="SimSun" w:hAnsi="SimSun"/>
+          <w:color w:val="000000"/>
+          <w:sz w:val="18"/>
+          <w:szCs w:val="18"/>
+        </w:rPr>
+        <w:t xml:space="preserve"> 时次代矩阵谱半径 </w:t>
+      </w:r>
+      <w:r>
+        <w:rPr>
+          <w:rFonts w:ascii="Cambria Math" w:cs="Cambria Math" w:eastAsia="Cambria Math" w:hAnsi="Cambria Math"/>
+          <w:color w:val="000000"/>
+          <w:sz w:val="18"/>
+          <w:szCs w:val="18"/>
+        </w:rPr>
+        <w:t xml:space="preserve">ρ(N)</w:t>
+      </w:r>
+      <w:r>
+        <w:rPr>
+          <w:rFonts w:ascii="SimSun" w:cs="SimSun" w:eastAsia="SimSun" w:hAnsi="SimSun"/>
+          <w:color w:val="000000"/>
+          <w:sz w:val="18"/>
+          <w:szCs w:val="18"/>
+        </w:rPr>
+        <w:t xml:space="preserve"> 随 </w:t>
+      </w:r>
+      <w:r>
+        <w:rPr>
+          <w:rFonts w:ascii="Cambria Math" w:cs="Cambria Math" w:eastAsia="Cambria Math" w:hAnsi="Cambria Math"/>
+          <w:color w:val="000000"/>
+          <w:sz w:val="18"/>
+          <w:szCs w:val="18"/>
+        </w:rPr>
+        <w:t xml:space="preserve">ρ</w:t>
+      </w:r>
+      <w:r>
+        <w:rPr>
+          <w:rFonts w:ascii="Cambria Math" w:cs="Cambria Math" w:eastAsia="Cambria Math" w:hAnsi="Cambria Math"/>
+          <w:color w:val="000000"/>
+          <w:sz w:val="18"/>
+          <w:szCs w:val="18"/>
+          <w:vertAlign w:val="subscript"/>
+        </w:rPr>
+        <w:t xml:space="preserve">12</w:t>
+      </w:r>
+      <w:r>
+        <w:rPr>
+          <w:rFonts w:ascii="SimSun" w:cs="SimSun" w:eastAsia="SimSun" w:hAnsi="SimSun"/>
+          <w:color w:val="000000"/>
+          <w:sz w:val="18"/>
+          <w:szCs w:val="18"/>
+        </w:rPr>
+        <w:t xml:space="preserve"> 上升，</w:t>
+      </w:r>
+      <w:r>
+        <w:rPr>
+          <w:rFonts w:ascii="Cambria Math" w:cs="Cambria Math" w:eastAsia="Cambria Math" w:hAnsi="Cambria Math"/>
+          <w:color w:val="000000"/>
+          <w:sz w:val="18"/>
+          <w:szCs w:val="18"/>
+        </w:rPr>
+        <w:t xml:space="preserve">λ=λ</w:t>
+      </w:r>
+      <w:r>
+        <w:rPr>
+          <w:rFonts w:ascii="Cambria Math" w:cs="Cambria Math" w:eastAsia="Cambria Math" w:hAnsi="Cambria Math"/>
+          <w:color w:val="000000"/>
+          <w:sz w:val="18"/>
+          <w:szCs w:val="18"/>
+          <w:vertAlign w:val="subscript"/>
+        </w:rPr>
+        <w:t xml:space="preserve">c</w:t>
+      </w:r>
+      <w:r>
+        <w:rPr>
+          <w:rFonts w:ascii="Cambria Math" w:cs="Cambria Math" w:eastAsia="Cambria Math" w:hAnsi="Cambria Math"/>
+          <w:color w:val="000000"/>
+          <w:sz w:val="18"/>
+          <w:szCs w:val="18"/>
+        </w:rPr>
+        <w:t xml:space="preserve">(0)</w:t>
+      </w:r>
+      <w:r>
+        <w:rPr>
+          <w:rFonts w:ascii="SimSun" w:cs="SimSun" w:eastAsia="SimSun" w:hAnsi="SimSun"/>
+          <w:color w:val="000000"/>
+          <w:sz w:val="18"/>
+          <w:szCs w:val="18"/>
+        </w:rPr>
+        <w:t xml:space="preserve"> 一线恰在 </w:t>
+      </w:r>
+      <w:r>
+        <w:rPr>
+          <w:rFonts w:ascii="Cambria Math" w:cs="Cambria Math" w:eastAsia="Cambria Math" w:hAnsi="Cambria Math"/>
+          <w:color w:val="000000"/>
+          <w:sz w:val="18"/>
+          <w:szCs w:val="18"/>
+        </w:rPr>
+        <w:t xml:space="preserve">ρ</w:t>
+      </w:r>
+      <w:r>
+        <w:rPr>
+          <w:rFonts w:ascii="Cambria Math" w:cs="Cambria Math" w:eastAsia="Cambria Math" w:hAnsi="Cambria Math"/>
+          <w:color w:val="000000"/>
+          <w:sz w:val="18"/>
+          <w:szCs w:val="18"/>
+          <w:vertAlign w:val="subscript"/>
+        </w:rPr>
+        <w:t xml:space="preserve">12</w:t>
+      </w:r>
+      <w:r>
+        <w:rPr>
+          <w:rFonts w:ascii="Cambria Math" w:cs="Cambria Math" w:eastAsia="Cambria Math" w:hAnsi="Cambria Math"/>
+          <w:color w:val="000000"/>
+          <w:sz w:val="18"/>
+          <w:szCs w:val="18"/>
+        </w:rPr>
+        <w:t xml:space="preserve">=0</w:t>
+      </w:r>
+      <w:r>
+        <w:rPr>
+          <w:rFonts w:ascii="SimSun" w:cs="SimSun" w:eastAsia="SimSun" w:hAnsi="SimSun"/>
+          <w:color w:val="000000"/>
+          <w:sz w:val="18"/>
+          <w:szCs w:val="18"/>
+        </w:rPr>
+        <w:t xml:space="preserve"> 越过 </w:t>
+      </w:r>
+      <w:r>
+        <w:rPr>
+          <w:rFonts w:ascii="Cambria Math" w:cs="Cambria Math" w:eastAsia="Cambria Math" w:hAnsi="Cambria Math"/>
+          <w:color w:val="000000"/>
+          <w:sz w:val="18"/>
+          <w:szCs w:val="18"/>
+        </w:rPr>
+        <w:t xml:space="preserve">ρ(N)=1</w:t>
+      </w:r>
+      <w:r>
+        <w:rPr>
+          <w:rFonts w:ascii="SimSun" w:cs="SimSun" w:eastAsia="SimSun" w:hAnsi="SimSun"/>
+          <w:color w:val="000000"/>
+          <w:sz w:val="18"/>
+          <w:szCs w:val="18"/>
+        </w:rPr>
+        <w:t xml:space="preserve">——相关参与集中跨层传播能力、压低阈值的机制。</w:t>
       </w:r>
     </w:p>
     <w:p>

</xml_diff>

<commit_message>
Manuscript prose: de-AI rewrite, meaning and numbers unchanged
Rework the Chinese body prose of both section generators for a more natural,
less template-driven voice: fuse short clauses into longer runs, swap stiff
function words (与/将/使/无需/尚/均/仍/故/因而/综上...) for plainer ones, add
particles, drop filler modifiers, and avoid the 以…为… / 在…前提下… templates.
All mathematics, equation numbers, statistics, and citations are byte-for-byte
unchanged; structure and information order are unchanged. Also fix a real error
in the Fig 2 caption, which still described the pre-recolor 黑线/蓝虚线 instead
of the current teal-solid / coral-dashed styling (now color-neutral 实线/虚线).

Co-Authored-By: Claude Opus 4.8 <noreply@anthropic.com>
Claude-Session: https://claude.ai/code/session_01GMqZS1ZXii3SRe677Qn7Mk
</commit_message>
<xml_diff>
--- a/multiplex-hypergraph-sir/combined_cn.docx
+++ b/multiplex-hypergraph-sir/combined_cn.docx
@@ -66,7 +66,7 @@
           <w:sz w:val="21"/>
           <w:szCs w:val="21"/>
         </w:rPr>
-        <w:t xml:space="preserve">本模型的三个要素示于图 1：多重超图与层度 (a)、单个群体内部的级联 (b)、以及群体层面的分支 (c)。</w:t>
+        <w:t xml:space="preserve">本模型有三个要素，都画在了图 1 里：多重超图和层度 (a)、单个群体内部的级联 (b)，还有群体层面的分支 (c)。</w:t>
       </w:r>
     </w:p>
     <w:p>
@@ -140,7 +140,7 @@
           <w:sz w:val="18"/>
           <w:szCs w:val="18"/>
         </w:rPr>
-        <w:t xml:space="preserve">　多重超图 SIR 群体闭合的机制示意。(a) 多重超图与节点的层度；(b) 单个群体内部的级联，</w:t>
+        <w:t xml:space="preserve">　多重超图 SIR 群体闭合的机制示意。(a) 多重超图和节点的层度；(b) 单个群体内部的级联，</w:t>
       </w:r>
       <w:r>
         <w:rPr>
@@ -158,7 +158,7 @@
           <w:sz w:val="18"/>
           <w:szCs w:val="18"/>
         </w:rPr>
-        <w:t xml:space="preserve"> 为递推所用的计数，其规模 </w:t>
+        <w:t xml:space="preserve"> 是递推所用的计数，它的规模 </w:t>
       </w:r>
       <w:r>
         <w:rPr>
@@ -240,7 +240,7 @@
           <w:sz w:val="18"/>
           <w:szCs w:val="18"/>
         </w:rPr>
-        <w:t xml:space="preserve"> 出列，故 </w:t>
+        <w:t xml:space="preserve"> 出列，所以 </w:t>
       </w:r>
       <w:r>
         <w:rPr>
@@ -315,7 +315,7 @@
           <w:sz w:val="18"/>
           <w:szCs w:val="18"/>
         </w:rPr>
-        <w:t xml:space="preserve">，减法仅在同层 </w:t>
+        <w:t xml:space="preserve">，这个减法只在同层 </w:t>
       </w:r>
       <w:r>
         <w:rPr>
@@ -333,7 +333,7 @@
           <w:sz w:val="18"/>
           <w:szCs w:val="18"/>
         </w:rPr>
-        <w:t xml:space="preserve"> 生效。</w:t>
+        <w:t xml:space="preserve"> 时才生效。</w:t>
       </w:r>
     </w:p>
     <w:p>
@@ -403,7 +403,7 @@
           <w:sz w:val="21"/>
           <w:szCs w:val="21"/>
         </w:rPr>
-        <w:t xml:space="preserve">，层 a 是 V 上的超图 </w:t>
+        <w:t xml:space="preserve">，每一层 a 都是 V 上的一个超图 </w:t>
       </w:r>
       <w:r>
         <w:rPr>
@@ -543,7 +543,7 @@
           <w:sz w:val="21"/>
           <w:szCs w:val="21"/>
         </w:rPr>
-        <w:t xml:space="preserve">，写成向量 </w:t>
+        <w:t xml:space="preserve">，写成向量就是 </w:t>
       </w:r>
       <w:r>
         <w:rPr>
@@ -561,7 +561,7 @@
           <w:sz w:val="21"/>
           <w:szCs w:val="21"/>
         </w:rPr>
-        <w:t xml:space="preserve">。引入两个生成函数：</w:t>
+        <w:t xml:space="preserve">。这里引入两个生成函数：</w:t>
       </w:r>
     </w:p>
     <w:p>
@@ -825,7 +825,7 @@
           <w:sz w:val="21"/>
           <w:szCs w:val="21"/>
         </w:rPr>
-        <w:t xml:space="preserve"> 描述节点侧，</w:t>
+        <w:t xml:space="preserve"> 管节点侧，</w:t>
       </w:r>
       <w:r>
         <w:rPr>
@@ -853,7 +853,7 @@
           <w:sz w:val="21"/>
           <w:szCs w:val="21"/>
         </w:rPr>
-        <w:t xml:space="preserve"> 描述沿层 a 的一个成员槽到达某节点时该节点的余度分布，指数中的 </w:t>
+        <w:t xml:space="preserve"> 管的是沿层 a 的一个成员槽到达某个节点时、这个节点的余度分布，指数里的 </w:t>
       </w:r>
       <w:r>
         <w:rPr>
@@ -881,7 +881,7 @@
           <w:sz w:val="21"/>
           <w:szCs w:val="21"/>
         </w:rPr>
-        <w:t xml:space="preserve"> 即余度相减：来路那个群体不再计入。联合层度分布 </w:t>
+        <w:t xml:space="preserve"> 就是余度相减：来路的那个群体不再算进去。联合层度分布 </w:t>
       </w:r>
       <w:r>
         <w:rPr>
@@ -899,7 +899,7 @@
           <w:sz w:val="21"/>
           <w:szCs w:val="21"/>
         </w:rPr>
-        <w:t xml:space="preserve"> 是本模型的结构输入，层间的一切效应最终只经由 </w:t>
+        <w:t xml:space="preserve"> 是本模型的结构输入，层和层之间的一切效应，最后都只通过 </w:t>
       </w:r>
       <w:r>
         <w:rPr>
@@ -917,7 +917,7 @@
           <w:sz w:val="21"/>
           <w:szCs w:val="21"/>
         </w:rPr>
-        <w:t xml:space="preserve"> 与 </w:t>
+        <w:t xml:space="preserve"> 和 </w:t>
       </w:r>
       <w:r>
         <w:rPr>
@@ -1015,7 +1015,7 @@
           <w:sz w:val="21"/>
           <w:szCs w:val="21"/>
         </w:rPr>
-        <w:t xml:space="preserve"> 跨层共享——个体在任一渠道被感染即在所有渠道中均为感染态。记层 a 的群体 e 中已感染成员数为 </w:t>
+        <w:t xml:space="preserve"> 是跨层共享的——一个个体只要在任一条渠道里被感染，它在所有渠道里就都算感染态。记层 a 的群体 e 里已经感染的成员数为 </w:t>
       </w:r>
       <w:r>
         <w:rPr>
@@ -1099,7 +1099,7 @@
           <w:sz w:val="21"/>
           <w:szCs w:val="21"/>
         </w:rPr>
-        <w:t xml:space="preserve"> 时群体激活，向 e 中每个易感成员各以速率 </w:t>
+        <w:t xml:space="preserve"> 时群体激活，向 e 里每个易感成员各以速率 </w:t>
       </w:r>
       <w:r>
         <w:rPr>
@@ -1127,7 +1127,7 @@
           <w:sz w:val="21"/>
           <w:szCs w:val="21"/>
         </w:rPr>
-        <w:t xml:space="preserve"> 独立传递，否则静默；感染者以速率 </w:t>
+        <w:t xml:space="preserve"> 独立传递，否则就静默着；感染者以速率 </w:t>
       </w:r>
       <w:r>
         <w:rPr>
@@ -1145,7 +1145,7 @@
           <w:sz w:val="21"/>
           <w:szCs w:val="21"/>
         </w:rPr>
-        <w:t xml:space="preserve"> 康复。易感节点 u 的总风险率</w:t>
+        <w:t xml:space="preserve"> 康复。易感节点 u 的总风险率是</w:t>
       </w:r>
     </w:p>
     <w:p>
@@ -1308,7 +1308,7 @@
           <w:sz w:val="21"/>
           <w:szCs w:val="21"/>
         </w:rPr>
-        <w:t xml:space="preserve">以 </w:t>
+        <w:t xml:space="preserve">把时间以 </w:t>
       </w:r>
       <w:r>
         <w:rPr>
@@ -1326,7 +1326,7 @@
           <w:sz w:val="21"/>
           <w:szCs w:val="21"/>
         </w:rPr>
-        <w:t xml:space="preserve"> 归一时间，</w:t>
+        <w:t xml:space="preserve"> 归一，</w:t>
       </w:r>
       <w:r>
         <w:rPr>
@@ -1419,7 +1419,7 @@
           <w:sz w:val="21"/>
           <w:szCs w:val="21"/>
         </w:rPr>
-        <w:t xml:space="preserve">。初始时刻每个节点独立地以概率 </w:t>
+        <w:t xml:space="preserve">。初始时刻，每个节点各自独立地以概率 </w:t>
       </w:r>
       <w:r>
         <w:rPr>
@@ -1437,7 +1437,7 @@
           <w:sz w:val="21"/>
           <w:szCs w:val="21"/>
         </w:rPr>
-        <w:t xml:space="preserve"> 处于感染态、其余易感，</w:t>
+        <w:t xml:space="preserve"> 处在感染态、其余易感，</w:t>
       </w:r>
       <w:r>
         <w:rPr>
@@ -1455,7 +1455,7 @@
           <w:sz w:val="21"/>
           <w:szCs w:val="21"/>
         </w:rPr>
-        <w:t xml:space="preserve"> 即均匀初始感染比例。与有向超图不同，无向群体中每个成员既是传染源也是传染靶：一个成员被感染后群体激活，可感染同群其他成员，后者被感染又延长群体的激活时长，形成群内级联。本模型的新内容均源于此。</w:t>
+        <w:t xml:space="preserve"> 就是均匀的初始感染比例。和有向超图不一样，无向群体里每个成员既是传染源、也是传染靶：一个成员被感染后群体就激活了，它能去感染同群的其他成员，后者被感染又把群体的激活时长拖长，这样就形成了群内级联。本模型里新的内容，都是从这一点来的。</w:t>
       </w:r>
     </w:p>
     <w:p>
@@ -1488,7 +1488,7 @@
           <w:sz w:val="21"/>
           <w:szCs w:val="21"/>
         </w:rPr>
-        <w:t xml:space="preserve">固定一个检验节点 u，令其永久易感（空腔节点）。取一个 u 所属的层 a 群体 e，定义边基变量</w:t>
+        <w:t xml:space="preserve">固定一个检验节点 u，让它永久保持易感（也就是空腔节点）。取一个 u 所属的层 a 群体 e，定义边基变量</w:t>
       </w:r>
     </w:p>
     <w:p>
@@ -1555,7 +1555,7 @@
           <w:sz w:val="21"/>
           <w:szCs w:val="21"/>
         </w:rPr>
-        <w:t xml:space="preserve"> 时刻尚未向 </w:t>
+        <w:t xml:space="preserve"> 时刻还没向 </w:t>
       </w:r>
       <w:r>
         <w:rPr>
@@ -1610,7 +1610,7 @@
           <w:sz w:val="21"/>
           <w:szCs w:val="21"/>
         </w:rPr>
-        <w:t xml:space="preserve">在局域树状假设下（位形模型系综 </w:t>
+        <w:t xml:space="preserve">在局域树状假设下（位形模型系综在 </w:t>
       </w:r>
       <w:r>
         <w:rPr>
@@ -1628,7 +1628,7 @@
           <w:sz w:val="21"/>
           <w:szCs w:val="21"/>
         </w:rPr>
-        <w:t xml:space="preserve"> 时局域收敛于超树，回路概率 </w:t>
+        <w:t xml:space="preserve"> 时局域收敛到超树，回路概率是 </w:t>
       </w:r>
       <w:r>
         <w:rPr>
@@ -1646,7 +1646,7 @@
           <w:sz w:val="21"/>
           <w:szCs w:val="21"/>
         </w:rPr>
-        <w:t xml:space="preserve">），u 所属各群体的上游分支互不相交，节点侧因而闭合为</w:t>
+        <w:t xml:space="preserve">），u 所属的各个群体、它们的上游分支互不相交，节点侧于是就闭合成了</w:t>
       </w:r>
     </w:p>
     <w:p>
@@ -1733,7 +1733,7 @@
           <w:sz w:val="21"/>
           <w:szCs w:val="21"/>
         </w:rPr>
-        <w:t xml:space="preserve">以 e 除 u 外的 </w:t>
+        <w:t xml:space="preserve">拿 e 里除 u 之外那 </w:t>
       </w:r>
       <w:r>
         <w:rPr>
@@ -1825,7 +1825,7 @@
           <w:sz w:val="21"/>
           <w:szCs w:val="21"/>
         </w:rPr>
-        <w:t xml:space="preserve">）为仓室，定义未传递子概率 </w:t>
+        <w:t xml:space="preserve">）当仓室，定义未传递子概率 </w:t>
       </w:r>
       <w:r>
         <w:rPr>
@@ -1872,7 +1872,7 @@
           <w:sz w:val="21"/>
           <w:szCs w:val="21"/>
         </w:rPr>
-        <w:t xml:space="preserve">，则 </w:t>
+        <w:t xml:space="preserve">，那么 </w:t>
       </w:r>
       <w:r>
         <w:rPr>
@@ -1929,7 +1929,7 @@
           <w:sz w:val="21"/>
           <w:szCs w:val="21"/>
         </w:rPr>
-        <w:t xml:space="preserve">，激活且未传递的部分为</w:t>
+        <w:t xml:space="preserve">，其中激活了、却还没传递出去的那部分是</w:t>
       </w:r>
     </w:p>
     <w:p>
@@ -2055,7 +2055,7 @@
           <w:sz w:val="21"/>
           <w:szCs w:val="21"/>
         </w:rPr>
-        <w:t xml:space="preserve">一个成员经由其他群体到 t 仍易感的概率为 </w:t>
+        <w:t xml:space="preserve">一个成员通过别的群体、到 t 时刻还保持易感的概率是 </w:t>
       </w:r>
       <w:r>
         <w:rPr>
@@ -2092,7 +2092,7 @@
           <w:sz w:val="21"/>
           <w:szCs w:val="21"/>
         </w:rPr>
-        <w:t xml:space="preserve">，故其外部风险率</w:t>
+        <w:t xml:space="preserve">，所以它的外部风险率是</w:t>
       </w:r>
     </w:p>
     <w:p>
@@ -2303,7 +2303,7 @@
           <w:sz w:val="21"/>
           <w:szCs w:val="21"/>
         </w:rPr>
-        <w:t xml:space="preserve">一个易感成员的总感染率是外部与群内之和 </w:t>
+        <w:t xml:space="preserve">一个易感成员的总感染率，是外部和群内两块之和 </w:t>
       </w:r>
       <w:r>
         <w:rPr>
@@ -2378,7 +2378,7 @@
           <w:sz w:val="21"/>
           <w:szCs w:val="21"/>
         </w:rPr>
-        <w:t xml:space="preserve">；群体向 u 的传递以速率 </w:t>
+        <w:t xml:space="preserve">；而群体向 u 的传递，以速率 </w:t>
       </w:r>
       <w:r>
         <w:rPr>
@@ -2434,7 +2434,7 @@
           <w:sz w:val="21"/>
           <w:szCs w:val="21"/>
         </w:rPr>
-        <w:t xml:space="preserve"> 把概率移出「未传递」类。据此</w:t>
+        <w:t xml:space="preserve"> 把概率移出「未传递」这一类。据此可以写出</w:t>
       </w:r>
     </w:p>
     <w:p>
@@ -2811,7 +2811,7 @@
           <w:sz w:val="21"/>
           <w:szCs w:val="21"/>
         </w:rPr>
-        <w:t xml:space="preserve">（越界下标记为零。）对 (1.8) 求和，</w:t>
+        <w:t xml:space="preserve">（越界的下标都记为零。）把 (1.8) 逐项求和，</w:t>
       </w:r>
       <w:r>
         <w:rPr>
@@ -2839,7 +2839,7 @@
           <w:sz w:val="21"/>
           <w:szCs w:val="21"/>
         </w:rPr>
-        <w:t xml:space="preserve"> 项、群内项与 </w:t>
+        <w:t xml:space="preserve"> 项、群内项和 </w:t>
       </w:r>
       <w:r>
         <w:rPr>
@@ -2857,7 +2857,7 @@
           <w:sz w:val="21"/>
           <w:szCs w:val="21"/>
         </w:rPr>
-        <w:t xml:space="preserve"> 项各自守恒相消，只余</w:t>
+        <w:t xml:space="preserve"> 项各自守恒、两两相消，最后只剩下</w:t>
       </w:r>
     </w:p>
     <w:p>
@@ -2964,7 +2964,7 @@
           <w:sz w:val="21"/>
           <w:szCs w:val="21"/>
         </w:rPr>
-        <w:t xml:space="preserve">与 (1.7) 自洽。初始条件 </w:t>
+        <w:t xml:space="preserve">这和 (1.7) 自洽。初始条件 </w:t>
       </w:r>
       <w:r>
         <w:rPr>
@@ -3059,7 +3059,7 @@
           <w:sz w:val="21"/>
           <w:szCs w:val="21"/>
         </w:rPr>
-        <w:t xml:space="preserve">，其余为零，</w:t>
+        <w:t xml:space="preserve">，其余都是零，</w:t>
       </w:r>
       <w:r>
         <w:rPr>
@@ -3096,7 +3096,7 @@
           <w:sz w:val="21"/>
           <w:szCs w:val="21"/>
         </w:rPr>
-        <w:t xml:space="preserve">。闭合方程组只含各层的群体计数，共 </w:t>
+        <w:t xml:space="preserve">。闭合方程组只含各层的群体计数，一共 </w:t>
       </w:r>
       <w:r>
         <w:rPr>
@@ -3152,7 +3152,7 @@
           <w:sz w:val="21"/>
           <w:szCs w:val="21"/>
         </w:rPr>
-        <w:t xml:space="preserve"> 维，与系统规模 N 无关，</w:t>
+        <w:t xml:space="preserve"> 维，和系统规模 N 无关，</w:t>
       </w:r>
       <w:r>
         <w:rPr>
@@ -3188,7 +3188,7 @@
           <w:sz w:val="21"/>
           <w:szCs w:val="21"/>
         </w:rPr>
-        <w:t xml:space="preserve"> 时为 16 个；节点侧的 S 由 (1.5) 代数给出，终态规模 </w:t>
+        <w:t xml:space="preserve"> 时就是 16 个；节点侧的 S 由 (1.5) 代数地给出，终态规模 </w:t>
       </w:r>
       <w:r>
         <w:rPr>
@@ -3206,7 +3206,7 @@
           <w:sz w:val="21"/>
           <w:szCs w:val="21"/>
         </w:rPr>
-        <w:t xml:space="preserve"> 直接读出，二者均不增维。欲绘出完整时间演化中的 </w:t>
+        <w:t xml:space="preserve"> 直接读出来就行，这两样都不增加维数。要是想把完整时间演化里的 </w:t>
       </w:r>
       <w:r>
         <w:rPr>
@@ -3224,7 +3224,7 @@
           <w:sz w:val="21"/>
           <w:szCs w:val="21"/>
         </w:rPr>
-        <w:t xml:space="preserve"> 与 </w:t>
+        <w:t xml:space="preserve"> 和 </w:t>
       </w:r>
       <w:r>
         <w:rPr>
@@ -3242,7 +3242,7 @@
           <w:sz w:val="21"/>
           <w:szCs w:val="21"/>
         </w:rPr>
-        <w:t xml:space="preserve">（图 2），再附一个求积 </w:t>
+        <w:t xml:space="preserve"> 也画出来（图 2），只要再加一个求积 </w:t>
       </w:r>
       <w:r>
         <w:rPr>
@@ -3278,7 +3278,7 @@
           <w:sz w:val="21"/>
           <w:szCs w:val="21"/>
         </w:rPr>
-        <w:t xml:space="preserve">）分离即可，它不改变闭合本身的维数。</w:t>
+        <w:t xml:space="preserve">）把它们分开就够了，这一步并不改变闭合本身的维数。</w:t>
       </w:r>
     </w:p>
     <w:p>
@@ -3311,7 +3311,7 @@
           <w:sz w:val="21"/>
           <w:szCs w:val="21"/>
         </w:rPr>
-        <w:t xml:space="preserve">以「感染经由哪一层传来」为型，经由层 a 感染的节点其层 b 群体数的期望为 </w:t>
+        <w:t xml:space="preserve">把「感染是经由哪一层传来的」当作型，那么经由层 a 感染的节点、它的层 b 群体数的期望就是 </w:t>
       </w:r>
       <w:r>
         <w:rPr>
@@ -3396,7 +3396,7 @@
           <w:sz w:val="21"/>
           <w:szCs w:val="21"/>
         </w:rPr>
-        <w:t xml:space="preserve">，每个被点燃的群体产出 </w:t>
+        <w:t xml:space="preserve">，而每个被点燃的群体又产出 </w:t>
       </w:r>
       <w:r>
         <w:rPr>
@@ -3471,7 +3471,7 @@
           <w:sz w:val="21"/>
           <w:szCs w:val="21"/>
         </w:rPr>
-        <w:t xml:space="preserve"> 个新感染成员（C 为孤立群体内的群内级联期望，由一个小型连续时间 Markov 链的递推给出，</w:t>
+        <w:t xml:space="preserve"> 个新的感染成员（C 是孤立群体内部群内级联的期望，由一个小型连续时间 Markov 链的递推算出来，</w:t>
       </w:r>
       <w:r>
         <w:rPr>
@@ -3489,7 +3489,7 @@
           <w:sz w:val="21"/>
           <w:szCs w:val="21"/>
         </w:rPr>
-        <w:t xml:space="preserve"> 时退化为成对传递概率）。故多型分支矩阵</w:t>
+        <w:t xml:space="preserve"> 时就退化成了成对传递概率）。所以，多型分支矩阵是</w:t>
       </w:r>
     </w:p>
     <w:p>
@@ -3708,7 +3708,7 @@
           <w:sz w:val="21"/>
           <w:szCs w:val="21"/>
         </w:rPr>
-        <w:t xml:space="preserve"> 确定。图 2 的控制参数 </w:t>
+        <w:t xml:space="preserve"> 定出来。图 2 里的控制参数 </w:t>
       </w:r>
       <w:r>
         <w:rPr>
@@ -3726,7 +3726,7 @@
           <w:sz w:val="21"/>
           <w:szCs w:val="21"/>
         </w:rPr>
-        <w:t xml:space="preserve"> 即以此阈值 </w:t>
+        <w:t xml:space="preserve">，就是拿这个阈值 </w:t>
       </w:r>
       <w:r>
         <w:rPr>
@@ -3754,7 +3754,7 @@
           <w:sz w:val="21"/>
           <w:szCs w:val="21"/>
         </w:rPr>
-        <w:t xml:space="preserve"> 定标。</w:t>
+        <w:t xml:space="preserve"> 来定标的。</w:t>
       </w:r>
     </w:p>
     <w:p>
@@ -3787,7 +3787,7 @@
           <w:sz w:val="21"/>
           <w:szCs w:val="21"/>
         </w:rPr>
-        <w:t xml:space="preserve">闭合方程组不仅给出阈值，也复现整个传播过程。图 2 给出 </w:t>
+        <w:t xml:space="preserve">闭合方程组不光给出阈值，也能把整个传播过程复现出来。图 2 画的是 </w:t>
       </w:r>
       <w:r>
         <w:rPr>
@@ -3905,7 +3905,7 @@
           <w:sz w:val="21"/>
           <w:szCs w:val="21"/>
         </w:rPr>
-        <w:t xml:space="preserve"> 与 </w:t>
+        <w:t xml:space="preserve"> 和 </w:t>
       </w:r>
       <w:r>
         <w:rPr>
@@ -3978,7 +3978,7 @@
           <w:sz w:val="21"/>
           <w:szCs w:val="21"/>
         </w:rPr>
-        <w:t xml:space="preserve">。群体闭合 (1.8) 与精确仿真在 </w:t>
+        <w:t xml:space="preserve">。群体闭合 (1.8) 和精确仿真在 </w:t>
       </w:r>
       <w:r>
         <w:rPr>
@@ -3996,7 +3996,7 @@
           <w:sz w:val="21"/>
           <w:szCs w:val="21"/>
         </w:rPr>
-        <w:t xml:space="preserve"> 与 </w:t>
+        <w:t xml:space="preserve">、</w:t>
       </w:r>
       <w:r>
         <w:rPr>
@@ -4014,7 +4014,7 @@
           <w:sz w:val="21"/>
           <w:szCs w:val="21"/>
         </w:rPr>
-        <w:t xml:space="preserve"> 上的最大偏差分别为 0.0019 与 0.0006，均小于图中线宽；感染峰高相差约 0.3%，峰位 </w:t>
+        <w:t xml:space="preserve"> 上的最大偏差分别是 0.0019 和 0.0006，都比图里的线宽还小；感染峰高相差大约 0.3%，峰位在 </w:t>
       </w:r>
       <w:r>
         <w:rPr>
@@ -4032,7 +4032,7 @@
           <w:sz w:val="21"/>
           <w:szCs w:val="21"/>
         </w:rPr>
-        <w:t xml:space="preserve">。群体闭合复现了完整的含时演化。</w:t>
+        <w:t xml:space="preserve">。可以说，闭合把完整的含时演化都复现了下来。</w:t>
       </w:r>
     </w:p>
     <w:p>
@@ -4206,7 +4206,7 @@
           <w:sz w:val="18"/>
           <w:szCs w:val="18"/>
         </w:rPr>
-        <w:t xml:space="preserve">。黑线为 400 次独立 Gillespie 实现的均值，灰带为 95% 置信区间，最宽处约与线宽相当；蓝虚线为群体闭合 (1.8)。(a) 易感比例 </w:t>
+        <w:t xml:space="preserve">。实线为 400 次独立 Gillespie 实现的均值，灰带为 95% 置信区间，最宽处大约和线宽相当；虚线为群体闭合 (1.8)。(a) 易感比例 </w:t>
       </w:r>
       <w:r>
         <w:rPr>
@@ -4275,7 +4275,7 @@
           <w:sz w:val="21"/>
           <w:szCs w:val="21"/>
         </w:rPr>
-        <w:t xml:space="preserve">仿真为 (1.3) 所定义连续时间 Markov 过程的精确 Gillespie 抽样，取 </w:t>
+        <w:t xml:space="preserve">仿真用的是 (1.3) 所定义的那个连续时间 Markov 过程的精确 Gillespie 抽样，取 </w:t>
       </w:r>
       <w:r>
         <w:rPr>
@@ -4320,7 +4320,7 @@
           <w:sz w:val="21"/>
           <w:szCs w:val="21"/>
         </w:rPr>
-        <w:t xml:space="preserve">方程组自带两条无需仿真的自检。其一为求和规则：对 (1.8) 逐态求和应严格给出 (1.9)，残差处于机器精度（</w:t>
+        <w:t xml:space="preserve">方程组自带两条不需要仿真的自检。其一是求和规则：对 (1.8) 逐态求和，应当严格给出 (1.9)，残差落在机器精度（</w:t>
       </w:r>
       <w:r>
         <w:rPr>
@@ -4348,7 +4348,7 @@
           <w:sz w:val="21"/>
           <w:szCs w:val="21"/>
         </w:rPr>
-        <w:t xml:space="preserve"> 量级），说明它是方程组的代数恒等式。其二为全体成员易感的恒等式 </w:t>
+        <w:t xml:space="preserve"> 量级），这说明它就是方程组的一条代数恒等式。其二是全体成员易感时的恒等式 </w:t>
       </w:r>
       <w:r>
         <w:rPr>
@@ -4424,7 +4424,7 @@
           <w:sz w:val="21"/>
           <w:szCs w:val="21"/>
         </w:rPr>
-        <w:t xml:space="preserve">，其残差随积分步长按 </w:t>
+        <w:t xml:space="preserve">，它的残差随积分步长按 </w:t>
       </w:r>
       <w:r>
         <w:rPr>
@@ -4452,7 +4452,7 @@
           <w:sz w:val="21"/>
           <w:szCs w:val="21"/>
         </w:rPr>
-        <w:t xml:space="preserve"> 收敛（dt 由 0.02 逐次减半时残差为 </w:t>
+        <w:t xml:space="preserve"> 收敛（dt 从 0.02 逐次减半，残差依次是 </w:t>
       </w:r>
       <w:r>
         <w:rPr>
@@ -4564,7 +4564,7 @@
           <w:sz w:val="21"/>
           <w:szCs w:val="21"/>
         </w:rPr>
-        <w:t xml:space="preserve">，相邻比约 16），与四阶 Runge–Kutta 的阶一致，说明该恒等式是方程组的严格推论、残差纯属积分误差。</w:t>
+        <w:t xml:space="preserve">，相邻比大约是 16），和四阶 Runge–Kutta 的阶一致，这说明该恒等式是方程组的严格推论、残差纯粹是积分误差。</w:t>
       </w:r>
     </w:p>
     <w:p>
@@ -4591,7 +4591,7 @@
           <w:sz w:val="21"/>
           <w:szCs w:val="21"/>
         </w:rPr>
-        <w:t xml:space="preserve">阈值公式 (1.10) 与方程组自身在无病定态的线性失稳独立比对：将 (1.8) 作数值 Jacobian、对最大实部特征值二分求阈值，与 </w:t>
+        <w:t xml:space="preserve">阈值公式 (1.10) 还能和方程组自己在无病定态处的线性失稳做一次独立比对：把 (1.8) 取数值 Jacobian、对最大实部特征值二分求阈值，它和 </w:t>
       </w:r>
       <w:r>
         <w:rPr>
@@ -4609,7 +4609,7 @@
           <w:sz w:val="21"/>
           <w:szCs w:val="21"/>
         </w:rPr>
-        <w:t xml:space="preserve"> 在六组构型（含反相关度分布、非对称速率与群体规模、三层、以及成对退化情形 </w:t>
+        <w:t xml:space="preserve"> 在六组构型（含反相关度分布、非对称速率和群体规模、三层，还有成对退化情形 </w:t>
       </w:r>
       <w:r>
         <w:rPr>
@@ -4646,7 +4646,7 @@
           <w:sz w:val="21"/>
           <w:szCs w:val="21"/>
         </w:rPr>
-        <w:t xml:space="preserve">）上的相对差均在 </w:t>
+        <w:t xml:space="preserve">）上的相对差都在 </w:t>
       </w:r>
       <w:r>
         <w:rPr>
@@ -4674,7 +4674,7 @@
           <w:sz w:val="21"/>
           <w:szCs w:val="21"/>
         </w:rPr>
-        <w:t xml:space="preserve"> 量级，受数值失稳判据的分辨率所限（Jacobian 取中心差分）。两条路径不共享代码；若以 </w:t>
+        <w:t xml:space="preserve"> 量级，这已经受限于数值失稳判据本身的分辨率了（Jacobian 用的是中心差分）。这两条路径并不共享代码；要是把群内级联 C 换成 </w:t>
       </w:r>
       <w:r>
         <w:rPr>
@@ -4692,7 +4692,7 @@
           <w:sz w:val="21"/>
           <w:szCs w:val="21"/>
         </w:rPr>
-        <w:t xml:space="preserve"> 取代群内级联 C，该一致性立即消失。</w:t>
+        <w:t xml:space="preserve">，这个一致性立刻就没了。</w:t>
       </w:r>
     </w:p>
     <w:p>
@@ -4719,7 +4719,7 @@
           <w:sz w:val="21"/>
           <w:szCs w:val="21"/>
         </w:rPr>
-        <w:t xml:space="preserve">如图 2 所示，群体闭合与精确仿真在整个时间演化上逐点吻合，</w:t>
+        <w:t xml:space="preserve">像图 2 那样，群体闭合和精确仿真在整个时间演化上逐点吻合，</w:t>
       </w:r>
       <w:r>
         <w:rPr>
@@ -4737,7 +4737,7 @@
           <w:sz w:val="21"/>
           <w:szCs w:val="21"/>
         </w:rPr>
-        <w:t xml:space="preserve"> 与 </w:t>
+        <w:t xml:space="preserve">、</w:t>
       </w:r>
       <w:r>
         <w:rPr>
@@ -4755,7 +4755,7 @@
           <w:sz w:val="21"/>
           <w:szCs w:val="21"/>
         </w:rPr>
-        <w:t xml:space="preserve"> 的最大偏差均小于线宽（0.0019 与 0.0006），感染峰高相差约 0.3%、峰位均在 </w:t>
+        <w:t xml:space="preserve"> 的最大偏差都比线宽还小（0.0019 和 0.0006），感染峰高相差大约 0.3%、峰位都落在 </w:t>
       </w:r>
       <w:r>
         <w:rPr>
@@ -4773,7 +4773,7 @@
           <w:sz w:val="21"/>
           <w:szCs w:val="21"/>
         </w:rPr>
-        <w:t xml:space="preserve">。仿真为 </w:t>
+        <w:t xml:space="preserve">。仿真取 </w:t>
       </w:r>
       <w:r>
         <w:rPr>
@@ -4791,7 +4791,7 @@
           <w:sz w:val="21"/>
           <w:szCs w:val="21"/>
         </w:rPr>
-        <w:t xml:space="preserve">、400 次独立实现（脚本 figure2_evolution.py，含 Fenwick 树加速的精确 Gillespie）。残余偏差随系统规模增大而单调趋零，是可由增大系统消除的有限尺寸效应，而非闭合层级的系统偏差。</w:t>
+        <w:t xml:space="preserve">、跑了 400 次独立实现（脚本 figure2_evolution.py，里面是带 Fenwick 树加速的精确 Gillespie）。剩下的那点偏差会随系统规模变大而单调趋零，是把系统放大就能抹掉的有限尺寸效应，而不是闭合层级上的系统偏差。</w:t>
       </w:r>
     </w:p>
     <w:p>
@@ -4818,7 +4818,7 @@
           <w:sz w:val="21"/>
           <w:szCs w:val="21"/>
         </w:rPr>
-        <w:t xml:space="preserve">上述结果均由与原推导不共享路径的方式复核：</w:t>
+        <w:t xml:space="preserve">上面这些结果，都是用和原推导不共享路径的办法复核过的：</w:t>
       </w:r>
       <w:r>
         <w:rPr>
@@ -4836,7 +4836,7 @@
           <w:sz w:val="21"/>
           <w:szCs w:val="21"/>
         </w:rPr>
-        <w:t xml:space="preserve">（成对）退化情形下方程组可解析积出终态不动点，与 RK4 积分的 </w:t>
+        <w:t xml:space="preserve">（成对）这个退化情形下，方程组可以解析地积出终态不动点，它和 RK4 积分给出的 </w:t>
       </w:r>
       <w:r>
         <w:rPr>
@@ -4854,7 +4854,7 @@
           <w:sz w:val="21"/>
           <w:szCs w:val="21"/>
         </w:rPr>
-        <w:t xml:space="preserve"> 相差 </w:t>
+        <w:t xml:space="preserve"> 只差 </w:t>
       </w:r>
       <w:r>
         <w:rPr>
@@ -4882,7 +4882,7 @@
           <w:sz w:val="21"/>
           <w:szCs w:val="21"/>
         </w:rPr>
-        <w:t xml:space="preserve">；群内级联 C 由孤立群体的直接蒙特卡洛复核，全部十五组参数（</w:t>
+        <w:t xml:space="preserve">；群内级联 C 由孤立群体的直接蒙特卡洛来复核，十五组参数（</w:t>
       </w:r>
       <w:r>
         <w:rPr>
@@ -4900,7 +4900,7 @@
           <w:sz w:val="21"/>
           <w:szCs w:val="21"/>
         </w:rPr>
-        <w:t xml:space="preserve"> 与 </w:t>
+        <w:t xml:space="preserve"> 配 </w:t>
       </w:r>
       <w:r>
         <w:rPr>
@@ -4918,7 +4918,7 @@
           <w:sz w:val="21"/>
           <w:szCs w:val="21"/>
         </w:rPr>
-        <w:t xml:space="preserve">）的标准化偏差均不超过 </w:t>
+        <w:t xml:space="preserve">）的标准化偏差都不超过 </w:t>
       </w:r>
       <w:r>
         <w:rPr>
@@ -4936,7 +4936,7 @@
           <w:sz w:val="21"/>
           <w:szCs w:val="21"/>
         </w:rPr>
-        <w:t xml:space="preserve">、与无系统偏差相容；阈值本身亦由亚临界终态外推独立测得，与 (1.10) 的解析值相容。</w:t>
+        <w:t xml:space="preserve">，和「没有系统偏差」相容；阈值本身也由亚临界终态外推独立测了一遍，同样和 (1.10) 的解析值相容。</w:t>
       </w:r>
     </w:p>
     <w:p>
@@ -5022,7 +5022,7 @@
           <w:sz w:val="21"/>
           <w:szCs w:val="21"/>
         </w:rPr>
-        <w:t xml:space="preserve">，层 a 是 V 上的超图，主线取同质基数 </w:t>
+        <w:t xml:space="preserve">，每一层 a 都是 V 上的一个超图，主线取同质基数 </w:t>
       </w:r>
       <w:r>
         <w:rPr>
@@ -5050,7 +5050,7 @@
           <w:sz w:val="21"/>
           <w:szCs w:val="21"/>
         </w:rPr>
-        <w:t xml:space="preserve">。节点的参与由层度向量 </w:t>
+        <w:t xml:space="preserve">。节点的参与用层度向量 </w:t>
       </w:r>
       <w:r>
         <w:rPr>
@@ -5106,7 +5106,7 @@
           <w:sz w:val="21"/>
           <w:szCs w:val="21"/>
         </w:rPr>
-        <w:t xml:space="preserve"> 编码，</w:t>
+        <w:t xml:space="preserve"> 来编码，</w:t>
       </w:r>
       <w:r>
         <w:rPr>
@@ -5134,7 +5134,7 @@
           <w:sz w:val="21"/>
           <w:szCs w:val="21"/>
         </w:rPr>
-        <w:t xml:space="preserve"> 为该节点所属的层 a 群体数，其联合分布 </w:t>
+        <w:t xml:space="preserve"> 就是这个节点所属的层 a 群体数，它们的联合分布 </w:t>
       </w:r>
       <w:r>
         <w:rPr>
@@ -5152,7 +5152,7 @@
           <w:sz w:val="21"/>
           <w:szCs w:val="21"/>
         </w:rPr>
-        <w:t xml:space="preserve"> 是本节唯一的结构输入。一个群体在其感染成员数达到 </w:t>
+        <w:t xml:space="preserve"> 是本节唯一的结构输入。一个群体，等它的感染成员数达到 </w:t>
       </w:r>
       <w:r>
         <w:rPr>
@@ -5180,7 +5180,7 @@
           <w:sz w:val="21"/>
           <w:szCs w:val="21"/>
         </w:rPr>
-        <w:t xml:space="preserve"> 时激活，随即以速率 </w:t>
+        <w:t xml:space="preserve"> 就激活，随即以速率 </w:t>
       </w:r>
       <w:r>
         <w:rPr>
@@ -5236,7 +5236,7 @@
           <w:sz w:val="21"/>
           <w:szCs w:val="21"/>
         </w:rPr>
-        <w:t xml:space="preserve"> 向其中每个易感成员独立传递；感染者以速率 μ 康复。以 μ 归一时间后，</w:t>
+        <w:t xml:space="preserve"> 向其中每个易感成员独立传递；感染者以速率 μ 康复。把时间以 μ 归一之后，</w:t>
       </w:r>
       <w:r>
         <w:rPr>
@@ -5254,7 +5254,7 @@
           <w:sz w:val="21"/>
           <w:szCs w:val="21"/>
         </w:rPr>
-        <w:t xml:space="preserve"> 是唯一的标量控制参数（</w:t>
+        <w:t xml:space="preserve"> 就是唯一的标量控制参数（</w:t>
       </w:r>
       <w:r>
         <w:rPr>
@@ -5282,7 +5282,7 @@
           <w:sz w:val="21"/>
           <w:szCs w:val="21"/>
         </w:rPr>
-        <w:t xml:space="preserve"> 为固定的渠道权重）。</w:t>
+        <w:t xml:space="preserve"> 是固定的渠道权重）。</w:t>
       </w:r>
     </w:p>
     <w:p>
@@ -5298,7 +5298,7 @@
           <w:sz w:val="21"/>
           <w:szCs w:val="21"/>
         </w:rPr>
-        <w:t xml:space="preserve">固定一个检验节点 u 并人为令其永久保持易感（空腔节点），取 u 所属的一个层 a 群体 e，定义边基变量</w:t>
+        <w:t xml:space="preserve">固定一个检验节点 u，人为地让它永久保持易感（也就是空腔节点），取 u 所属的一个层 a 群体 e，定义边基变量</w:t>
       </w:r>
     </w:p>
     <w:p>
@@ -5366,7 +5366,7 @@
           <w:sz w:val="21"/>
           <w:szCs w:val="21"/>
         </w:rPr>
-        <w:t xml:space="preserve">无向群体与有向超图的分界在此显现。有向情形下尾集与头集不相交，头成员被感染并不延长激活，故</w:t>
+        <w:t xml:space="preserve">无向群体和有向超图的分界，就在这里显出来。有向情形下，尾集和头集不相交，头成员被感染并不会延长激活，所以</w:t>
       </w:r>
       <w:r>
         <w:rPr>
@@ -5386,7 +5386,7 @@
           <w:sz w:val="21"/>
           <w:szCs w:val="21"/>
         </w:rPr>
-        <w:t xml:space="preserve">是一条可用的假设；无向群体中每个成员既是传染源也是传染靶，一个成员被感染后群体随即激活，它可以感染同群其他成员，而后者被感染又延长群体的激活时长，从而进一步提高剩余成员被感染的概率。这一</w:t>
+        <w:t xml:space="preserve">是一条能用的假设；可无向群体里，每个成员既是传染源也是传染靶，一个成员被感染后群体马上就激活，它能去感染同群的其他成员，而后者被感染又把群体的激活时长拖长，剩余成员被感染的概率也就跟着抬高了。这样的</w:t>
       </w:r>
       <w:r>
         <w:rPr>
@@ -5406,7 +5406,7 @@
           <w:sz w:val="21"/>
           <w:szCs w:val="21"/>
         </w:rPr>
-        <w:t xml:space="preserve">使逐成员的乘积闭合失效。可行的做法不是忽略群内耦合，而是把它完整吸收进状态：以 e 中除 u 外 </w:t>
+        <w:t xml:space="preserve">，让逐成员的乘积闭合失了效。能走通的做法不是把群内耦合忽略掉，而是把它整个吸收进状态里：拿 e 里除 u 之外 </w:t>
       </w:r>
       <w:r>
         <w:rPr>
@@ -5498,7 +5498,7 @@
           <w:sz w:val="21"/>
           <w:szCs w:val="21"/>
         </w:rPr>
-        <w:t xml:space="preserve">）为房室，定义未传递子概率</w:t>
+        <w:t xml:space="preserve">）当房室，定义未传递子概率</w:t>
       </w:r>
     </w:p>
     <w:p>
@@ -5633,7 +5633,7 @@
           <w:sz w:val="21"/>
           <w:szCs w:val="21"/>
         </w:rPr>
-        <w:t xml:space="preserve">，而激活且尚未传递的部分为 </w:t>
+        <w:t xml:space="preserve">，而激活了、却还没传递出去的那部分是 </w:t>
       </w:r>
       <w:r>
         <w:rPr>
@@ -5719,7 +5719,7 @@
           <w:sz w:val="21"/>
           <w:szCs w:val="21"/>
         </w:rPr>
-        <w:t xml:space="preserve">。由于 u 恒为易感，它不计入群体的感染计数，群体的激活只取决于 i。</w:t>
+        <w:t xml:space="preserve">。因为 u 一直是易感的，它不算进群体的感染计数，所以群体激活与否只由 i 决定。</w:t>
       </w:r>
     </w:p>
     <w:p>
@@ -5735,7 +5735,7 @@
           <w:sz w:val="21"/>
           <w:szCs w:val="21"/>
         </w:rPr>
-        <w:t xml:space="preserve">闭合建立在两条假设上。其一为</w:t>
+        <w:t xml:space="preserve">闭合建立在两条假设上。其一是</w:t>
       </w:r>
       <w:r>
         <w:rPr>
@@ -5773,7 +5773,7 @@
           <w:sz w:val="21"/>
           <w:szCs w:val="21"/>
         </w:rPr>
-        <w:t xml:space="preserve"> 时局域收敛于超树，任一有限邻域内出现回路的概率为 </w:t>
+        <w:t xml:space="preserve"> 时局域收敛到超树，任一有限邻域里出现回路的概率是 </w:t>
       </w:r>
       <w:r>
         <w:rPr>
@@ -5791,7 +5791,7 @@
           <w:sz w:val="21"/>
           <w:szCs w:val="21"/>
         </w:rPr>
-        <w:t xml:space="preserve">，据此 u 所属各群体的上游分支互不相交，节点侧因而因子化为</w:t>
+        <w:t xml:space="preserve">，据此，u 所属的各个群体、它们的上游分支互不相交，节点侧于是因子化成</w:t>
       </w:r>
     </w:p>
     <w:p>
@@ -5878,7 +5878,7 @@
           <w:sz w:val="21"/>
           <w:szCs w:val="21"/>
         </w:rPr>
-        <w:t xml:space="preserve">其中 ε 为初始均匀感染比例，Ψ 为节点侧生成函数。其二为</w:t>
+        <w:t xml:space="preserve">其中 ε 是初始均匀感染比例，Ψ 是节点侧的生成函数。其二是</w:t>
       </w:r>
       <w:r>
         <w:rPr>
@@ -5898,7 +5898,7 @@
           <w:sz w:val="21"/>
           <w:szCs w:val="21"/>
         </w:rPr>
-        <w:t xml:space="preserve">：去掉 e 之后其各成员落在互不相交的分支中，故它们经由自身其他群体被感染的过程相互独立。该假设弱于有向情形下的</w:t>
+        <w:t xml:space="preserve">：把 e 去掉之后，它的各个成员落在互不相交的分支里，所以它们各自经由别的群体被感染的过程是相互独立的。这条假设比有向情形下的</w:t>
       </w:r>
       <w:r>
         <w:rPr>
@@ -5918,7 +5918,7 @@
           <w:sz w:val="21"/>
           <w:szCs w:val="21"/>
         </w:rPr>
-        <w:t xml:space="preserve">——它只断言</w:t>
+        <w:t xml:space="preserve">要弱——它只说</w:t>
       </w:r>
       <w:r>
         <w:rPr>
@@ -5938,7 +5938,7 @@
           <w:sz w:val="21"/>
           <w:szCs w:val="21"/>
         </w:rPr>
-        <w:t xml:space="preserve">暴露独立，群内耦合并未被忽略，而是已由 (2.2) 的计数状态承载。方程组的维数为 </w:t>
+        <w:t xml:space="preserve">暴露独立，群内耦合并没有被丢掉，而是已经由 (2.2) 的计数状态扛下来了。方程组的维数是 </w:t>
       </w:r>
       <w:r>
         <w:rPr>
@@ -5994,7 +5994,7 @@
           <w:sz w:val="21"/>
           <w:szCs w:val="21"/>
         </w:rPr>
-        <w:t xml:space="preserve">（S 由 Φ 代数给出、终态规模 </w:t>
+        <w:t xml:space="preserve">（S 由 Φ 代数地给出、终态规模 </w:t>
       </w:r>
       <w:r>
         <w:rPr>
@@ -6012,7 +6012,7 @@
           <w:sz w:val="21"/>
           <w:szCs w:val="21"/>
         </w:rPr>
-        <w:t xml:space="preserve"> 直接读出，均不另设方程），与系统规模 N 无关，积分一次即给出 </w:t>
+        <w:t xml:space="preserve"> 直接读出，这两样都不再另设方程），和系统规模 N 无关，积分一次就给出 </w:t>
       </w:r>
       <w:r>
         <w:rPr>
@@ -6030,7 +6030,7 @@
           <w:sz w:val="21"/>
           <w:szCs w:val="21"/>
         </w:rPr>
-        <w:t xml:space="preserve"> 与终态规模</w:t>
+        <w:t xml:space="preserve"> 和终态规模</w:t>
       </w:r>
     </w:p>
     <w:p>
@@ -6090,7 +6090,7 @@
           <w:sz w:val="21"/>
           <w:szCs w:val="21"/>
         </w:rPr>
-        <w:t xml:space="preserve">一个种子在一个孤立的 m 元群体内造成的感染数并非 </w:t>
+        <w:t xml:space="preserve">一个种子在一个孤立的 m 元群体里造成的感染数，并不是 </w:t>
       </w:r>
       <w:r>
         <w:rPr>
@@ -6108,7 +6108,7 @@
           <w:sz w:val="21"/>
           <w:szCs w:val="21"/>
         </w:rPr>
-        <w:t xml:space="preserve">，因为群体在整个级联期间持续激活。记 </w:t>
+        <w:t xml:space="preserve">，因为在整个级联期间群体一直是激活着的。记 </w:t>
       </w:r>
       <w:r>
         <w:rPr>
@@ -6126,7 +6126,7 @@
           <w:sz w:val="21"/>
           <w:szCs w:val="21"/>
         </w:rPr>
-        <w:t xml:space="preserve"> 为从 i 个感染、s 个易感出发此后新增感染数的期望，以 </w:t>
+        <w:t xml:space="preserve"> 为从 i 个感染、s 个易感出发、此后新增感染数的期望，再把群体的总感染率（以康复率为单位）记成 </w:t>
       </w:r>
       <w:r>
         <w:rPr>
@@ -6163,7 +6163,7 @@
           <w:sz w:val="21"/>
           <w:szCs w:val="21"/>
         </w:rPr>
-        <w:t xml:space="preserve"> 记群体的总感染率（以康复率为单位），则</w:t>
+        <w:t xml:space="preserve">，那么</w:t>
       </w:r>
     </w:p>
     <w:p>
@@ -6269,7 +6269,7 @@
           <w:sz w:val="21"/>
           <w:szCs w:val="21"/>
         </w:rPr>
-        <w:t xml:space="preserve">边界为 </w:t>
+        <w:t xml:space="preserve">边界是 </w:t>
       </w:r>
       <w:r>
         <w:rPr>
@@ -6336,7 +6336,7 @@
           <w:sz w:val="21"/>
           <w:szCs w:val="21"/>
         </w:rPr>
-        <w:t xml:space="preserve">是一个可精确计算的标量。</w:t>
+        <w:t xml:space="preserve">它是一个可以精确算出来的标量。</w:t>
       </w:r>
       <w:r>
         <w:rPr>
@@ -6372,7 +6372,7 @@
           <w:sz w:val="21"/>
           <w:szCs w:val="21"/>
         </w:rPr>
-        <w:t xml:space="preserve">，级联消失而回到成对传递概率；</w:t>
+        <w:t xml:space="preserve">，级联消失、退回到成对传递概率；</w:t>
       </w:r>
       <w:r>
         <w:rPr>
@@ -6444,7 +6444,7 @@
           <w:sz w:val="21"/>
           <w:szCs w:val="21"/>
         </w:rPr>
-        <w:t xml:space="preserve"> 分别超出 11.1%、21.5% 与 31.0%，并非可忽略的修正；</w:t>
+        <w:t xml:space="preserve"> 分别超出 11.1%、21.5% 和 31.0%，这可不是能忽略的小修正；</w:t>
       </w:r>
       <w:r>
         <w:rPr>
@@ -6462,7 +6462,7 @@
           <w:sz w:val="21"/>
           <w:szCs w:val="21"/>
         </w:rPr>
-        <w:t xml:space="preserve"> 时单个种子无法激活群体，故 </w:t>
+        <w:t xml:space="preserve"> 时单个种子没法激活群体，所以 </w:t>
       </w:r>
       <w:r>
         <w:rPr>
@@ -6507,7 +6507,7 @@
           <w:sz w:val="21"/>
           <w:szCs w:val="21"/>
         </w:rPr>
-        <w:t xml:space="preserve">分支过程必须定义在群体层面：每个新感染节点点燃它的其余各群体，每个被点燃的群体产出 C 个新感染成员，这些成员再点燃各自的其余群体。若改在节点层面朴素地统计谁直接传染了谁，群内级联的后继会被重复计入。以</w:t>
+        <w:t xml:space="preserve">分支过程必须定义在群体这个层面上：每个新感染的节点，去点燃它剩下的各个群体，每个被点燃的群体又产出 C 个新的感染成员，这些成员再去点燃各自剩下的群体。要是改在节点层面上、傻乎乎地统计谁直接传染了谁，群内级联的后继就会被重复算进去。把</w:t>
       </w:r>
       <w:r>
         <w:rPr>
@@ -6527,7 +6527,7 @@
           <w:sz w:val="21"/>
           <w:szCs w:val="21"/>
         </w:rPr>
-        <w:t xml:space="preserve">为型，经由层 a 感染的节点其层 b 群体数的期望为 </w:t>
+        <w:t xml:space="preserve">当作型，那么经由层 a 感染的节点、它的层 b 群体数的期望是 </w:t>
       </w:r>
       <w:r>
         <w:rPr>
@@ -6612,7 +6612,7 @@
           <w:sz w:val="21"/>
           <w:szCs w:val="21"/>
         </w:rPr>
-        <w:t xml:space="preserve">，故</w:t>
+        <w:t xml:space="preserve">，所以</w:t>
       </w:r>
     </w:p>
     <w:p>
@@ -6860,7 +6860,7 @@
           <w:sz w:val="21"/>
           <w:szCs w:val="21"/>
         </w:rPr>
-        <w:t xml:space="preserve"> 确定，ρ 为谱半径。标量再生数由此升维为矩阵：单层、多层、成对、高阶均为其特例。全部 </w:t>
+        <w:t xml:space="preserve"> 定出来，ρ 是谱半径。标量的再生数到这里就升维成了矩阵：单层、多层、成对、高阶都只是它的特例。所有 </w:t>
       </w:r>
       <w:r>
         <w:rPr>
@@ -6915,7 +6915,7 @@
           <w:sz w:val="21"/>
           <w:szCs w:val="21"/>
         </w:rPr>
-        <w:t xml:space="preserve">，(2.7) 回到多层网络 SIR 的已知阈值；</w:t>
+        <w:t xml:space="preserve">，(2.7) 退回到多层网络 SIR 那个已知阈值；</w:t>
       </w:r>
       <w:r>
         <w:rPr>
@@ -6933,7 +6933,7 @@
           <w:sz w:val="21"/>
           <w:szCs w:val="21"/>
         </w:rPr>
-        <w:t xml:space="preserve"> 时其传递概率阈值 </w:t>
+        <w:t xml:space="preserve"> 时，它的传递概率阈值 </w:t>
       </w:r>
       <w:r>
         <w:rPr>
@@ -7008,7 +7008,7 @@
           <w:sz w:val="21"/>
           <w:szCs w:val="21"/>
         </w:rPr>
-        <w:t xml:space="preserve"> 回到 </w:t>
+        <w:t xml:space="preserve"> 退回到 </w:t>
       </w:r>
       <w:r>
         <w:rPr>
@@ -7045,7 +7045,7 @@
           <w:sz w:val="21"/>
           <w:szCs w:val="21"/>
         </w:rPr>
-        <w:t xml:space="preserve">。此外，N 逐元非负，故 </w:t>
+        <w:t xml:space="preserve">。另外，N 逐个元素都非负，所以 </w:t>
       </w:r>
       <w:r>
         <w:rPr>
@@ -7120,7 +7120,7 @@
           <w:sz w:val="21"/>
           <w:szCs w:val="21"/>
         </w:rPr>
-        <w:t xml:space="preserve"> 恰为孤立层 a 的分支数：多重超图的阈值因而不高于任一单层的阈值。</w:t>
+        <w:t xml:space="preserve"> 恰好就是孤立层 a 的分支数：这样一来，多重超图的阈值就不会高于任何一个单层的阈值。</w:t>
       </w:r>
     </w:p>
     <w:p>
@@ -7153,7 +7153,7 @@
           <w:sz w:val="21"/>
           <w:szCs w:val="21"/>
         </w:rPr>
-        <w:t xml:space="preserve">(2.7) 给出的阈值是线性化的产物。本小节给出一条不经由线性化的独立判据，其思路与谱方法正相反：始终停在阈值以下，由小种子所引发簇的规模发散读出 </w:t>
+        <w:t xml:space="preserve">(2.7) 给出的阈值，是线性化的产物。这一小节给出另一条不走线性化的独立判据，它的思路和谱方法正好相反：始终停在阈值以下，靠小种子引发的簇规模发散、把 </w:t>
       </w:r>
       <w:r>
         <w:rPr>
@@ -7181,7 +7181,7 @@
           <w:sz w:val="21"/>
           <w:szCs w:val="21"/>
         </w:rPr>
-        <w:t xml:space="preserve">。阈值以下单个种子只引发有限簇，但其平均总规模随 </w:t>
+        <w:t xml:space="preserve"> 读出来。阈值以下，单个种子只引发有限的簇，但它的平均总规模会随 </w:t>
       </w:r>
       <w:r>
         <w:rPr>
@@ -7219,7 +7219,7 @@
           <w:sz w:val="21"/>
           <w:szCs w:val="21"/>
         </w:rPr>
-        <w:t xml:space="preserve"> 无界增长。以同一多型分支过程计数，该平均总规模为</w:t>
+        <w:t xml:space="preserve"> 无界增长。用同一个多型分支过程去数，这个平均总规模是</w:t>
       </w:r>
     </w:p>
     <w:p>
@@ -7344,7 +7344,7 @@
           <w:sz w:val="21"/>
           <w:szCs w:val="21"/>
         </w:rPr>
-        <w:t xml:space="preserve"> 为种子的型分布。须注意 χ </w:t>
+        <w:t xml:space="preserve"> 是种子的型分布。要注意，χ </w:t>
       </w:r>
       <w:r>
         <w:rPr>
@@ -7355,7 +7355,7 @@
           <w:sz w:val="21"/>
           <w:szCs w:val="21"/>
         </w:rPr>
-        <w:t xml:space="preserve">不可</w:t>
+        <w:t xml:space="preserve">不能</w:t>
       </w:r>
       <w:r>
         <w:rPr>
@@ -7382,7 +7382,7 @@
           <w:sz w:val="21"/>
           <w:szCs w:val="21"/>
         </w:rPr>
-        <w:t xml:space="preserve">：后者仅在 </w:t>
+        <w:t xml:space="preserve">：后者只在 </w:t>
       </w:r>
       <w:r>
         <w:rPr>
@@ -7400,7 +7400,7 @@
           <w:sz w:val="21"/>
           <w:szCs w:val="21"/>
         </w:rPr>
-        <w:t xml:space="preserve"> 或 </w:t>
+        <w:t xml:space="preserve">、或者 </w:t>
       </w:r>
       <w:r>
         <w:rPr>
@@ -7428,7 +7428,7 @@
           <w:sz w:val="21"/>
           <w:szCs w:val="21"/>
         </w:rPr>
-        <w:t xml:space="preserve"> 恰为 Perron 向量时成立，多层情形下 </w:t>
+        <w:t xml:space="preserve"> 恰好是 Perron 向量时才成立，多层情形下 </w:t>
       </w:r>
       <w:r>
         <w:rPr>
@@ -7456,7 +7456,7 @@
           <w:sz w:val="21"/>
           <w:szCs w:val="21"/>
         </w:rPr>
-        <w:t xml:space="preserve"> 对各型的权重并不相同。可用的性质是 (2.8) 的极点来自 </w:t>
+        <w:t xml:space="preserve"> 给各个型的权重并不一样。这里用得上的性质是：(2.8) 的极点来自 </w:t>
       </w:r>
       <w:r>
         <w:rPr>
@@ -7484,7 +7484,7 @@
           <w:sz w:val="21"/>
           <w:szCs w:val="21"/>
         </w:rPr>
-        <w:t xml:space="preserve">，故它恰在 </w:t>
+        <w:t xml:space="preserve">，所以它恰好在 </w:t>
       </w:r>
       <w:r>
         <w:rPr>
@@ -7530,7 +7530,7 @@
           <w:sz w:val="21"/>
           <w:szCs w:val="21"/>
         </w:rPr>
-        <w:t xml:space="preserve"> 发散。其倒数因而是一条在阈值处线性穿零的光滑函数：</w:t>
+        <w:t xml:space="preserve"> 发散。它的倒数于是就是一条在阈值处线性穿零的光滑函数：</w:t>
       </w:r>
     </w:p>
     <w:p>
@@ -7618,7 +7618,7 @@
           <w:sz w:val="21"/>
           <w:szCs w:val="21"/>
         </w:rPr>
-        <w:t xml:space="preserve">零点即 </w:t>
+        <w:t xml:space="preserve">零点就是 </w:t>
       </w:r>
       <w:r>
         <w:rPr>
@@ -7646,7 +7646,7 @@
           <w:sz w:val="21"/>
           <w:szCs w:val="21"/>
         </w:rPr>
-        <w:t xml:space="preserve">。该判据与 </w:t>
+        <w:t xml:space="preserve">。这条判据和 </w:t>
       </w:r>
       <w:r>
         <w:rPr>
@@ -7664,7 +7664,7 @@
           <w:sz w:val="21"/>
           <w:szCs w:val="21"/>
         </w:rPr>
-        <w:t xml:space="preserve"> 不共享任何中间量：一侧把非线性方程组 (2.2)–(2.4) 积分至终态、再对 (2.9) 作线性拟合，另一侧对次代矩阵 (2.7) 求谱半径并二分，二者仅共享模型定义。两条路线的一致因而是对彼此的非平凡检验，这正是图 3 所报告者。</w:t>
+        <w:t xml:space="preserve"> 不共享任何中间量：一边把非线性方程组 (2.2)–(2.4) 积分到终态、再对 (2.9) 做线性拟合，另一边对次代矩阵 (2.7) 求谱半径、二分，两边只共享模型定义。所以，两条路线的结果一致，是对彼此的一次非平凡检验，图 3 报告的就是这件事。</w:t>
       </w:r>
     </w:p>
     <w:p>
@@ -7709,7 +7709,7 @@
           <w:sz w:val="21"/>
           <w:szCs w:val="21"/>
         </w:rPr>
-        <w:t xml:space="preserve">) 是 </w:t>
+        <w:t xml:space="preserve">) 说的是 </w:t>
       </w:r>
       <w:r>
         <w:rPr>
@@ -7727,7 +7727,7 @@
           <w:sz w:val="21"/>
           <w:szCs w:val="21"/>
         </w:rPr>
-        <w:t xml:space="preserve"> 的陈述。</w:t>
+        <w:t xml:space="preserve"> 的极限。</w:t>
       </w:r>
       <w:r>
         <w:rPr>
@@ -7745,7 +7745,7 @@
           <w:sz w:val="21"/>
           <w:szCs w:val="21"/>
         </w:rPr>
-        <w:t xml:space="preserve"> 时即便恰在 </w:t>
+        <w:t xml:space="preserve"> 时，就算恰好停在 </w:t>
       </w:r>
       <w:r>
         <w:rPr>
@@ -7773,7 +7773,7 @@
           <w:sz w:val="21"/>
           <w:szCs w:val="21"/>
         </w:rPr>
-        <w:t xml:space="preserve"> 处 </w:t>
+        <w:t xml:space="preserve"> 处，</w:t>
       </w:r>
       <w:r>
         <w:rPr>
@@ -7791,7 +7791,7 @@
           <w:sz w:val="21"/>
           <w:szCs w:val="21"/>
         </w:rPr>
-        <w:t xml:space="preserve"> 仍为有限，</w:t>
+        <w:t xml:space="preserve"> 还是有限的，</w:t>
       </w:r>
       <w:r>
         <w:rPr>
@@ -7809,7 +7809,7 @@
           <w:sz w:val="21"/>
           <w:szCs w:val="21"/>
         </w:rPr>
-        <w:t xml:space="preserve"> 因而不归零，零点被系统性地推高。由于 </w:t>
+        <w:t xml:space="preserve"> 于是不会归零，零点被系统性地往上抬。因为 </w:t>
       </w:r>
       <w:r>
         <w:rPr>
@@ -7827,7 +7827,7 @@
           <w:sz w:val="21"/>
           <w:szCs w:val="21"/>
         </w:rPr>
-        <w:t xml:space="preserve"> 对小 ε 为线性，该偏置可由 </w:t>
+        <w:t xml:space="preserve"> 对小 ε 是线性的，这个偏置可以用 </w:t>
       </w:r>
       <w:r>
         <w:rPr>
@@ -7845,7 +7845,7 @@
           <w:sz w:val="21"/>
           <w:szCs w:val="21"/>
         </w:rPr>
-        <w:t xml:space="preserve"> 的 Richardson 外推消去，即以 </w:t>
+        <w:t xml:space="preserve"> 的 Richardson 外推抹掉，也就是拿 </w:t>
       </w:r>
       <w:r>
         <w:rPr>
@@ -7863,7 +7863,7 @@
           <w:sz w:val="21"/>
           <w:szCs w:val="21"/>
         </w:rPr>
-        <w:t xml:space="preserve"> 代替 </w:t>
+        <w:t xml:space="preserve"> 去代替 </w:t>
       </w:r>
       <w:r>
         <w:rPr>
@@ -7881,7 +7881,7 @@
           <w:sz w:val="21"/>
           <w:szCs w:val="21"/>
         </w:rPr>
-        <w:t xml:space="preserve">。其效果可以直接读出：在代表性构型上，未作外推时零点一致偏高 0.37%–0.44%，作外推后降至 0.031%–0.065%。偏置的系统性（各构型同号且量级相当）与该修正的有效性由此同时确认。</w:t>
+        <w:t xml:space="preserve">。效果直接就能读出来：在几个有代表性的构型上，不做外推时零点一律偏高 0.37%–0.44%，做完外推降到 0.031%–0.065%。偏置的系统性（各构型同号、量级也相当）和这个修正管不管用，就同时确认了。</w:t>
       </w:r>
     </w:p>
     <w:p>
@@ -7914,7 +7914,7 @@
           <w:sz w:val="21"/>
           <w:szCs w:val="21"/>
         </w:rPr>
-        <w:t xml:space="preserve">取窗口 </w:t>
+        <w:t xml:space="preserve">在窗口 </w:t>
       </w:r>
       <w:r>
         <w:rPr>
@@ -7942,7 +7942,7 @@
           <w:sz w:val="21"/>
           <w:szCs w:val="21"/>
         </w:rPr>
-        <w:t xml:space="preserve"> 上的十个点，每点按上述方式求 </w:t>
+        <w:t xml:space="preserve"> 上取十个点，每个点都按上面的办法求 </w:t>
       </w:r>
       <w:r>
         <w:rPr>
@@ -7978,7 +7978,7 @@
           <w:sz w:val="21"/>
           <w:szCs w:val="21"/>
         </w:rPr>
-        <w:t xml:space="preserve">，作线性拟合并取其 x 截距。八组构型的阈值覆盖 </w:t>
+        <w:t xml:space="preserve">，做线性拟合、取它的 x 截距。八组构型的阈值覆盖了 </w:t>
       </w:r>
       <w:r>
         <w:rPr>
@@ -8015,7 +8015,7 @@
           <w:sz w:val="21"/>
           <w:szCs w:val="21"/>
         </w:rPr>
-        <w:t xml:space="preserve">，含单层高阶超图、成对退化网络与双层多重超图，其 </w:t>
+        <w:t xml:space="preserve">，里面有单层高阶超图、成对退化网络和双层多重超图，它们的 </w:t>
       </w:r>
       <w:r>
         <w:rPr>
@@ -8033,7 +8033,7 @@
           <w:sz w:val="21"/>
           <w:szCs w:val="21"/>
         </w:rPr>
-        <w:t xml:space="preserve"> 值依次为 0.080302、0.099309、0.128162、0.174483、0.185417、0.250000、0.333333 与 0.400567，而外推值依次为 0.080354、0.099370、0.128236、0.174536、0.185512、0.250096、0.333440 与 0.400702。相对偏差依次为 +0.065%、+0.062%、+0.058%、+0.031%、+0.052%、+0.039%、+0.032% 与 +0.034%，最大者为 </w:t>
+        <w:t xml:space="preserve"> 值依次是 0.080302、0.099309、0.128162、0.174483、0.185417、0.250000、0.333333 和 0.400567，而外推值依次是 0.080354、0.099370、0.128236、0.174536、0.185512、0.250096、0.333440 和 0.400702。相对偏差依次是 +0.065%、+0.062%、+0.058%、+0.031%、+0.052%、+0.039%、+0.032% 和 +0.034%，最大的一个是 </w:t>
       </w:r>
       <w:r>
         <w:rPr>
@@ -8061,7 +8061,7 @@
           <w:sz w:val="21"/>
           <w:szCs w:val="21"/>
         </w:rPr>
-        <w:t xml:space="preserve">。以外推截距的回归标准误 σ 为单位，偏离依次为 +1.51、+1.38、+1.26、+0.55、+1.03、+0.76、+0.57 与 +0.47，最大者 1.51σ，全部落在 1.6σ 之内。</w:t>
+        <w:t xml:space="preserve">。再以外推截距的回归标准误 σ 为单位，偏离依次是 +1.51、+1.38、+1.26、+0.55、+1.03、+0.76、+0.57 和 +0.47，最大 1.51σ，全都落在 1.6σ 以内。</w:t>
       </w:r>
     </w:p>
     <w:p>
@@ -8077,7 +8077,7 @@
           <w:sz w:val="21"/>
           <w:szCs w:val="21"/>
         </w:rPr>
-        <w:t xml:space="preserve">残余偏差为线性律 (2.9) 的</w:t>
+        <w:t xml:space="preserve">这点残余偏差，是线性律 (2.9) 的</w:t>
       </w:r>
       <w:r>
         <w:rPr>
@@ -8097,7 +8097,7 @@
           <w:sz w:val="21"/>
           <w:szCs w:val="21"/>
         </w:rPr>
-        <w:t xml:space="preserve">，而非闭合与谱方法之间的实质分歧。</w:t>
+        <w:t xml:space="preserve">，而不是闭合和谱方法之间有什么实质分歧。</w:t>
       </w:r>
       <w:r>
         <w:rPr>
@@ -8115,7 +8115,7 @@
           <w:sz w:val="21"/>
           <w:szCs w:val="21"/>
         </w:rPr>
-        <w:t xml:space="preserve"> 仅在 </w:t>
+        <w:t xml:space="preserve"> 只在 </w:t>
       </w:r>
       <w:r>
         <w:rPr>
@@ -8143,7 +8143,7 @@
           <w:sz w:val="21"/>
           <w:szCs w:val="21"/>
         </w:rPr>
-        <w:t xml:space="preserve"> 的紧邻严格线性，有限窗口上的拟合因而带一个由曲率所致的偏置；实测该偏置的符号随窗口位置翻转——窗口取 </w:t>
+        <w:t xml:space="preserve"> 的紧邻处才严格线性，有限窗口上的拟合于是带上了一个由曲率造成的偏置；实测这个偏置的符号会随窗口位置翻过来——窗口取 </w:t>
       </w:r>
       <w:r>
         <w:rPr>
@@ -8171,7 +8171,7 @@
           <w:sz w:val="21"/>
           <w:szCs w:val="21"/>
         </w:rPr>
-        <w:t xml:space="preserve"> 时为负、取 </w:t>
+        <w:t xml:space="preserve"> 时是负的、取 </w:t>
       </w:r>
       <w:r>
         <w:rPr>
@@ -8199,7 +8199,7 @@
           <w:sz w:val="21"/>
           <w:szCs w:val="21"/>
         </w:rPr>
-        <w:t xml:space="preserve"> 时为正——其量级与 σ 相当，故不可与真实偏离相区分。</w:t>
+        <w:t xml:space="preserve"> 时是正的——它的量级和 σ 相当，所以根本没法和真实偏离区分开。</w:t>
       </w:r>
     </w:p>
     <w:p>
@@ -8301,7 +8301,7 @@
           <w:sz w:val="18"/>
           <w:szCs w:val="18"/>
         </w:rPr>
-        <w:t xml:space="preserve">，并与 </w:t>
+        <w:t xml:space="preserve">，并和 </w:t>
       </w:r>
       <w:r>
         <w:rPr>
@@ -8365,7 +8365,7 @@
           <w:sz w:val="18"/>
           <w:szCs w:val="18"/>
         </w:rPr>
-        <w:t xml:space="preserve"> 线性趋零，示例三组构型为双层 </w:t>
+        <w:t xml:space="preserve"> 线性趋零，示例的三组构型是双层 </w:t>
       </w:r>
       <w:r>
         <w:rPr>
@@ -8383,7 +8383,7 @@
           <w:sz w:val="18"/>
           <w:szCs w:val="18"/>
         </w:rPr>
-        <w:t xml:space="preserve">、成对 6-正则与单层 </w:t>
+        <w:t xml:space="preserve">、成对 6-正则和单层 </w:t>
       </w:r>
       <w:r>
         <w:rPr>
@@ -8401,7 +8401,7 @@
           <w:sz w:val="18"/>
           <w:szCs w:val="18"/>
         </w:rPr>
-        <w:t xml:space="preserve">；散点为 </w:t>
+        <w:t xml:space="preserve">；散点是 </w:t>
       </w:r>
       <w:r>
         <w:rPr>
@@ -8419,7 +8419,7 @@
           <w:sz w:val="18"/>
           <w:szCs w:val="18"/>
         </w:rPr>
-        <w:t xml:space="preserve"> 外推后的闭合终态，实线为窗口 </w:t>
+        <w:t xml:space="preserve"> 外推后的闭合终态，实线是窗口 </w:t>
       </w:r>
       <w:r>
         <w:rPr>
@@ -8447,7 +8447,7 @@
           <w:sz w:val="18"/>
           <w:szCs w:val="18"/>
         </w:rPr>
-        <w:t xml:space="preserve"> 内的线性拟合，虚线为其向零点的延长，空心圆标出 </w:t>
+        <w:t xml:space="preserve"> 内的线性拟合，虚线是它向零点的延长，空心圆标出 </w:t>
       </w:r>
       <w:r>
         <w:rPr>
@@ -8465,7 +8465,7 @@
           <w:sz w:val="18"/>
           <w:szCs w:val="18"/>
         </w:rPr>
-        <w:t xml:space="preserve"> 的预言（即横坐标 1，与竖虚线同处）；三条延长线各自的零点分别位于 1.000616、1.000386 与 1.000336，皆在其右侧而在此标度下与之不可分辨。(b) 八组构型的外推值与 </w:t>
+        <w:t xml:space="preserve"> 的预言（也就是横坐标 1，和竖虚线同处）；三条延长线各自的零点分别在 1.000616、1.000386 和 1.000336，都在它右侧、可在此标度下和它分不开。(b) 八组构型的外推值和 </w:t>
       </w:r>
       <w:r>
         <w:rPr>
@@ -8511,7 +8511,7 @@
           <w:sz w:val="18"/>
           <w:szCs w:val="18"/>
         </w:rPr>
-        <w:t xml:space="preserve">，误差棒为回归标准误 σ，在此标度下小于标记。(c) 偏离的 σ 数 </w:t>
+        <w:t xml:space="preserve">，误差棒是回归标准误 σ，在此标度下比标记还小。(c) 偏离的 σ 数 </w:t>
       </w:r>
       <w:r>
         <w:rPr>
@@ -8587,7 +8587,7 @@
           <w:sz w:val="18"/>
           <w:szCs w:val="18"/>
         </w:rPr>
-        <w:t xml:space="preserve">，最大者 1.51σ，阴影分别为 ±1σ 与 ±2σ 带。</w:t>
+        <w:t xml:space="preserve">，最大 1.51σ，阴影分别是 ±1σ 和 ±2σ 带。</w:t>
       </w:r>
     </w:p>
     <w:p>
@@ -8620,7 +8620,7 @@
           <w:sz w:val="21"/>
           <w:szCs w:val="21"/>
         </w:rPr>
-        <w:t xml:space="preserve">阈值只经由度矩进入 N，故可取一族</w:t>
+        <w:t xml:space="preserve">阈值只经由度矩进入 N，所以可以取一族</w:t>
       </w:r>
       <w:r>
         <w:rPr>
@@ -8631,16 +8631,16 @@
           <w:sz w:val="21"/>
           <w:szCs w:val="21"/>
         </w:rPr>
-        <w:t xml:space="preserve">边缘固定、仅相关不同</w:t>
-      </w:r>
-      <w:r>
-        <w:rPr>
-          <w:rFonts w:ascii="SimSun" w:cs="SimSun" w:eastAsia="SimSun" w:hAnsi="SimSun"/>
-          <w:color w:val="000000"/>
-          <w:sz w:val="21"/>
-          <w:szCs w:val="21"/>
-        </w:rPr>
-        <w:t xml:space="preserve">的构型，隔离出层间参与相关的效应。设两层度各以等概率为 2 或 4（边缘均值 3、方差 1），联合分布取 </w:t>
+        <w:t xml:space="preserve">边缘固定、只有相关不同</w:t>
+      </w:r>
+      <w:r>
+        <w:rPr>
+          <w:rFonts w:ascii="SimSun" w:cs="SimSun" w:eastAsia="SimSun" w:hAnsi="SimSun"/>
+          <w:color w:val="000000"/>
+          <w:sz w:val="21"/>
+          <w:szCs w:val="21"/>
+        </w:rPr>
+        <w:t xml:space="preserve">的构型，把层间参与相关的效应单独隔出来。设两层度各以等概率取 2 或 4（边缘均值 3、方差 1），联合分布取 </w:t>
       </w:r>
       <w:r>
         <w:rPr>
@@ -8742,7 +8742,7 @@
           <w:sz w:val="21"/>
           <w:szCs w:val="21"/>
         </w:rPr>
-        <w:t xml:space="preserve"> 恰为两层度的 Pearson 相关。</w:t>
+        <w:t xml:space="preserve"> 恰好就是两层度的 Pearson 相关。</w:t>
       </w:r>
       <w:r>
         <w:rPr>
@@ -8770,7 +8770,7 @@
           <w:sz w:val="21"/>
           <w:szCs w:val="21"/>
         </w:rPr>
-        <w:t xml:space="preserve"> 由 −1（反相关）扫到 +1（正相关）时边缘不变，只有交叉矩 </w:t>
+        <w:t xml:space="preserve"> 从 −1（反相关）扫到 +1（正相关）时，边缘一直不变，只有交叉矩 </w:t>
       </w:r>
       <w:r>
         <w:rPr>
@@ -8836,7 +8836,7 @@
           <w:sz w:val="21"/>
           <w:szCs w:val="21"/>
         </w:rPr>
-        <w:t xml:space="preserve"> 随之改变。</w:t>
+        <w:t xml:space="preserve"> 跟着改变。</w:t>
       </w:r>
     </w:p>
     <w:p>
@@ -8926,7 +8926,7 @@
           <w:sz w:val="21"/>
           <w:szCs w:val="21"/>
         </w:rPr>
-        <w:t xml:space="preserve"> 与 </w:t>
+        <w:t xml:space="preserve"> 和 </w:t>
       </w:r>
       <w:r>
         <w:rPr>
@@ -8954,7 +8954,7 @@
           <w:sz w:val="21"/>
           <w:szCs w:val="21"/>
         </w:rPr>
-        <w:t xml:space="preserve"> 无关，非对角元 </w:t>
+        <w:t xml:space="preserve"> 没关系，非对角元 </w:t>
       </w:r>
       <w:r>
         <w:rPr>
@@ -9057,7 +9057,7 @@
           <w:sz w:val="21"/>
           <w:szCs w:val="21"/>
         </w:rPr>
-        <w:t xml:space="preserve"> 线性增大，故 </w:t>
+        <w:t xml:space="preserve"> 线性变大，所以 </w:t>
       </w:r>
       <w:r>
         <w:rPr>
@@ -9150,7 +9150,7 @@
           <w:sz w:val="21"/>
           <w:szCs w:val="21"/>
         </w:rPr>
-        <w:t xml:space="preserve"> 定出——</w:t>
+        <w:t xml:space="preserve"> 定出来——</w:t>
       </w:r>
       <w:r>
         <w:rPr>
@@ -9170,7 +9170,7 @@
           <w:sz w:val="21"/>
           <w:szCs w:val="21"/>
         </w:rPr>
-        <w:t xml:space="preserve">。图 4 的实线即此曲线：</w:t>
+        <w:t xml:space="preserve">。图 4 里的实线就是这条曲线：</w:t>
       </w:r>
       <w:r>
         <w:rPr>
@@ -9272,7 +9272,7 @@
           <w:sz w:val="21"/>
           <w:szCs w:val="21"/>
         </w:rPr>
-        <w:t xml:space="preserve"> 处的 0.0930，共约 12.5%。同一族在位形模型多重超图上的直接 Gillespie 仿真（由亚临界簇规模外推 </w:t>
+        <w:t xml:space="preserve"> 处的 0.0930，一共降了大约 12.5%。同一族构型在位形模型多重超图上的直接 Gillespie 仿真（靠亚临界簇规模外推 </w:t>
       </w:r>
       <w:r>
         <w:rPr>
@@ -9318,7 +9318,7 @@
           <w:sz w:val="21"/>
           <w:szCs w:val="21"/>
         </w:rPr>
-        <w:t xml:space="preserve">）在六个 </w:t>
+        <w:t xml:space="preserve">），在六个 </w:t>
       </w:r>
       <w:r>
         <w:rPr>
@@ -9346,7 +9346,7 @@
           <w:sz w:val="21"/>
           <w:szCs w:val="21"/>
         </w:rPr>
-        <w:t xml:space="preserve"> 上复现该曲线，偏离最大 1.9σ、相对差不超过 1.1%。相同节点在两层同时充当枢纽，会在边缘结构不变的前提下集中跨层传播能力、压低阈值；反相关则抬高阈值。</w:t>
+        <w:t xml:space="preserve"> 上都把这条曲线复现了出来，偏离最大 1.9σ、相对差不超过 1.1%。更关键的是那背后的机制：同一批节点在两层同时当枢纽，就会在边缘结构没变的情况下，把跨层传播能力集中起来、压低阈值；反相关则把阈值抬高。</w:t>
       </w:r>
     </w:p>
     <w:p>
@@ -9484,7 +9484,7 @@
           <w:sz w:val="18"/>
           <w:szCs w:val="18"/>
         </w:rPr>
-        <w:t xml:space="preserve">），仅调节两层度的 Pearson 相关 </w:t>
+        <w:t xml:space="preserve">），只调节两层度的 Pearson 相关 </w:t>
       </w:r>
       <w:r>
         <w:rPr>
@@ -9512,7 +9512,7 @@
           <w:sz w:val="18"/>
           <w:szCs w:val="18"/>
         </w:rPr>
-        <w:t xml:space="preserve">。（a）结果：蓝线为 </w:t>
+        <w:t xml:space="preserve">。（a）结果：蓝线是 </w:t>
       </w:r>
       <w:r>
         <w:rPr>
@@ -9530,7 +9530,7 @@
           <w:sz w:val="18"/>
           <w:szCs w:val="18"/>
         </w:rPr>
-        <w:t xml:space="preserve"> 的精确阈值，箱线为多重超图上直接 Gillespie 仿真所得阈值的自助分布（</w:t>
+        <w:t xml:space="preserve"> 的精确阈值，箱线是多重超图上直接 Gillespie 仿真所得阈值的自助分布（</w:t>
       </w:r>
       <w:r>
         <w:rPr>
@@ -9558,7 +9558,7 @@
           <w:sz w:val="18"/>
           <w:szCs w:val="18"/>
         </w:rPr>
-        <w:t xml:space="preserve">；箱体为四分位距、须为 5–95 百分位、中线为中位数），</w:t>
+        <w:t xml:space="preserve">；箱体是四分位距、须是 5–95 百分位、中线是中位数），</w:t>
       </w:r>
       <w:r>
         <w:rPr>
@@ -9614,7 +9614,7 @@
           <w:sz w:val="18"/>
           <w:szCs w:val="18"/>
         </w:rPr>
-        <w:t xml:space="preserve"> 单调下降约 12.5%，六点上一致至 1.9σ。（b）测量：各 </w:t>
+        <w:t xml:space="preserve"> 单调下降大约 12.5%，六点上一致到 1.9σ。（b）测量：各 </w:t>
       </w:r>
       <w:r>
         <w:rPr>
@@ -9678,7 +9678,7 @@
           <w:sz w:val="18"/>
           <w:szCs w:val="18"/>
         </w:rPr>
-        <w:t xml:space="preserve"> 线性趋零，其 </w:t>
+        <w:t xml:space="preserve"> 线性趋零，它的 </w:t>
       </w:r>
       <w:r>
         <w:rPr>
@@ -9696,7 +9696,7 @@
           <w:sz w:val="18"/>
           <w:szCs w:val="18"/>
         </w:rPr>
-        <w:t xml:space="preserve"> 截距（空心圈）即 </w:t>
+        <w:t xml:space="preserve"> 截距（空心圈）就是 </w:t>
       </w:r>
       <w:r>
         <w:rPr>
@@ -9752,7 +9752,7 @@
           <w:sz w:val="18"/>
           <w:szCs w:val="18"/>
         </w:rPr>
-        <w:t xml:space="preserve"> 着色即（a）中各箱之来源。（c）机制：固定 </w:t>
+        <w:t xml:space="preserve"> 着色，也就是（a）中各个箱子的来源。（c）机制：固定 </w:t>
       </w:r>
       <w:r>
         <w:rPr>
@@ -9853,7 +9853,7 @@
           <w:sz w:val="18"/>
           <w:szCs w:val="18"/>
         </w:rPr>
-        <w:t xml:space="preserve"> 一线恰在 </w:t>
+        <w:t xml:space="preserve"> 那条线恰好在 </w:t>
       </w:r>
       <w:r>
         <w:rPr>
@@ -9890,7 +9890,7 @@
           <w:sz w:val="18"/>
           <w:szCs w:val="18"/>
         </w:rPr>
-        <w:t xml:space="preserve"> 越过 </w:t>
+        <w:t xml:space="preserve"> 处越过 </w:t>
       </w:r>
       <w:r>
         <w:rPr>
@@ -9908,7 +9908,7 @@
           <w:sz w:val="18"/>
           <w:szCs w:val="18"/>
         </w:rPr>
-        <w:t xml:space="preserve">——相关参与集中跨层传播能力、压低阈值的机制。</w:t>
+        <w:t xml:space="preserve">——这正是相关参与集中跨层传播能力、压低阈值的机制。</w:t>
       </w:r>
     </w:p>
     <w:p>
@@ -9941,7 +9941,7 @@
           <w:sz w:val="21"/>
           <w:szCs w:val="21"/>
         </w:rPr>
-        <w:t xml:space="preserve">校验分四层：闭合内部的自洽、阈值公式的解析锚点、亚临界规模的独立复算，以及级联量本身的蒙特卡洛复核。脚本见 verify.py、verify_ode.py、datacheck.py 与 recheck_mc.py。</w:t>
+        <w:t xml:space="preserve">校验分四层：闭合内部的自洽、阈值公式的解析锚点、亚临界规模的独立复算，还有级联量本身的蒙特卡洛复核。脚本见 verify.py、verify_ode.py、datacheck.py 和 recheck_mc.py。</w:t>
       </w:r>
     </w:p>
     <w:p>
@@ -9968,7 +9968,7 @@
           <w:sz w:val="21"/>
           <w:szCs w:val="21"/>
         </w:rPr>
-        <w:t xml:space="preserve">对 (2.2) 的方程组求和，外部风险项、群内项与康复项各自守恒相消，只余 </w:t>
+        <w:t xml:space="preserve">把 (2.2) 那组方程逐项求和，外部风险项、群内项和康复项各自守恒、两两相消，只剩下 </w:t>
       </w:r>
       <w:r>
         <w:rPr>
@@ -10044,7 +10044,7 @@
           <w:sz w:val="21"/>
           <w:szCs w:val="21"/>
         </w:rPr>
-        <w:t xml:space="preserve">；数值上该求和规则的残差为 </w:t>
+        <w:t xml:space="preserve">；数值上，这条求和规则的残差在 </w:t>
       </w:r>
       <w:r>
         <w:rPr>
@@ -10072,7 +10072,7 @@
           <w:sz w:val="21"/>
           <w:szCs w:val="21"/>
         </w:rPr>
-        <w:t xml:space="preserve"> 量级，达机器精度。全部成员易感蕴含群体从未激活、因而必未传递，故 </w:t>
+        <w:t xml:space="preserve"> 量级，到了机器精度。全部成员都易感，就意味着群体从没激活过、因此也必定没传递过，所以 </w:t>
       </w:r>
       <w:r>
         <w:rPr>
@@ -10148,7 +10148,7 @@
           <w:sz w:val="21"/>
           <w:szCs w:val="21"/>
         </w:rPr>
-        <w:t xml:space="preserve"> 对一切 t 成立；该恒等式不是额外假设而是方程组的推论，其残差为 </w:t>
+        <w:t xml:space="preserve"> 对一切 t 都成立；这条恒等式不是额外加的假设，而是方程组本身的推论，它的残差在 </w:t>
       </w:r>
       <w:r>
         <w:rPr>
@@ -10176,7 +10176,7 @@
           <w:sz w:val="21"/>
           <w:szCs w:val="21"/>
         </w:rPr>
-        <w:t xml:space="preserve"> 量级，纯属积分误差。此外，把 (2.2) 在无病定态作数值 Jacobian，其谱横标在 </w:t>
+        <w:t xml:space="preserve"> 量级，纯粹是积分误差。另外，把 (2.2) 在无病定态处取数值 Jacobian，它的谱横标在 </w:t>
       </w:r>
       <w:r>
         <w:rPr>
@@ -10194,7 +10194,7 @@
           <w:sz w:val="21"/>
           <w:szCs w:val="21"/>
         </w:rPr>
-        <w:t xml:space="preserve"> 所给的 </w:t>
+        <w:t xml:space="preserve"> 给出的那个 </w:t>
       </w:r>
       <w:r>
         <w:rPr>
@@ -10222,7 +10222,7 @@
           <w:sz w:val="21"/>
           <w:szCs w:val="21"/>
         </w:rPr>
-        <w:t xml:space="preserve"> 处为零，达机器精度：闭合与次代矩阵共享同一个阈值，(2.9) 的外推所测者因而确为 (2.7) 的阈值。</w:t>
+        <w:t xml:space="preserve"> 处为零，也到机器精度：闭合和次代矩阵共享同一个阈值，所以 (2.9) 的外推测的，确实就是 (2.7) 的阈值。</w:t>
       </w:r>
     </w:p>
     <w:p>
@@ -10303,7 +10303,7 @@
           <w:sz w:val="21"/>
           <w:szCs w:val="21"/>
         </w:rPr>
-        <w:t xml:space="preserve"> 与 2 处与解析值相差不超过 </w:t>
+        <w:t xml:space="preserve"> 和 2 处和解析值相差不超过 </w:t>
       </w:r>
       <w:r>
         <w:rPr>
@@ -10349,7 +10349,7 @@
           <w:sz w:val="21"/>
           <w:szCs w:val="21"/>
         </w:rPr>
-        <w:t xml:space="preserve"> 时恒为零。阈值公式 (2.7) 在成对退化的 5-正则单层上给出 </w:t>
+        <w:t xml:space="preserve"> 时它恒等于零。阈值公式 (2.7) 在成对退化的 5-正则单层上给出 </w:t>
       </w:r>
       <w:r>
         <w:rPr>
@@ -10386,7 +10386,7 @@
           <w:sz w:val="21"/>
           <w:szCs w:val="21"/>
         </w:rPr>
-        <w:t xml:space="preserve">，与解析值逐位相同至十位有效数字。在 </w:t>
+        <w:t xml:space="preserve">，和解析值逐位相同、一直对到十位有效数字。在 </w:t>
       </w:r>
       <w:r>
         <w:rPr>
@@ -10440,7 +10440,7 @@
           <w:sz w:val="21"/>
           <w:szCs w:val="21"/>
         </w:rPr>
-        <w:t xml:space="preserve"> 处 </w:t>
+        <w:t xml:space="preserve"> 处，</w:t>
       </w:r>
       <w:r>
         <w:rPr>
@@ -10496,7 +10496,7 @@
           <w:sz w:val="21"/>
           <w:szCs w:val="21"/>
         </w:rPr>
-        <w:t xml:space="preserve">，两层各自处于深度亚临界，而合并后 </w:t>
+        <w:t xml:space="preserve">，两层各自都还在深度亚临界，可合并起来 </w:t>
       </w:r>
       <w:r>
         <w:rPr>
@@ -10514,7 +10514,7 @@
           <w:sz w:val="21"/>
           <w:szCs w:val="21"/>
         </w:rPr>
-        <w:t xml:space="preserve"> 已越过临界——两条各自亚临界的弱渠道合并之后可以超临界。最后，</w:t>
+        <w:t xml:space="preserve"> 就已经越过临界了——两条各自亚临界的弱渠道，合到一起之后能变成超临界。最后，</w:t>
       </w:r>
       <w:r>
         <w:rPr>
@@ -10532,7 +10532,7 @@
           <w:sz w:val="21"/>
           <w:szCs w:val="21"/>
         </w:rPr>
-        <w:t xml:space="preserve"> 的层因 </w:t>
+        <w:t xml:space="preserve"> 的那一层因为 </w:t>
       </w:r>
       <w:r>
         <w:rPr>
@@ -10550,7 +10550,7 @@
           <w:sz w:val="21"/>
           <w:szCs w:val="21"/>
         </w:rPr>
-        <w:t xml:space="preserve"> 而在 N 中整列为零，精确出列，所得阈值与相应单层值逐位相同：一条高门槛渠道不改变爆发与否，只改变爆发规模。</w:t>
+        <w:t xml:space="preserve">，在 N 里整列都是零、精确地出了列，算出来的阈值和对应单层的值逐位相同：一条高门槛的渠道并不改变爆不爆发，它只改变爆发的规模。</w:t>
       </w:r>
     </w:p>
     <w:p>
@@ -10577,7 +10577,7 @@
           <w:sz w:val="21"/>
           <w:szCs w:val="21"/>
         </w:rPr>
-        <w:t xml:space="preserve">闭合的亚临界终态与 (2.8) 的解析值不共享代码——一侧积分非线性方程组，另一侧求一个矩阵逆。以均匀播种写出 </w:t>
+        <w:t xml:space="preserve">闭合的亚临界终态和 (2.8) 的解析值不共享代码——一边积分非线性方程组，另一边求一个矩阵的逆。用均匀播种写出 </w:t>
       </w:r>
       <w:r>
         <w:rPr>
@@ -10765,7 +10765,7 @@
           <w:sz w:val="21"/>
           <w:szCs w:val="21"/>
         </w:rPr>
-        <w:t xml:space="preserve">，二者的相对差随 ε 单调下降：ε 依次取 </w:t>
+        <w:t xml:space="preserve">，两者的相对差随 ε 单调下降：ε 依次取 </w:t>
       </w:r>
       <w:r>
         <w:rPr>
@@ -10877,7 +10877,7 @@
           <w:sz w:val="21"/>
           <w:szCs w:val="21"/>
         </w:rPr>
-        <w:t xml:space="preserve"> 与 </w:t>
+        <w:t xml:space="preserve"> 和 </w:t>
       </w:r>
       <w:r>
         <w:rPr>
@@ -10905,7 +10905,7 @@
           <w:sz w:val="21"/>
           <w:szCs w:val="21"/>
         </w:rPr>
-        <w:t xml:space="preserve"> 时，相对差依次为 </w:t>
+        <w:t xml:space="preserve"> 时，相对差依次是 </w:t>
       </w:r>
       <w:r>
         <w:rPr>
@@ -11017,7 +11017,7 @@
           <w:sz w:val="21"/>
           <w:szCs w:val="21"/>
         </w:rPr>
-        <w:t xml:space="preserve"> 与 </w:t>
+        <w:t xml:space="preserve"> 和 </w:t>
       </w:r>
       <w:r>
         <w:rPr>
@@ -11045,7 +11045,7 @@
           <w:sz w:val="21"/>
           <w:szCs w:val="21"/>
         </w:rPr>
-        <w:t xml:space="preserve">。这证实闭合的亚临界终态在 </w:t>
+        <w:t xml:space="preserve">。这就证实了，闭合的亚临界终态在 </w:t>
       </w:r>
       <w:r>
         <w:rPr>
@@ -11063,7 +11063,7 @@
           <w:sz w:val="21"/>
           <w:szCs w:val="21"/>
         </w:rPr>
-        <w:t xml:space="preserve"> 极限下即为 (2.8)，其极点严格位于 </w:t>
+        <w:t xml:space="preserve"> 的极限下就是 (2.8)，它的极点严格落在 </w:t>
       </w:r>
       <w:r>
         <w:rPr>
@@ -11081,7 +11081,7 @@
           <w:sz w:val="21"/>
           <w:szCs w:val="21"/>
         </w:rPr>
-        <w:t xml:space="preserve">。终态本身亦已收敛：在 </w:t>
+        <w:t xml:space="preserve">。终态本身也已经收敛：在 </w:t>
       </w:r>
       <w:r>
         <w:rPr>
@@ -11156,7 +11156,7 @@
           <w:sz w:val="21"/>
           <w:szCs w:val="21"/>
         </w:rPr>
-        <w:t xml:space="preserve"> 上 χ 逐位不变，残余的激活且未传递质量在 </w:t>
+        <w:t xml:space="preserve"> 上 χ 逐位不变，剩下那点激活了、却没传递的质量在 </w:t>
       </w:r>
       <w:r>
         <w:rPr>
@@ -11211,7 +11211,7 @@
           <w:sz w:val="21"/>
           <w:szCs w:val="21"/>
         </w:rPr>
-        <w:t xml:space="preserve">级联递推 (2.5) 由单群体的直接 Gillespie 抽样独立复核，该检验既不使用方程组也不使用次代矩阵。在 </w:t>
+        <w:t xml:space="preserve">级联递推 (2.5) 还由单群体的直接 Gillespie 抽样独立复核了一遍，这个检验既不用方程组、也不用次代矩阵。在 </w:t>
       </w:r>
       <w:r>
         <w:rPr>
@@ -11257,7 +11257,7 @@
           <w:sz w:val="21"/>
           <w:szCs w:val="21"/>
         </w:rPr>
-        <w:t xml:space="preserve"> 次实现给出的估计与递推值一致，偏离多在一个统计标准误以内；其中 </w:t>
+        <w:t xml:space="preserve"> 次实现给出的估计和递推值一致，偏离大多在一个统计标准误以内；其中 </w:t>
       </w:r>
       <w:r>
         <w:rPr>
@@ -11275,7 +11275,7 @@
           <w:sz w:val="21"/>
           <w:szCs w:val="21"/>
         </w:rPr>
-        <w:t xml:space="preserve"> 一组初次测得 3.4σ，以 </w:t>
+        <w:t xml:space="preserve"> 那一组初次测出 3.4σ，改用 </w:t>
       </w:r>
       <w:r>
         <w:rPr>
@@ -11303,7 +11303,7 @@
           <w:sz w:val="21"/>
           <w:szCs w:val="21"/>
         </w:rPr>
-        <w:t xml:space="preserve"> 次实现、四个独立随机种子复测后分别为 0.64σ、0.74σ、1.12σ 与 1.03σ，确认该偏离纯属统计涨落而非递推的系统误差。作为整体行为的旁证，</w:t>
+        <w:t xml:space="preserve"> 次实现、四个独立随机种子复测之后，分别是 0.64σ、0.74σ、1.12σ 和 1.03σ，确认这个偏离纯粹是统计涨落，而不是递推的系统误差。作为整体行为的一个旁证，</w:t>
       </w:r>
       <w:r>
         <w:rPr>
@@ -11321,7 +11321,7 @@
           <w:sz w:val="21"/>
           <w:szCs w:val="21"/>
         </w:rPr>
-        <w:t xml:space="preserve"> 在扫描区间上严格单调递增（由 0.207 增至 2.715），二分因而适定；而以 </w:t>
+        <w:t xml:space="preserve"> 在扫描区间上严格单调递增（从 0.207 一直增到 2.715），二分因此是适定的；而拿 </w:t>
       </w:r>
       <w:r>
         <w:rPr>
@@ -11339,7 +11339,7 @@
           <w:sz w:val="21"/>
           <w:szCs w:val="21"/>
         </w:rPr>
-        <w:t xml:space="preserve"> 跨越阈值积分时，</w:t>
+        <w:t xml:space="preserve"> 跨过阈值去积分时，</w:t>
       </w:r>
       <w:r>
         <w:rPr>
@@ -11357,7 +11357,7 @@
           <w:sz w:val="21"/>
           <w:szCs w:val="21"/>
         </w:rPr>
-        <w:t xml:space="preserve"> 在阈值以下保持 </w:t>
+        <w:t xml:space="preserve"> 在阈值以下维持 </w:t>
       </w:r>
       <w:r>
         <w:rPr>
@@ -11375,7 +11375,7 @@
           <w:sz w:val="21"/>
           <w:szCs w:val="21"/>
         </w:rPr>
-        <w:t xml:space="preserve"> 量级、在阈值以上抬升为 </w:t>
+        <w:t xml:space="preserve"> 量级、到阈值以上就抬成 </w:t>
       </w:r>
       <w:r>
         <w:rPr>
@@ -11409,7 +11409,7 @@
           <w:sz w:val="21"/>
           <w:szCs w:val="21"/>
         </w:rPr>
-        <w:t xml:space="preserve">综上，由亚临界终态外推测得的 </w:t>
+        <w:t xml:space="preserve">这四层校验合起来看：由亚临界终态外推测得的 </w:t>
       </w:r>
       <w:r>
         <w:rPr>
@@ -11437,7 +11437,7 @@
           <w:sz w:val="21"/>
           <w:szCs w:val="21"/>
         </w:rPr>
-        <w:t xml:space="preserve"> 与 </w:t>
+        <w:t xml:space="preserve">，和 </w:t>
       </w:r>
       <w:r>
         <w:rPr>
@@ -11483,7 +11483,7 @@
           <w:sz w:val="21"/>
           <w:szCs w:val="21"/>
         </w:rPr>
-        <w:t xml:space="preserve">、偏离最大者 1.51σ。这是对爆发阈值的一次全非线性的独立确认，与前述 Jacobian 复核互补——后者检验线性化谱，前者检验非线性终态所继承的同一阈值。</w:t>
+        <w:t xml:space="preserve">、偏离最大 1.51σ。这是对爆发阈值的一次全非线性的独立确认，和前面的 Jacobian 复核正好互补——后者检验的是线性化的谱，前者检验的是非线性终态所继承的同一个阈值。</w:t>
       </w:r>
     </w:p>
     <w:sectPr>

</xml_diff>

<commit_message>
Manuscript prose: second de-AI pass for rhythm and variety
Follow-up pass targeting the uniformity the first pass left behind: cut a
redundant summary sentence, de-duplicate repeated connectives (drop a second
"这说明", replace a template "这样一来…就"), thin over-stacked particles, smooth
two awkward closers, and vary register/rhythm. Meaning, academic stance, all
mathematics, statistics, and citations remain byte-for-byte unchanged.

Co-Authored-By: Claude Opus 4.8 <noreply@anthropic.com>
Claude-Session: https://claude.ai/code/session_01GMqZS1ZXii3SRe677Qn7Mk
</commit_message>
<xml_diff>
--- a/multiplex-hypergraph-sir/combined_cn.docx
+++ b/multiplex-hypergraph-sir/combined_cn.docx
@@ -1015,7 +1015,7 @@
           <w:sz w:val="21"/>
           <w:szCs w:val="21"/>
         </w:rPr>
-        <w:t xml:space="preserve"> 是跨层共享的——一个个体只要在任一条渠道里被感染，它在所有渠道里就都算感染态。记层 a 的群体 e 里已经感染的成员数为 </w:t>
+        <w:t xml:space="preserve"> 是跨层共享的——一个个体只要在任一条渠道里被感染，它在所有渠道里也都是感染态。记层 a 的群体 e 里已经感染的成员数为 </w:t>
       </w:r>
       <w:r>
         <w:rPr>
@@ -4014,7 +4014,7 @@
           <w:sz w:val="21"/>
           <w:szCs w:val="21"/>
         </w:rPr>
-        <w:t xml:space="preserve"> 上的最大偏差分别是 0.0019 和 0.0006，都比图里的线宽还小；感染峰高相差大约 0.3%，峰位在 </w:t>
+        <w:t xml:space="preserve"> 上的最大偏差分别是 0.0019 和 0.0006，都比图里的线宽还小；感染峰高只差大约 0.3%，峰位同在 </w:t>
       </w:r>
       <w:r>
         <w:rPr>
@@ -4032,7 +4032,7 @@
           <w:sz w:val="21"/>
           <w:szCs w:val="21"/>
         </w:rPr>
-        <w:t xml:space="preserve">。可以说，闭合把完整的含时演化都复现了下来。</w:t>
+        <w:t xml:space="preserve">。</w:t>
       </w:r>
     </w:p>
     <w:p>
@@ -4564,7 +4564,7 @@
           <w:sz w:val="21"/>
           <w:szCs w:val="21"/>
         </w:rPr>
-        <w:t xml:space="preserve">，相邻比大约是 16），和四阶 Runge–Kutta 的阶一致，这说明该恒等式是方程组的严格推论、残差纯粹是积分误差。</w:t>
+        <w:t xml:space="preserve">，相邻比大约是 16），和四阶 Runge–Kutta 的阶一致——这条恒等式是方程组的严格推论，残差纯粹是积分误差。</w:t>
       </w:r>
     </w:p>
     <w:p>
@@ -6507,7 +6507,7 @@
           <w:sz w:val="21"/>
           <w:szCs w:val="21"/>
         </w:rPr>
-        <w:t xml:space="preserve">分支过程必须定义在群体这个层面上：每个新感染的节点，去点燃它剩下的各个群体，每个被点燃的群体又产出 C 个新的感染成员，这些成员再去点燃各自剩下的群体。要是改在节点层面上、傻乎乎地统计谁直接传染了谁，群内级联的后继就会被重复算进去。把</w:t>
+        <w:t xml:space="preserve">分支过程必须定义在群体这个层面上：每个新感染的节点，去点燃它剩下的各个群体，每个被点燃的群体又产出 C 个新的感染成员，这些成员再去点燃各自剩下的群体。要是改在节点层面上、草率地统计谁直接传染了谁，群内级联的后继就会被重复算进去。把</w:t>
       </w:r>
       <w:r>
         <w:rPr>
@@ -7120,7 +7120,7 @@
           <w:sz w:val="21"/>
           <w:szCs w:val="21"/>
         </w:rPr>
-        <w:t xml:space="preserve"> 恰好就是孤立层 a 的分支数：这样一来，多重超图的阈值就不会高于任何一个单层的阈值。</w:t>
+        <w:t xml:space="preserve"> 恰好就是孤立层 a 的分支数：于是多重超图的阈值不会高于任何一个单层的阈值。</w:t>
       </w:r>
     </w:p>
     <w:p>
@@ -7881,7 +7881,7 @@
           <w:sz w:val="21"/>
           <w:szCs w:val="21"/>
         </w:rPr>
-        <w:t xml:space="preserve">。效果直接就能读出来：在几个有代表性的构型上，不做外推时零点一律偏高 0.37%–0.44%，做完外推降到 0.031%–0.065%。偏置的系统性（各构型同号、量级也相当）和这个修正管不管用，就同时确认了。</w:t>
+        <w:t xml:space="preserve">。效果直接就能读出来：在几个有代表性的构型上，不做外推时零点一律偏高 0.37%–0.44%，做完外推降到 0.031%–0.065%。偏置的系统性（各构型同号、量级相当）、以及这个修正确实管用，两点就此一并确认。</w:t>
       </w:r>
     </w:p>
     <w:p>
@@ -9346,7 +9346,7 @@
           <w:sz w:val="21"/>
           <w:szCs w:val="21"/>
         </w:rPr>
-        <w:t xml:space="preserve"> 上都把这条曲线复现了出来，偏离最大 1.9σ、相对差不超过 1.1%。更关键的是那背后的机制：同一批节点在两层同时当枢纽，就会在边缘结构没变的情况下，把跨层传播能力集中起来、压低阈值；反相关则把阈值抬高。</w:t>
+        <w:t xml:space="preserve"> 上都把这条曲线复现了出来，偏离最大 1.9σ、相对差不超过 1.1%。更值得说的是它背后的机制：同一批节点在两层同时当枢纽，会在边缘结构没变的情况下把跨层传播能力集中起来、压低阈值；反相关则把阈值抬高。</w:t>
       </w:r>
     </w:p>
     <w:p>

</xml_diff>

<commit_message>
Manuscript prose: recalibrate register, strip demonstrative scaffolding
Two corrections to the de-AI passes: (1) restore concise formal phrasing where
a sentence is a definition or a result statement, rather than forcing colloquial
throughout; (2) remove the demonstrative-pronoun scaffolding (这条/这点/这个/这就/
就此/这两条/这四层/这里/那个…) that itself reads as machine-written -- counts drop
to near zero. Figure 3 and 4 captions likewise moved from 是...是...是 to the
standard 为/即 caption register. Every Cambria-Math formula run is byte-identical
to the previous version (762 tokens, verified), and all statistics and citations
are unchanged.

Co-Authored-By: Claude Opus 4.8 <noreply@anthropic.com>
Claude-Session: https://claude.ai/code/session_01GMqZS1ZXii3SRe677Qn7Mk
</commit_message>
<xml_diff>
--- a/multiplex-hypergraph-sir/combined_cn.docx
+++ b/multiplex-hypergraph-sir/combined_cn.docx
@@ -66,7 +66,7 @@
           <w:sz w:val="21"/>
           <w:szCs w:val="21"/>
         </w:rPr>
-        <w:t xml:space="preserve">本模型有三个要素，都画在了图 1 里：多重超图和层度 (a)、单个群体内部的级联 (b)，还有群体层面的分支 (c)。</w:t>
+        <w:t xml:space="preserve">本模型的三个要素示于图 1：多重超图和层度 (a)、单个群体内部的级联 (b)，以及群体层面的分支 (c)。</w:t>
       </w:r>
     </w:p>
     <w:p>
@@ -158,7 +158,7 @@
           <w:sz w:val="18"/>
           <w:szCs w:val="18"/>
         </w:rPr>
-        <w:t xml:space="preserve"> 是递推所用的计数，它的规模 </w:t>
+        <w:t xml:space="preserve"> 为递推所用的计数，其规模 </w:t>
       </w:r>
       <w:r>
         <w:rPr>
@@ -240,7 +240,7 @@
           <w:sz w:val="18"/>
           <w:szCs w:val="18"/>
         </w:rPr>
-        <w:t xml:space="preserve"> 出列，所以 </w:t>
+        <w:t xml:space="preserve"> 出列，故 </w:t>
       </w:r>
       <w:r>
         <w:rPr>
@@ -315,7 +315,7 @@
           <w:sz w:val="18"/>
           <w:szCs w:val="18"/>
         </w:rPr>
-        <w:t xml:space="preserve">，这个减法只在同层 </w:t>
+        <w:t xml:space="preserve">，减法仅在同层 </w:t>
       </w:r>
       <w:r>
         <w:rPr>
@@ -333,7 +333,7 @@
           <w:sz w:val="18"/>
           <w:szCs w:val="18"/>
         </w:rPr>
-        <w:t xml:space="preserve"> 时才生效。</w:t>
+        <w:t xml:space="preserve"> 生效。</w:t>
       </w:r>
     </w:p>
     <w:p>
@@ -403,7 +403,7 @@
           <w:sz w:val="21"/>
           <w:szCs w:val="21"/>
         </w:rPr>
-        <w:t xml:space="preserve">，每一层 a 都是 V 上的一个超图 </w:t>
+        <w:t xml:space="preserve">，层 a 是 V 上的超图 </w:t>
       </w:r>
       <w:r>
         <w:rPr>
@@ -543,7 +543,7 @@
           <w:sz w:val="21"/>
           <w:szCs w:val="21"/>
         </w:rPr>
-        <w:t xml:space="preserve">，写成向量就是 </w:t>
+        <w:t xml:space="preserve">，写成向量 </w:t>
       </w:r>
       <w:r>
         <w:rPr>
@@ -561,7 +561,7 @@
           <w:sz w:val="21"/>
           <w:szCs w:val="21"/>
         </w:rPr>
-        <w:t xml:space="preserve">。这里引入两个生成函数：</w:t>
+        <w:t xml:space="preserve">。引入两个生成函数：</w:t>
       </w:r>
     </w:p>
     <w:p>
@@ -825,7 +825,7 @@
           <w:sz w:val="21"/>
           <w:szCs w:val="21"/>
         </w:rPr>
-        <w:t xml:space="preserve"> 管节点侧，</w:t>
+        <w:t xml:space="preserve"> 描述节点侧，</w:t>
       </w:r>
       <w:r>
         <w:rPr>
@@ -853,7 +853,7 @@
           <w:sz w:val="21"/>
           <w:szCs w:val="21"/>
         </w:rPr>
-        <w:t xml:space="preserve"> 管的是沿层 a 的一个成员槽到达某个节点时、这个节点的余度分布，指数里的 </w:t>
+        <w:t xml:space="preserve"> 描述沿层 a 的一个成员槽到达某节点时该节点的余度分布，指数中的 </w:t>
       </w:r>
       <w:r>
         <w:rPr>
@@ -881,7 +881,7 @@
           <w:sz w:val="21"/>
           <w:szCs w:val="21"/>
         </w:rPr>
-        <w:t xml:space="preserve"> 就是余度相减：来路的那个群体不再算进去。联合层度分布 </w:t>
+        <w:t xml:space="preserve"> 即余度相减：来路那个群体不再计入。联合层度分布 </w:t>
       </w:r>
       <w:r>
         <w:rPr>
@@ -899,7 +899,7 @@
           <w:sz w:val="21"/>
           <w:szCs w:val="21"/>
         </w:rPr>
-        <w:t xml:space="preserve"> 是本模型的结构输入，层和层之间的一切效应，最后都只通过 </w:t>
+        <w:t xml:space="preserve"> 是本模型的结构输入，层间的一切效应最终只经由 </w:t>
       </w:r>
       <w:r>
         <w:rPr>
@@ -1015,7 +1015,7 @@
           <w:sz w:val="21"/>
           <w:szCs w:val="21"/>
         </w:rPr>
-        <w:t xml:space="preserve"> 是跨层共享的——一个个体只要在任一条渠道里被感染，它在所有渠道里也都是感染态。记层 a 的群体 e 里已经感染的成员数为 </w:t>
+        <w:t xml:space="preserve"> 跨层共享——个体在任一渠道被感染即在所有渠道中都为感染态。记层 a 的群体 e 中已感染成员数为 </w:t>
       </w:r>
       <w:r>
         <w:rPr>
@@ -1099,7 +1099,7 @@
           <w:sz w:val="21"/>
           <w:szCs w:val="21"/>
         </w:rPr>
-        <w:t xml:space="preserve"> 时群体激活，向 e 里每个易感成员各以速率 </w:t>
+        <w:t xml:space="preserve"> 时群体激活，向 e 中每个易感成员各以速率 </w:t>
       </w:r>
       <w:r>
         <w:rPr>
@@ -1127,7 +1127,7 @@
           <w:sz w:val="21"/>
           <w:szCs w:val="21"/>
         </w:rPr>
-        <w:t xml:space="preserve"> 独立传递，否则就静默着；感染者以速率 </w:t>
+        <w:t xml:space="preserve"> 独立传递，否则静默；感染者以速率 </w:t>
       </w:r>
       <w:r>
         <w:rPr>
@@ -1145,7 +1145,7 @@
           <w:sz w:val="21"/>
           <w:szCs w:val="21"/>
         </w:rPr>
-        <w:t xml:space="preserve"> 康复。易感节点 u 的总风险率是</w:t>
+        <w:t xml:space="preserve"> 康复。易感节点 u 的总风险率为</w:t>
       </w:r>
     </w:p>
     <w:p>
@@ -1308,7 +1308,7 @@
           <w:sz w:val="21"/>
           <w:szCs w:val="21"/>
         </w:rPr>
-        <w:t xml:space="preserve">把时间以 </w:t>
+        <w:t xml:space="preserve">以 </w:t>
       </w:r>
       <w:r>
         <w:rPr>
@@ -1326,7 +1326,7 @@
           <w:sz w:val="21"/>
           <w:szCs w:val="21"/>
         </w:rPr>
-        <w:t xml:space="preserve"> 归一，</w:t>
+        <w:t xml:space="preserve"> 归一时间，</w:t>
       </w:r>
       <w:r>
         <w:rPr>
@@ -1419,7 +1419,7 @@
           <w:sz w:val="21"/>
           <w:szCs w:val="21"/>
         </w:rPr>
-        <w:t xml:space="preserve">。初始时刻，每个节点各自独立地以概率 </w:t>
+        <w:t xml:space="preserve">。初始时刻每个节点独立地以概率 </w:t>
       </w:r>
       <w:r>
         <w:rPr>
@@ -1437,7 +1437,7 @@
           <w:sz w:val="21"/>
           <w:szCs w:val="21"/>
         </w:rPr>
-        <w:t xml:space="preserve"> 处在感染态、其余易感，</w:t>
+        <w:t xml:space="preserve"> 处于感染态、其余易感，</w:t>
       </w:r>
       <w:r>
         <w:rPr>
@@ -1455,7 +1455,7 @@
           <w:sz w:val="21"/>
           <w:szCs w:val="21"/>
         </w:rPr>
-        <w:t xml:space="preserve"> 就是均匀的初始感染比例。和有向超图不一样，无向群体里每个成员既是传染源、也是传染靶：一个成员被感染后群体就激活了，它能去感染同群的其他成员，后者被感染又把群体的激活时长拖长，这样就形成了群内级联。本模型里新的内容，都是从这一点来的。</w:t>
+        <w:t xml:space="preserve"> 即均匀初始感染比例。和有向超图不同，无向群体中每个成员既是传染源也是传染靶：一个成员被感染后群体激活，可感染同群其他成员，后者被感染又延长群体的激活时长，形成群内级联。本模型的新内容都源于此。</w:t>
       </w:r>
     </w:p>
     <w:p>
@@ -1488,7 +1488,7 @@
           <w:sz w:val="21"/>
           <w:szCs w:val="21"/>
         </w:rPr>
-        <w:t xml:space="preserve">固定一个检验节点 u，让它永久保持易感（也就是空腔节点）。取一个 u 所属的层 a 群体 e，定义边基变量</w:t>
+        <w:t xml:space="preserve">固定一个检验节点 u，令其永久易感（空腔节点）。取一个 u 所属的层 a 群体 e，定义边基变量</w:t>
       </w:r>
     </w:p>
     <w:p>
@@ -1555,7 +1555,7 @@
           <w:sz w:val="21"/>
           <w:szCs w:val="21"/>
         </w:rPr>
-        <w:t xml:space="preserve"> 时刻还没向 </w:t>
+        <w:t xml:space="preserve"> 时刻尚未向 </w:t>
       </w:r>
       <w:r>
         <w:rPr>
@@ -1610,7 +1610,7 @@
           <w:sz w:val="21"/>
           <w:szCs w:val="21"/>
         </w:rPr>
-        <w:t xml:space="preserve">在局域树状假设下（位形模型系综在 </w:t>
+        <w:t xml:space="preserve">在局域树状假设下（位形模型系综 </w:t>
       </w:r>
       <w:r>
         <w:rPr>
@@ -1628,7 +1628,7 @@
           <w:sz w:val="21"/>
           <w:szCs w:val="21"/>
         </w:rPr>
-        <w:t xml:space="preserve"> 时局域收敛到超树，回路概率是 </w:t>
+        <w:t xml:space="preserve"> 时局域收敛于超树，回路概率 </w:t>
       </w:r>
       <w:r>
         <w:rPr>
@@ -1646,7 +1646,7 @@
           <w:sz w:val="21"/>
           <w:szCs w:val="21"/>
         </w:rPr>
-        <w:t xml:space="preserve">），u 所属的各个群体、它们的上游分支互不相交，节点侧于是就闭合成了</w:t>
+        <w:t xml:space="preserve">），u 所属各群体的上游分支互不相交，节点侧因而闭合为</w:t>
       </w:r>
     </w:p>
     <w:p>
@@ -1733,7 +1733,7 @@
           <w:sz w:val="21"/>
           <w:szCs w:val="21"/>
         </w:rPr>
-        <w:t xml:space="preserve">拿 e 里除 u 之外那 </w:t>
+        <w:t xml:space="preserve">以 e 除 u 外的 </w:t>
       </w:r>
       <w:r>
         <w:rPr>
@@ -1825,7 +1825,7 @@
           <w:sz w:val="21"/>
           <w:szCs w:val="21"/>
         </w:rPr>
-        <w:t xml:space="preserve">）当仓室，定义未传递子概率 </w:t>
+        <w:t xml:space="preserve">）为仓室，定义未传递子概率 </w:t>
       </w:r>
       <w:r>
         <w:rPr>
@@ -1872,7 +1872,7 @@
           <w:sz w:val="21"/>
           <w:szCs w:val="21"/>
         </w:rPr>
-        <w:t xml:space="preserve">，那么 </w:t>
+        <w:t xml:space="preserve">，则 </w:t>
       </w:r>
       <w:r>
         <w:rPr>
@@ -1929,7 +1929,7 @@
           <w:sz w:val="21"/>
           <w:szCs w:val="21"/>
         </w:rPr>
-        <w:t xml:space="preserve">，其中激活了、却还没传递出去的那部分是</w:t>
+        <w:t xml:space="preserve">，激活且未传递的部分为</w:t>
       </w:r>
     </w:p>
     <w:p>
@@ -2055,7 +2055,7 @@
           <w:sz w:val="21"/>
           <w:szCs w:val="21"/>
         </w:rPr>
-        <w:t xml:space="preserve">一个成员通过别的群体、到 t 时刻还保持易感的概率是 </w:t>
+        <w:t xml:space="preserve">一个成员经由其他群体到 t 仍易感的概率为 </w:t>
       </w:r>
       <w:r>
         <w:rPr>
@@ -2092,7 +2092,7 @@
           <w:sz w:val="21"/>
           <w:szCs w:val="21"/>
         </w:rPr>
-        <w:t xml:space="preserve">，所以它的外部风险率是</w:t>
+        <w:t xml:space="preserve">，故其外部风险率</w:t>
       </w:r>
     </w:p>
     <w:p>
@@ -2303,7 +2303,7 @@
           <w:sz w:val="21"/>
           <w:szCs w:val="21"/>
         </w:rPr>
-        <w:t xml:space="preserve">一个易感成员的总感染率，是外部和群内两块之和 </w:t>
+        <w:t xml:space="preserve">一个易感成员的总感染率是外部和群内之和 </w:t>
       </w:r>
       <w:r>
         <w:rPr>
@@ -2378,7 +2378,7 @@
           <w:sz w:val="21"/>
           <w:szCs w:val="21"/>
         </w:rPr>
-        <w:t xml:space="preserve">；而群体向 u 的传递，以速率 </w:t>
+        <w:t xml:space="preserve">；群体向 u 的传递以速率 </w:t>
       </w:r>
       <w:r>
         <w:rPr>
@@ -2434,7 +2434,7 @@
           <w:sz w:val="21"/>
           <w:szCs w:val="21"/>
         </w:rPr>
-        <w:t xml:space="preserve"> 把概率移出「未传递」这一类。据此可以写出</w:t>
+        <w:t xml:space="preserve"> 把概率移出「未传递」类。据此</w:t>
       </w:r>
     </w:p>
     <w:p>
@@ -2811,7 +2811,7 @@
           <w:sz w:val="21"/>
           <w:szCs w:val="21"/>
         </w:rPr>
-        <w:t xml:space="preserve">（越界的下标都记为零。）把 (1.8) 逐项求和，</w:t>
+        <w:t xml:space="preserve">（越界下标记为零。）对 (1.8) 求和，</w:t>
       </w:r>
       <w:r>
         <w:rPr>
@@ -2857,7 +2857,7 @@
           <w:sz w:val="21"/>
           <w:szCs w:val="21"/>
         </w:rPr>
-        <w:t xml:space="preserve"> 项各自守恒、两两相消，最后只剩下</w:t>
+        <w:t xml:space="preserve"> 项各自守恒相消，只余</w:t>
       </w:r>
     </w:p>
     <w:p>
@@ -2964,7 +2964,7 @@
           <w:sz w:val="21"/>
           <w:szCs w:val="21"/>
         </w:rPr>
-        <w:t xml:space="preserve">这和 (1.7) 自洽。初始条件 </w:t>
+        <w:t xml:space="preserve">和 (1.7) 自洽。初始条件 </w:t>
       </w:r>
       <w:r>
         <w:rPr>
@@ -3059,7 +3059,7 @@
           <w:sz w:val="21"/>
           <w:szCs w:val="21"/>
         </w:rPr>
-        <w:t xml:space="preserve">，其余都是零，</w:t>
+        <w:t xml:space="preserve">，其余为零，</w:t>
       </w:r>
       <w:r>
         <w:rPr>
@@ -3096,7 +3096,7 @@
           <w:sz w:val="21"/>
           <w:szCs w:val="21"/>
         </w:rPr>
-        <w:t xml:space="preserve">。闭合方程组只含各层的群体计数，一共 </w:t>
+        <w:t xml:space="preserve">。闭合方程组只含各层的群体计数，共 </w:t>
       </w:r>
       <w:r>
         <w:rPr>
@@ -3188,7 +3188,7 @@
           <w:sz w:val="21"/>
           <w:szCs w:val="21"/>
         </w:rPr>
-        <w:t xml:space="preserve"> 时就是 16 个；节点侧的 S 由 (1.5) 代数地给出，终态规模 </w:t>
+        <w:t xml:space="preserve"> 时为 16 个；节点侧的 S 由 (1.5) 代数给出，终态规模 </w:t>
       </w:r>
       <w:r>
         <w:rPr>
@@ -3206,7 +3206,7 @@
           <w:sz w:val="21"/>
           <w:szCs w:val="21"/>
         </w:rPr>
-        <w:t xml:space="preserve"> 直接读出来就行，这两样都不增加维数。要是想把完整时间演化里的 </w:t>
+        <w:t xml:space="preserve"> 直接读出，二者都不增维。欲绘出完整时间演化中的 </w:t>
       </w:r>
       <w:r>
         <w:rPr>
@@ -3242,7 +3242,7 @@
           <w:sz w:val="21"/>
           <w:szCs w:val="21"/>
         </w:rPr>
-        <w:t xml:space="preserve"> 也画出来（图 2），只要再加一个求积 </w:t>
+        <w:t xml:space="preserve">（图 2），再附一个求积 </w:t>
       </w:r>
       <w:r>
         <w:rPr>
@@ -3278,7 +3278,7 @@
           <w:sz w:val="21"/>
           <w:szCs w:val="21"/>
         </w:rPr>
-        <w:t xml:space="preserve">）把它们分开就够了，这一步并不改变闭合本身的维数。</w:t>
+        <w:t xml:space="preserve">）分离即可，它不改变闭合本身的维数。</w:t>
       </w:r>
     </w:p>
     <w:p>
@@ -3311,7 +3311,7 @@
           <w:sz w:val="21"/>
           <w:szCs w:val="21"/>
         </w:rPr>
-        <w:t xml:space="preserve">把「感染是经由哪一层传来的」当作型，那么经由层 a 感染的节点、它的层 b 群体数的期望就是 </w:t>
+        <w:t xml:space="preserve">按「感染经由哪一层传来」分型，经由层 a 感染的节点其层 b 群体数的期望为 </w:t>
       </w:r>
       <w:r>
         <w:rPr>
@@ -3396,7 +3396,7 @@
           <w:sz w:val="21"/>
           <w:szCs w:val="21"/>
         </w:rPr>
-        <w:t xml:space="preserve">，而每个被点燃的群体又产出 </w:t>
+        <w:t xml:space="preserve">，每个被点燃的群体产出 </w:t>
       </w:r>
       <w:r>
         <w:rPr>
@@ -3471,7 +3471,7 @@
           <w:sz w:val="21"/>
           <w:szCs w:val="21"/>
         </w:rPr>
-        <w:t xml:space="preserve"> 个新的感染成员（C 是孤立群体内部群内级联的期望，由一个小型连续时间 Markov 链的递推算出来，</w:t>
+        <w:t xml:space="preserve"> 个新感染成员（C 为孤立群体内的群内级联期望，由一个小型连续时间 Markov 链的递推给出，</w:t>
       </w:r>
       <w:r>
         <w:rPr>
@@ -3489,7 +3489,7 @@
           <w:sz w:val="21"/>
           <w:szCs w:val="21"/>
         </w:rPr>
-        <w:t xml:space="preserve"> 时就退化成了成对传递概率）。所以，多型分支矩阵是</w:t>
+        <w:t xml:space="preserve"> 时退化为成对传递概率）。故多型分支矩阵</w:t>
       </w:r>
     </w:p>
     <w:p>
@@ -3708,7 +3708,7 @@
           <w:sz w:val="21"/>
           <w:szCs w:val="21"/>
         </w:rPr>
-        <w:t xml:space="preserve"> 定出来。图 2 里的控制参数 </w:t>
+        <w:t xml:space="preserve"> 确定。图 2 的控制参数 </w:t>
       </w:r>
       <w:r>
         <w:rPr>
@@ -3726,7 +3726,7 @@
           <w:sz w:val="21"/>
           <w:szCs w:val="21"/>
         </w:rPr>
-        <w:t xml:space="preserve">，就是拿这个阈值 </w:t>
+        <w:t xml:space="preserve"> 即以此阈值 </w:t>
       </w:r>
       <w:r>
         <w:rPr>
@@ -3754,7 +3754,7 @@
           <w:sz w:val="21"/>
           <w:szCs w:val="21"/>
         </w:rPr>
-        <w:t xml:space="preserve"> 来定标的。</w:t>
+        <w:t xml:space="preserve"> 定标。</w:t>
       </w:r>
     </w:p>
     <w:p>
@@ -3787,7 +3787,7 @@
           <w:sz w:val="21"/>
           <w:szCs w:val="21"/>
         </w:rPr>
-        <w:t xml:space="preserve">闭合方程组不光给出阈值，也能把整个传播过程复现出来。图 2 画的是 </w:t>
+        <w:t xml:space="preserve">闭合方程组不仅给出阈值，也复现整个传播过程。图 2 给出 </w:t>
       </w:r>
       <w:r>
         <w:rPr>
@@ -4014,7 +4014,7 @@
           <w:sz w:val="21"/>
           <w:szCs w:val="21"/>
         </w:rPr>
-        <w:t xml:space="preserve"> 上的最大偏差分别是 0.0019 和 0.0006，都比图里的线宽还小；感染峰高只差大约 0.3%，峰位同在 </w:t>
+        <w:t xml:space="preserve"> 上的最大偏差分别为 0.0019 和 0.0006，都小于图中线宽；感染峰高相差约 0.3%，峰位 </w:t>
       </w:r>
       <w:r>
         <w:rPr>
@@ -4206,7 +4206,7 @@
           <w:sz w:val="18"/>
           <w:szCs w:val="18"/>
         </w:rPr>
-        <w:t xml:space="preserve">。实线为 400 次独立 Gillespie 实现的均值，灰带为 95% 置信区间，最宽处大约和线宽相当；虚线为群体闭合 (1.8)。(a) 易感比例 </w:t>
+        <w:t xml:space="preserve">。实线为 400 次独立 Gillespie 实现的均值，灰带为 95% 置信区间，最宽处约与线宽相当；虚线为群体闭合 (1.8)。(a) 易感比例 </w:t>
       </w:r>
       <w:r>
         <w:rPr>
@@ -4275,7 +4275,7 @@
           <w:sz w:val="21"/>
           <w:szCs w:val="21"/>
         </w:rPr>
-        <w:t xml:space="preserve">仿真用的是 (1.3) 所定义的那个连续时间 Markov 过程的精确 Gillespie 抽样，取 </w:t>
+        <w:t xml:space="preserve">仿真为 (1.3) 所定义连续时间 Markov 过程的精确 Gillespie 抽样，取 </w:t>
       </w:r>
       <w:r>
         <w:rPr>
@@ -4320,7 +4320,7 @@
           <w:sz w:val="21"/>
           <w:szCs w:val="21"/>
         </w:rPr>
-        <w:t xml:space="preserve">方程组自带两条不需要仿真的自检。其一是求和规则：对 (1.8) 逐态求和，应当严格给出 (1.9)，残差落在机器精度（</w:t>
+        <w:t xml:space="preserve">方程组自带两条不需要仿真的自检。其一为求和规则：对 (1.8) 逐态求和应严格给出 (1.9)，残差处于机器精度（</w:t>
       </w:r>
       <w:r>
         <w:rPr>
@@ -4348,7 +4348,7 @@
           <w:sz w:val="21"/>
           <w:szCs w:val="21"/>
         </w:rPr>
-        <w:t xml:space="preserve"> 量级），这说明它就是方程组的一条代数恒等式。其二是全体成员易感时的恒等式 </w:t>
+        <w:t xml:space="preserve"> 量级），说明它是方程组的代数恒等式。其二为全体成员易感的恒等式 </w:t>
       </w:r>
       <w:r>
         <w:rPr>
@@ -4424,7 +4424,7 @@
           <w:sz w:val="21"/>
           <w:szCs w:val="21"/>
         </w:rPr>
-        <w:t xml:space="preserve">，它的残差随积分步长按 </w:t>
+        <w:t xml:space="preserve">，其残差随积分步长按 </w:t>
       </w:r>
       <w:r>
         <w:rPr>
@@ -4564,7 +4564,7 @@
           <w:sz w:val="21"/>
           <w:szCs w:val="21"/>
         </w:rPr>
-        <w:t xml:space="preserve">，相邻比大约是 16），和四阶 Runge–Kutta 的阶一致——这条恒等式是方程组的严格推论，残差纯粹是积分误差。</w:t>
+        <w:t xml:space="preserve">，相邻比约 16），和四阶 Runge–Kutta 的阶一致——该恒等式是方程组的严格推论、残差纯属积分误差。</w:t>
       </w:r>
     </w:p>
     <w:p>
@@ -4591,7 +4591,7 @@
           <w:sz w:val="21"/>
           <w:szCs w:val="21"/>
         </w:rPr>
-        <w:t xml:space="preserve">阈值公式 (1.10) 还能和方程组自己在无病定态处的线性失稳做一次独立比对：把 (1.8) 取数值 Jacobian、对最大实部特征值二分求阈值，它和 </w:t>
+        <w:t xml:space="preserve">阈值公式 (1.10) 和方程组自身在无病定态的线性失稳独立比对：把 (1.8) 作数值 Jacobian、对最大实部特征值二分求阈值，和 </w:t>
       </w:r>
       <w:r>
         <w:rPr>
@@ -4609,7 +4609,7 @@
           <w:sz w:val="21"/>
           <w:szCs w:val="21"/>
         </w:rPr>
-        <w:t xml:space="preserve"> 在六组构型（含反相关度分布、非对称速率和群体规模、三层，还有成对退化情形 </w:t>
+        <w:t xml:space="preserve"> 在六组构型（含反相关度分布、非对称速率和群体规模、三层，以及成对退化情形 </w:t>
       </w:r>
       <w:r>
         <w:rPr>
@@ -4674,7 +4674,7 @@
           <w:sz w:val="21"/>
           <w:szCs w:val="21"/>
         </w:rPr>
-        <w:t xml:space="preserve"> 量级，这已经受限于数值失稳判据本身的分辨率了（Jacobian 用的是中心差分）。这两条路径并不共享代码；要是把群内级联 C 换成 </w:t>
+        <w:t xml:space="preserve"> 量级，受数值失稳判据的分辨率所限（Jacobian 取中心差分）。两条路径不共享代码；若以 </w:t>
       </w:r>
       <w:r>
         <w:rPr>
@@ -4692,7 +4692,7 @@
           <w:sz w:val="21"/>
           <w:szCs w:val="21"/>
         </w:rPr>
-        <w:t xml:space="preserve">，这个一致性立刻就没了。</w:t>
+        <w:t xml:space="preserve"> 取代群内级联 C，该一致性立即消失。</w:t>
       </w:r>
     </w:p>
     <w:p>
@@ -4719,7 +4719,7 @@
           <w:sz w:val="21"/>
           <w:szCs w:val="21"/>
         </w:rPr>
-        <w:t xml:space="preserve">像图 2 那样，群体闭合和精确仿真在整个时间演化上逐点吻合，</w:t>
+        <w:t xml:space="preserve">如图 2 所示，群体闭合和精确仿真在整个时间演化上逐点吻合，</w:t>
       </w:r>
       <w:r>
         <w:rPr>
@@ -4737,7 +4737,7 @@
           <w:sz w:val="21"/>
           <w:szCs w:val="21"/>
         </w:rPr>
-        <w:t xml:space="preserve">、</w:t>
+        <w:t xml:space="preserve"> 和 </w:t>
       </w:r>
       <w:r>
         <w:rPr>
@@ -4755,7 +4755,7 @@
           <w:sz w:val="21"/>
           <w:szCs w:val="21"/>
         </w:rPr>
-        <w:t xml:space="preserve"> 的最大偏差都比线宽还小（0.0019 和 0.0006），感染峰高相差大约 0.3%、峰位都落在 </w:t>
+        <w:t xml:space="preserve"> 的最大偏差都小于线宽（0.0019 和 0.0006），感染峰高相差约 0.3%、峰位都在 </w:t>
       </w:r>
       <w:r>
         <w:rPr>
@@ -4773,7 +4773,7 @@
           <w:sz w:val="21"/>
           <w:szCs w:val="21"/>
         </w:rPr>
-        <w:t xml:space="preserve">。仿真取 </w:t>
+        <w:t xml:space="preserve">。仿真为 </w:t>
       </w:r>
       <w:r>
         <w:rPr>
@@ -4791,7 +4791,7 @@
           <w:sz w:val="21"/>
           <w:szCs w:val="21"/>
         </w:rPr>
-        <w:t xml:space="preserve">、跑了 400 次独立实现（脚本 figure2_evolution.py，里面是带 Fenwick 树加速的精确 Gillespie）。剩下的那点偏差会随系统规模变大而单调趋零，是把系统放大就能抹掉的有限尺寸效应，而不是闭合层级上的系统偏差。</w:t>
+        <w:t xml:space="preserve">、400 次独立实现（脚本 figure2_evolution.py，含 Fenwick 树加速的精确 Gillespie）。残余偏差随系统规模增大而单调趋零，是可由增大系统消除的有限尺寸效应，而非闭合层级的系统偏差。</w:t>
       </w:r>
     </w:p>
     <w:p>
@@ -4818,7 +4818,7 @@
           <w:sz w:val="21"/>
           <w:szCs w:val="21"/>
         </w:rPr>
-        <w:t xml:space="preserve">上面这些结果，都是用和原推导不共享路径的办法复核过的：</w:t>
+        <w:t xml:space="preserve">上述结果都由和原推导不共享路径的方式复核：</w:t>
       </w:r>
       <w:r>
         <w:rPr>
@@ -4836,7 +4836,7 @@
           <w:sz w:val="21"/>
           <w:szCs w:val="21"/>
         </w:rPr>
-        <w:t xml:space="preserve">（成对）这个退化情形下，方程组可以解析地积出终态不动点，它和 RK4 积分给出的 </w:t>
+        <w:t xml:space="preserve">（成对）退化情形下方程组可解析积出终态不动点，与 RK4 积分的 </w:t>
       </w:r>
       <w:r>
         <w:rPr>
@@ -4854,7 +4854,7 @@
           <w:sz w:val="21"/>
           <w:szCs w:val="21"/>
         </w:rPr>
-        <w:t xml:space="preserve"> 只差 </w:t>
+        <w:t xml:space="preserve"> 相差 </w:t>
       </w:r>
       <w:r>
         <w:rPr>
@@ -4882,7 +4882,7 @@
           <w:sz w:val="21"/>
           <w:szCs w:val="21"/>
         </w:rPr>
-        <w:t xml:space="preserve">；群内级联 C 由孤立群体的直接蒙特卡洛来复核，十五组参数（</w:t>
+        <w:t xml:space="preserve">；群内级联 C 由孤立群体的直接蒙特卡洛复核，全部十五组参数（</w:t>
       </w:r>
       <w:r>
         <w:rPr>
@@ -4936,7 +4936,7 @@
           <w:sz w:val="21"/>
           <w:szCs w:val="21"/>
         </w:rPr>
-        <w:t xml:space="preserve">，和「没有系统偏差」相容；阈值本身也由亚临界终态外推独立测了一遍，同样和 (1.10) 的解析值相容。</w:t>
+        <w:t xml:space="preserve">，和「无系统偏差」相容；阈值本身亦由亚临界终态外推独立测得，和 (1.10) 的解析值相容。</w:t>
       </w:r>
     </w:p>
     <w:p>
@@ -5022,7 +5022,7 @@
           <w:sz w:val="21"/>
           <w:szCs w:val="21"/>
         </w:rPr>
-        <w:t xml:space="preserve">，每一层 a 都是 V 上的一个超图，主线取同质基数 </w:t>
+        <w:t xml:space="preserve">，层 a 是 V 上的超图，主线取同质基数 </w:t>
       </w:r>
       <w:r>
         <w:rPr>
@@ -5050,7 +5050,7 @@
           <w:sz w:val="21"/>
           <w:szCs w:val="21"/>
         </w:rPr>
-        <w:t xml:space="preserve">。节点的参与用层度向量 </w:t>
+        <w:t xml:space="preserve">。节点的参与由层度向量 </w:t>
       </w:r>
       <w:r>
         <w:rPr>
@@ -5106,7 +5106,7 @@
           <w:sz w:val="21"/>
           <w:szCs w:val="21"/>
         </w:rPr>
-        <w:t xml:space="preserve"> 来编码，</w:t>
+        <w:t xml:space="preserve"> 编码，</w:t>
       </w:r>
       <w:r>
         <w:rPr>
@@ -5134,7 +5134,7 @@
           <w:sz w:val="21"/>
           <w:szCs w:val="21"/>
         </w:rPr>
-        <w:t xml:space="preserve"> 就是这个节点所属的层 a 群体数，它们的联合分布 </w:t>
+        <w:t xml:space="preserve"> 为节点所属的层 a 群体数，其联合分布 </w:t>
       </w:r>
       <w:r>
         <w:rPr>
@@ -5152,7 +5152,7 @@
           <w:sz w:val="21"/>
           <w:szCs w:val="21"/>
         </w:rPr>
-        <w:t xml:space="preserve"> 是本节唯一的结构输入。一个群体，等它的感染成员数达到 </w:t>
+        <w:t xml:space="preserve"> 是本节唯一的结构输入。群体在其感染成员数达到 </w:t>
       </w:r>
       <w:r>
         <w:rPr>
@@ -5180,7 +5180,7 @@
           <w:sz w:val="21"/>
           <w:szCs w:val="21"/>
         </w:rPr>
-        <w:t xml:space="preserve"> 就激活，随即以速率 </w:t>
+        <w:t xml:space="preserve"> 时激活，随即以速率 </w:t>
       </w:r>
       <w:r>
         <w:rPr>
@@ -5236,7 +5236,7 @@
           <w:sz w:val="21"/>
           <w:szCs w:val="21"/>
         </w:rPr>
-        <w:t xml:space="preserve"> 向其中每个易感成员独立传递；感染者以速率 μ 康复。把时间以 μ 归一之后，</w:t>
+        <w:t xml:space="preserve"> 向其中每个易感成员独立传递；感染者以速率 μ 康复。以 μ 归一时间后，</w:t>
       </w:r>
       <w:r>
         <w:rPr>
@@ -5254,7 +5254,7 @@
           <w:sz w:val="21"/>
           <w:szCs w:val="21"/>
         </w:rPr>
-        <w:t xml:space="preserve"> 就是唯一的标量控制参数（</w:t>
+        <w:t xml:space="preserve"> 是唯一的标量控制参数（</w:t>
       </w:r>
       <w:r>
         <w:rPr>
@@ -5282,7 +5282,7 @@
           <w:sz w:val="21"/>
           <w:szCs w:val="21"/>
         </w:rPr>
-        <w:t xml:space="preserve"> 是固定的渠道权重）。</w:t>
+        <w:t xml:space="preserve"> 为固定的渠道权重）。</w:t>
       </w:r>
     </w:p>
     <w:p>
@@ -5298,7 +5298,7 @@
           <w:sz w:val="21"/>
           <w:szCs w:val="21"/>
         </w:rPr>
-        <w:t xml:space="preserve">固定一个检验节点 u，人为地让它永久保持易感（也就是空腔节点），取 u 所属的一个层 a 群体 e，定义边基变量</w:t>
+        <w:t xml:space="preserve">固定一个检验节点 u 并令其永久保持易感（空腔节点），取 u 所属的一个层 a 群体 e，定义边基变量</w:t>
       </w:r>
     </w:p>
     <w:p>
@@ -5366,7 +5366,7 @@
           <w:sz w:val="21"/>
           <w:szCs w:val="21"/>
         </w:rPr>
-        <w:t xml:space="preserve">无向群体和有向超图的分界，就在这里显出来。有向情形下，尾集和头集不相交，头成员被感染并不会延长激活，所以</w:t>
+        <w:t xml:space="preserve">无向群体和有向超图的分界正在于此。有向情形下尾集和头集不相交，头成员被感染并不延长激活，故</w:t>
       </w:r>
       <w:r>
         <w:rPr>
@@ -5386,7 +5386,7 @@
           <w:sz w:val="21"/>
           <w:szCs w:val="21"/>
         </w:rPr>
-        <w:t xml:space="preserve">是一条能用的假设；可无向群体里，每个成员既是传染源也是传染靶，一个成员被感染后群体马上就激活，它能去感染同群的其他成员，而后者被感染又把群体的激活时长拖长，剩余成员被感染的概率也就跟着抬高了。这样的</w:t>
+        <w:t xml:space="preserve">是一条可用的假设；无向群体中每个成员既是传染源也是传染靶，一个成员被感染后群体随即激活，可感染同群其他成员，后者被感染又延长群体的激活时长，剩余成员被感染的概率随之抬高。</w:t>
       </w:r>
       <w:r>
         <w:rPr>
@@ -5406,7 +5406,7 @@
           <w:sz w:val="21"/>
           <w:szCs w:val="21"/>
         </w:rPr>
-        <w:t xml:space="preserve">，让逐成员的乘积闭合失了效。能走通的做法不是把群内耦合忽略掉，而是把它整个吸收进状态里：拿 e 里除 u 之外 </w:t>
+        <w:t xml:space="preserve">使逐成员的乘积闭合失效。可行的做法不是忽略群内耦合，而是把它完整吸收进状态：取 e 中除 u 外 </w:t>
       </w:r>
       <w:r>
         <w:rPr>
@@ -5498,7 +5498,7 @@
           <w:sz w:val="21"/>
           <w:szCs w:val="21"/>
         </w:rPr>
-        <w:t xml:space="preserve">）当房室，定义未传递子概率</w:t>
+        <w:t xml:space="preserve">）为房室，定义未传递子概率</w:t>
       </w:r>
     </w:p>
     <w:p>
@@ -5633,7 +5633,7 @@
           <w:sz w:val="21"/>
           <w:szCs w:val="21"/>
         </w:rPr>
-        <w:t xml:space="preserve">，而激活了、却还没传递出去的那部分是 </w:t>
+        <w:t xml:space="preserve">，而激活但尚未传递的部分为 </w:t>
       </w:r>
       <w:r>
         <w:rPr>
@@ -5719,7 +5719,7 @@
           <w:sz w:val="21"/>
           <w:szCs w:val="21"/>
         </w:rPr>
-        <w:t xml:space="preserve">。因为 u 一直是易感的，它不算进群体的感染计数，所以群体激活与否只由 i 决定。</w:t>
+        <w:t xml:space="preserve">。由于 u 恒为易感，不计入群体的感染计数，群体激活与否只取决于 i。</w:t>
       </w:r>
     </w:p>
     <w:p>
@@ -5735,7 +5735,7 @@
           <w:sz w:val="21"/>
           <w:szCs w:val="21"/>
         </w:rPr>
-        <w:t xml:space="preserve">闭合建立在两条假设上。其一是</w:t>
+        <w:t xml:space="preserve">闭合建立在两条假设上。其一为</w:t>
       </w:r>
       <w:r>
         <w:rPr>
@@ -5773,7 +5773,7 @@
           <w:sz w:val="21"/>
           <w:szCs w:val="21"/>
         </w:rPr>
-        <w:t xml:space="preserve"> 时局域收敛到超树，任一有限邻域里出现回路的概率是 </w:t>
+        <w:t xml:space="preserve"> 时局域收敛于超树，任一有限邻域内出现回路的概率为 </w:t>
       </w:r>
       <w:r>
         <w:rPr>
@@ -5791,7 +5791,7 @@
           <w:sz w:val="21"/>
           <w:szCs w:val="21"/>
         </w:rPr>
-        <w:t xml:space="preserve">，据此，u 所属的各个群体、它们的上游分支互不相交，节点侧于是因子化成</w:t>
+        <w:t xml:space="preserve">，据此 u 所属各群体的上游分支互不相交，节点侧因而因子化为</w:t>
       </w:r>
     </w:p>
     <w:p>
@@ -5878,7 +5878,7 @@
           <w:sz w:val="21"/>
           <w:szCs w:val="21"/>
         </w:rPr>
-        <w:t xml:space="preserve">其中 ε 是初始均匀感染比例，Ψ 是节点侧的生成函数。其二是</w:t>
+        <w:t xml:space="preserve">其中 ε 为初始均匀感染比例，Ψ 为节点侧生成函数。其二为</w:t>
       </w:r>
       <w:r>
         <w:rPr>
@@ -5898,7 +5898,7 @@
           <w:sz w:val="21"/>
           <w:szCs w:val="21"/>
         </w:rPr>
-        <w:t xml:space="preserve">：把 e 去掉之后，它的各个成员落在互不相交的分支里，所以它们各自经由别的群体被感染的过程是相互独立的。这条假设比有向情形下的</w:t>
+        <w:t xml:space="preserve">：去掉 e 后，其各成员落在互不相交的分支中，故它们经由其他群体被感染的过程相互独立。该假设弱于有向情形下的</w:t>
       </w:r>
       <w:r>
         <w:rPr>
@@ -5918,7 +5918,7 @@
           <w:sz w:val="21"/>
           <w:szCs w:val="21"/>
         </w:rPr>
-        <w:t xml:space="preserve">要弱——它只说</w:t>
+        <w:t xml:space="preserve">——它只断言</w:t>
       </w:r>
       <w:r>
         <w:rPr>
@@ -5938,7 +5938,7 @@
           <w:sz w:val="21"/>
           <w:szCs w:val="21"/>
         </w:rPr>
-        <w:t xml:space="preserve">暴露独立，群内耦合并没有被丢掉，而是已经由 (2.2) 的计数状态扛下来了。方程组的维数是 </w:t>
+        <w:t xml:space="preserve">暴露独立，群内耦合并未被忽略，而是已由 (2.2) 的计数状态承载。方程组的维数为 </w:t>
       </w:r>
       <w:r>
         <w:rPr>
@@ -5994,7 +5994,7 @@
           <w:sz w:val="21"/>
           <w:szCs w:val="21"/>
         </w:rPr>
-        <w:t xml:space="preserve">（S 由 Φ 代数地给出、终态规模 </w:t>
+        <w:t xml:space="preserve">（S 由 Φ 代数给出、终态规模 </w:t>
       </w:r>
       <w:r>
         <w:rPr>
@@ -6012,7 +6012,7 @@
           <w:sz w:val="21"/>
           <w:szCs w:val="21"/>
         </w:rPr>
-        <w:t xml:space="preserve"> 直接读出，这两样都不再另设方程），和系统规模 N 无关，积分一次就给出 </w:t>
+        <w:t xml:space="preserve"> 直接读出，两者均不另设方程），与系统规模 N 无关，积分一次即给出 </w:t>
       </w:r>
       <w:r>
         <w:rPr>
@@ -6030,7 +6030,7 @@
           <w:sz w:val="21"/>
           <w:szCs w:val="21"/>
         </w:rPr>
-        <w:t xml:space="preserve"> 和终态规模</w:t>
+        <w:t xml:space="preserve"> 与终态规模</w:t>
       </w:r>
     </w:p>
     <w:p>
@@ -6090,7 +6090,7 @@
           <w:sz w:val="21"/>
           <w:szCs w:val="21"/>
         </w:rPr>
-        <w:t xml:space="preserve">一个种子在一个孤立的 m 元群体里造成的感染数，并不是 </w:t>
+        <w:t xml:space="preserve">一个种子在一个孤立的 m 元群体内造成的感染数并非 </w:t>
       </w:r>
       <w:r>
         <w:rPr>
@@ -6108,7 +6108,7 @@
           <w:sz w:val="21"/>
           <w:szCs w:val="21"/>
         </w:rPr>
-        <w:t xml:space="preserve">，因为在整个级联期间群体一直是激活着的。记 </w:t>
+        <w:t xml:space="preserve">，因为群体在整个级联期间持续激活。记 </w:t>
       </w:r>
       <w:r>
         <w:rPr>
@@ -6126,7 +6126,7 @@
           <w:sz w:val="21"/>
           <w:szCs w:val="21"/>
         </w:rPr>
-        <w:t xml:space="preserve"> 为从 i 个感染、s 个易感出发、此后新增感染数的期望，再把群体的总感染率（以康复率为单位）记成 </w:t>
+        <w:t xml:space="preserve"> 为从 i 个感染、s 个易感出发此后新增感染数的期望，以 </w:t>
       </w:r>
       <w:r>
         <w:rPr>
@@ -6163,7 +6163,7 @@
           <w:sz w:val="21"/>
           <w:szCs w:val="21"/>
         </w:rPr>
-        <w:t xml:space="preserve">，那么</w:t>
+        <w:t xml:space="preserve"> 记群体的总感染率（以康复率为单位），则</w:t>
       </w:r>
     </w:p>
     <w:p>
@@ -6269,7 +6269,7 @@
           <w:sz w:val="21"/>
           <w:szCs w:val="21"/>
         </w:rPr>
-        <w:t xml:space="preserve">边界是 </w:t>
+        <w:t xml:space="preserve">边界为 </w:t>
       </w:r>
       <w:r>
         <w:rPr>
@@ -6336,7 +6336,7 @@
           <w:sz w:val="21"/>
           <w:szCs w:val="21"/>
         </w:rPr>
-        <w:t xml:space="preserve">它是一个可以精确算出来的标量。</w:t>
+        <w:t xml:space="preserve">是一个可精确计算的标量。</w:t>
       </w:r>
       <w:r>
         <w:rPr>
@@ -6372,7 +6372,7 @@
           <w:sz w:val="21"/>
           <w:szCs w:val="21"/>
         </w:rPr>
-        <w:t xml:space="preserve">，级联消失、退回到成对传递概率；</w:t>
+        <w:t xml:space="preserve">，级联消失而回到成对传递概率；</w:t>
       </w:r>
       <w:r>
         <w:rPr>
@@ -6444,7 +6444,7 @@
           <w:sz w:val="21"/>
           <w:szCs w:val="21"/>
         </w:rPr>
-        <w:t xml:space="preserve"> 分别超出 11.1%、21.5% 和 31.0%，这可不是能忽略的小修正；</w:t>
+        <w:t xml:space="preserve"> 分别超出 11.1%、21.5% 和 31.0%，并非可忽略的修正；</w:t>
       </w:r>
       <w:r>
         <w:rPr>
@@ -6462,7 +6462,7 @@
           <w:sz w:val="21"/>
           <w:szCs w:val="21"/>
         </w:rPr>
-        <w:t xml:space="preserve"> 时单个种子没法激活群体，所以 </w:t>
+        <w:t xml:space="preserve"> 时单个种子无法激活群体，故 </w:t>
       </w:r>
       <w:r>
         <w:rPr>
@@ -6507,7 +6507,7 @@
           <w:sz w:val="21"/>
           <w:szCs w:val="21"/>
         </w:rPr>
-        <w:t xml:space="preserve">分支过程必须定义在群体这个层面上：每个新感染的节点，去点燃它剩下的各个群体，每个被点燃的群体又产出 C 个新的感染成员，这些成员再去点燃各自剩下的群体。要是改在节点层面上、草率地统计谁直接传染了谁，群内级联的后继就会被重复算进去。把</w:t>
+        <w:t xml:space="preserve">分支过程必须定义在群体层面：每个新感染节点点燃其余各群体，每个被点燃的群体产出 C 个新感染成员，这些成员再点燃各自其余的群体。若改在节点层面朴素地统计谁直接传染了谁，群内级联的后继会被重复计入。按</w:t>
       </w:r>
       <w:r>
         <w:rPr>
@@ -6527,7 +6527,7 @@
           <w:sz w:val="21"/>
           <w:szCs w:val="21"/>
         </w:rPr>
-        <w:t xml:space="preserve">当作型，那么经由层 a 感染的节点、它的层 b 群体数的期望是 </w:t>
+        <w:t xml:space="preserve">分型，经由层 a 感染的节点其层 b 群体数的期望为 </w:t>
       </w:r>
       <w:r>
         <w:rPr>
@@ -6612,7 +6612,7 @@
           <w:sz w:val="21"/>
           <w:szCs w:val="21"/>
         </w:rPr>
-        <w:t xml:space="preserve">，所以</w:t>
+        <w:t xml:space="preserve">，故</w:t>
       </w:r>
     </w:p>
     <w:p>
@@ -6860,7 +6860,7 @@
           <w:sz w:val="21"/>
           <w:szCs w:val="21"/>
         </w:rPr>
-        <w:t xml:space="preserve"> 定出来，ρ 是谱半径。标量的再生数到这里就升维成了矩阵：单层、多层、成对、高阶都只是它的特例。所有 </w:t>
+        <w:t xml:space="preserve"> 确定，ρ 为谱半径。标量再生数由此升维为矩阵：单层、多层、成对、高阶都是其特例。所有 </w:t>
       </w:r>
       <w:r>
         <w:rPr>
@@ -6915,7 +6915,7 @@
           <w:sz w:val="21"/>
           <w:szCs w:val="21"/>
         </w:rPr>
-        <w:t xml:space="preserve">，(2.7) 退回到多层网络 SIR 那个已知阈值；</w:t>
+        <w:t xml:space="preserve">，(2.7) 回到多层网络 SIR 的已知阈值；</w:t>
       </w:r>
       <w:r>
         <w:rPr>
@@ -6933,7 +6933,7 @@
           <w:sz w:val="21"/>
           <w:szCs w:val="21"/>
         </w:rPr>
-        <w:t xml:space="preserve"> 时，它的传递概率阈值 </w:t>
+        <w:t xml:space="preserve"> 时其传递概率阈值 </w:t>
       </w:r>
       <w:r>
         <w:rPr>
@@ -7008,7 +7008,7 @@
           <w:sz w:val="21"/>
           <w:szCs w:val="21"/>
         </w:rPr>
-        <w:t xml:space="preserve"> 退回到 </w:t>
+        <w:t xml:space="preserve"> 回到 </w:t>
       </w:r>
       <w:r>
         <w:rPr>
@@ -7045,7 +7045,7 @@
           <w:sz w:val="21"/>
           <w:szCs w:val="21"/>
         </w:rPr>
-        <w:t xml:space="preserve">。另外，N 逐个元素都非负，所以 </w:t>
+        <w:t xml:space="preserve">。另外，N 逐元非负，所以 </w:t>
       </w:r>
       <w:r>
         <w:rPr>
@@ -7120,7 +7120,7 @@
           <w:sz w:val="21"/>
           <w:szCs w:val="21"/>
         </w:rPr>
-        <w:t xml:space="preserve"> 恰好就是孤立层 a 的分支数：于是多重超图的阈值不会高于任何一个单层的阈值。</w:t>
+        <w:t xml:space="preserve"> 恰为孤立层 a 的分支数：多重超图的阈值因而不高于任一单层的阈值。</w:t>
       </w:r>
     </w:p>
     <w:p>
@@ -7153,7 +7153,7 @@
           <w:sz w:val="21"/>
           <w:szCs w:val="21"/>
         </w:rPr>
-        <w:t xml:space="preserve">(2.7) 给出的阈值，是线性化的产物。这一小节给出另一条不走线性化的独立判据，它的思路和谱方法正好相反：始终停在阈值以下，靠小种子引发的簇规模发散、把 </w:t>
+        <w:t xml:space="preserve">(2.7) 给出的阈值是线性化的产物。本小节给出一条不经线性化的独立判据，其思路和谱方法正相反：始终停在阈值以下，由小种子所引发簇的规模发散读出 </w:t>
       </w:r>
       <w:r>
         <w:rPr>
@@ -7181,7 +7181,7 @@
           <w:sz w:val="21"/>
           <w:szCs w:val="21"/>
         </w:rPr>
-        <w:t xml:space="preserve"> 读出来。阈值以下，单个种子只引发有限的簇，但它的平均总规模会随 </w:t>
+        <w:t xml:space="preserve">。阈值以下单个种子只引发有限簇，但其平均总规模随 </w:t>
       </w:r>
       <w:r>
         <w:rPr>
@@ -7219,7 +7219,7 @@
           <w:sz w:val="21"/>
           <w:szCs w:val="21"/>
         </w:rPr>
-        <w:t xml:space="preserve"> 无界增长。用同一个多型分支过程去数，这个平均总规模是</w:t>
+        <w:t xml:space="preserve"> 无界增长。以同一多型分支过程计数，该平均总规模为</w:t>
       </w:r>
     </w:p>
     <w:p>
@@ -7344,7 +7344,7 @@
           <w:sz w:val="21"/>
           <w:szCs w:val="21"/>
         </w:rPr>
-        <w:t xml:space="preserve"> 是种子的型分布。要注意，χ </w:t>
+        <w:t xml:space="preserve"> 为种子的型分布。χ </w:t>
       </w:r>
       <w:r>
         <w:rPr>
@@ -7355,7 +7355,7 @@
           <w:sz w:val="21"/>
           <w:szCs w:val="21"/>
         </w:rPr>
-        <w:t xml:space="preserve">不能</w:t>
+        <w:t xml:space="preserve">不可</w:t>
       </w:r>
       <w:r>
         <w:rPr>
@@ -7382,7 +7382,7 @@
           <w:sz w:val="21"/>
           <w:szCs w:val="21"/>
         </w:rPr>
-        <w:t xml:space="preserve">：后者只在 </w:t>
+        <w:t xml:space="preserve">：后者仅在 </w:t>
       </w:r>
       <w:r>
         <w:rPr>
@@ -7400,7 +7400,7 @@
           <w:sz w:val="21"/>
           <w:szCs w:val="21"/>
         </w:rPr>
-        <w:t xml:space="preserve">、或者 </w:t>
+        <w:t xml:space="preserve"> 或 </w:t>
       </w:r>
       <w:r>
         <w:rPr>
@@ -7428,7 +7428,7 @@
           <w:sz w:val="21"/>
           <w:szCs w:val="21"/>
         </w:rPr>
-        <w:t xml:space="preserve"> 恰好是 Perron 向量时才成立，多层情形下 </w:t>
+        <w:t xml:space="preserve"> 恰为 Perron 向量时成立，多层情形下 </w:t>
       </w:r>
       <w:r>
         <w:rPr>
@@ -7456,7 +7456,7 @@
           <w:sz w:val="21"/>
           <w:szCs w:val="21"/>
         </w:rPr>
-        <w:t xml:space="preserve"> 给各个型的权重并不一样。这里用得上的性质是：(2.8) 的极点来自 </w:t>
+        <w:t xml:space="preserve"> 对各型的权重并不相同。可用的性质是 (2.8) 的极点来自 </w:t>
       </w:r>
       <w:r>
         <w:rPr>
@@ -7484,7 +7484,7 @@
           <w:sz w:val="21"/>
           <w:szCs w:val="21"/>
         </w:rPr>
-        <w:t xml:space="preserve">，所以它恰好在 </w:t>
+        <w:t xml:space="preserve">，故它恰在 </w:t>
       </w:r>
       <w:r>
         <w:rPr>
@@ -7530,7 +7530,7 @@
           <w:sz w:val="21"/>
           <w:szCs w:val="21"/>
         </w:rPr>
-        <w:t xml:space="preserve"> 发散。它的倒数于是就是一条在阈值处线性穿零的光滑函数：</w:t>
+        <w:t xml:space="preserve"> 发散。其倒数因而是一条在阈值处线性穿零的光滑函数：</w:t>
       </w:r>
     </w:p>
     <w:p>
@@ -7618,7 +7618,7 @@
           <w:sz w:val="21"/>
           <w:szCs w:val="21"/>
         </w:rPr>
-        <w:t xml:space="preserve">零点就是 </w:t>
+        <w:t xml:space="preserve">零点即 </w:t>
       </w:r>
       <w:r>
         <w:rPr>
@@ -7646,7 +7646,7 @@
           <w:sz w:val="21"/>
           <w:szCs w:val="21"/>
         </w:rPr>
-        <w:t xml:space="preserve">。这条判据和 </w:t>
+        <w:t xml:space="preserve">。该判据和 </w:t>
       </w:r>
       <w:r>
         <w:rPr>
@@ -7664,7 +7664,7 @@
           <w:sz w:val="21"/>
           <w:szCs w:val="21"/>
         </w:rPr>
-        <w:t xml:space="preserve"> 不共享任何中间量：一边把非线性方程组 (2.2)–(2.4) 积分到终态、再对 (2.9) 做线性拟合，另一边对次代矩阵 (2.7) 求谱半径、二分，两边只共享模型定义。所以，两条路线的结果一致，是对彼此的一次非平凡检验，图 3 报告的就是这件事。</w:t>
+        <w:t xml:space="preserve"> 不共享任何中间量：一侧把非线性方程组 (2.2)–(2.4) 积分至终态、再对 (2.9) 作线性拟合，另一侧对次代矩阵 (2.7) 求谱半径并二分，二者仅共享模型定义。两条路线的一致因而是对彼此的非平凡检验，也正是图 3 所报告的。</w:t>
       </w:r>
     </w:p>
     <w:p>
@@ -7691,25 +7691,7 @@
           <w:sz w:val="21"/>
           <w:szCs w:val="21"/>
         </w:rPr>
-        <w:t xml:space="preserve">(</w:t>
-      </w:r>
-      <w:r>
-        <w:rPr>
-          <w:rFonts w:ascii="SimSun" w:cs="SimSun" w:eastAsia="SimSun" w:hAnsi="SimSun"/>
-          <w:color w:val="000000"/>
-          <w:sz w:val="21"/>
-          <w:szCs w:val="21"/>
-        </w:rPr>
-        <w:t xml:space="preserve">2.9</w:t>
-      </w:r>
-      <w:r>
-        <w:rPr>
-          <w:rFonts w:ascii="SimSun" w:cs="SimSun" w:eastAsia="SimSun" w:hAnsi="SimSun"/>
-          <w:color w:val="000000"/>
-          <w:sz w:val="21"/>
-          <w:szCs w:val="21"/>
-        </w:rPr>
-        <w:t xml:space="preserve">) 说的是 </w:t>
+        <w:t xml:space="preserve">(2.9) 是 </w:t>
       </w:r>
       <w:r>
         <w:rPr>
@@ -7727,7 +7709,7 @@
           <w:sz w:val="21"/>
           <w:szCs w:val="21"/>
         </w:rPr>
-        <w:t xml:space="preserve"> 的极限。</w:t>
+        <w:t xml:space="preserve"> 的陈述。</w:t>
       </w:r>
       <w:r>
         <w:rPr>
@@ -7745,7 +7727,7 @@
           <w:sz w:val="21"/>
           <w:szCs w:val="21"/>
         </w:rPr>
-        <w:t xml:space="preserve"> 时，就算恰好停在 </w:t>
+        <w:t xml:space="preserve"> 时即便恰在 </w:t>
       </w:r>
       <w:r>
         <w:rPr>
@@ -7773,7 +7755,7 @@
           <w:sz w:val="21"/>
           <w:szCs w:val="21"/>
         </w:rPr>
-        <w:t xml:space="preserve"> 处，</w:t>
+        <w:t xml:space="preserve"> 处 </w:t>
       </w:r>
       <w:r>
         <w:rPr>
@@ -7791,7 +7773,7 @@
           <w:sz w:val="21"/>
           <w:szCs w:val="21"/>
         </w:rPr>
-        <w:t xml:space="preserve"> 还是有限的，</w:t>
+        <w:t xml:space="preserve"> 仍为有限，</w:t>
       </w:r>
       <w:r>
         <w:rPr>
@@ -7809,7 +7791,7 @@
           <w:sz w:val="21"/>
           <w:szCs w:val="21"/>
         </w:rPr>
-        <w:t xml:space="preserve"> 于是不会归零，零点被系统性地往上抬。因为 </w:t>
+        <w:t xml:space="preserve"> 因而不归零，零点被系统性地推高。由于 </w:t>
       </w:r>
       <w:r>
         <w:rPr>
@@ -7827,7 +7809,7 @@
           <w:sz w:val="21"/>
           <w:szCs w:val="21"/>
         </w:rPr>
-        <w:t xml:space="preserve"> 对小 ε 是线性的，这个偏置可以用 </w:t>
+        <w:t xml:space="preserve"> 对小 ε 为线性，该偏置可由 </w:t>
       </w:r>
       <w:r>
         <w:rPr>
@@ -7845,7 +7827,7 @@
           <w:sz w:val="21"/>
           <w:szCs w:val="21"/>
         </w:rPr>
-        <w:t xml:space="preserve"> 的 Richardson 外推抹掉，也就是拿 </w:t>
+        <w:t xml:space="preserve"> 的 Richardson 外推消去，即以 </w:t>
       </w:r>
       <w:r>
         <w:rPr>
@@ -7863,7 +7845,7 @@
           <w:sz w:val="21"/>
           <w:szCs w:val="21"/>
         </w:rPr>
-        <w:t xml:space="preserve"> 去代替 </w:t>
+        <w:t xml:space="preserve"> 代替 </w:t>
       </w:r>
       <w:r>
         <w:rPr>
@@ -7881,7 +7863,7 @@
           <w:sz w:val="21"/>
           <w:szCs w:val="21"/>
         </w:rPr>
-        <w:t xml:space="preserve">。效果直接就能读出来：在几个有代表性的构型上，不做外推时零点一律偏高 0.37%–0.44%，做完外推降到 0.031%–0.065%。偏置的系统性（各构型同号、量级相当）、以及这个修正确实管用，两点就此一并确认。</w:t>
+        <w:t xml:space="preserve">。其效果可以直接读出：在几个有代表性的构型上，不作外推时零点一律偏高 0.37%–0.44%，作外推后降到 0.031%–0.065%。偏置的系统性（各构型同号、量级相当），连同该修正的效力，由此一并确认。</w:t>
       </w:r>
     </w:p>
     <w:p>
@@ -7942,7 +7924,7 @@
           <w:sz w:val="21"/>
           <w:szCs w:val="21"/>
         </w:rPr>
-        <w:t xml:space="preserve"> 上取十个点，每个点都按上面的办法求 </w:t>
+        <w:t xml:space="preserve"> 上取十个点，每点按上述方式求 </w:t>
       </w:r>
       <w:r>
         <w:rPr>
@@ -7978,7 +7960,7 @@
           <w:sz w:val="21"/>
           <w:szCs w:val="21"/>
         </w:rPr>
-        <w:t xml:space="preserve">，做线性拟合、取它的 x 截距。八组构型的阈值覆盖了 </w:t>
+        <w:t xml:space="preserve">，作线性拟合并取其 x 截距。八组构型的阈值覆盖 </w:t>
       </w:r>
       <w:r>
         <w:rPr>
@@ -8015,7 +7997,7 @@
           <w:sz w:val="21"/>
           <w:szCs w:val="21"/>
         </w:rPr>
-        <w:t xml:space="preserve">，里面有单层高阶超图、成对退化网络和双层多重超图，它们的 </w:t>
+        <w:t xml:space="preserve">，含单层高阶超图、成对退化网络和双层多重超图，其 </w:t>
       </w:r>
       <w:r>
         <w:rPr>
@@ -8033,7 +8015,7 @@
           <w:sz w:val="21"/>
           <w:szCs w:val="21"/>
         </w:rPr>
-        <w:t xml:space="preserve"> 值依次是 0.080302、0.099309、0.128162、0.174483、0.185417、0.250000、0.333333 和 0.400567，而外推值依次是 0.080354、0.099370、0.128236、0.174536、0.185512、0.250096、0.333440 和 0.400702。相对偏差依次是 +0.065%、+0.062%、+0.058%、+0.031%、+0.052%、+0.039%、+0.032% 和 +0.034%，最大的一个是 </w:t>
+        <w:t xml:space="preserve"> 值依次为 0.080302、0.099309、0.128162、0.174483、0.185417、0.250000、0.333333 和 0.400567，而外推值依次为 0.080354、0.099370、0.128236、0.174536、0.185512、0.250096、0.333440 和 0.400702。相对偏差依次为 +0.065%、+0.062%、+0.058%、+0.031%、+0.052%、+0.039%、+0.032% 和 +0.034%，最大者为 </w:t>
       </w:r>
       <w:r>
         <w:rPr>
@@ -8061,7 +8043,7 @@
           <w:sz w:val="21"/>
           <w:szCs w:val="21"/>
         </w:rPr>
-        <w:t xml:space="preserve">。再以外推截距的回归标准误 σ 为单位，偏离依次是 +1.51、+1.38、+1.26、+0.55、+1.03、+0.76、+0.57 和 +0.47，最大 1.51σ，全都落在 1.6σ 以内。</w:t>
+        <w:t xml:space="preserve">。以外推截距的回归标准误 σ 为单位，偏离依次为 +1.51、+1.38、+1.26、+0.55、+1.03、+0.76、+0.57 和 +0.47，最大者 1.51σ，全部落在 1.6σ 之内。</w:t>
       </w:r>
     </w:p>
     <w:p>
@@ -8077,7 +8059,7 @@
           <w:sz w:val="21"/>
           <w:szCs w:val="21"/>
         </w:rPr>
-        <w:t xml:space="preserve">这点残余偏差，是线性律 (2.9) 的</w:t>
+        <w:t xml:space="preserve">残余偏差为线性律 (2.9) 的</w:t>
       </w:r>
       <w:r>
         <w:rPr>
@@ -8097,7 +8079,7 @@
           <w:sz w:val="21"/>
           <w:szCs w:val="21"/>
         </w:rPr>
-        <w:t xml:space="preserve">，而不是闭合和谱方法之间有什么实质分歧。</w:t>
+        <w:t xml:space="preserve">，而非闭合和谱方法之间的实质分歧。</w:t>
       </w:r>
       <w:r>
         <w:rPr>
@@ -8115,7 +8097,7 @@
           <w:sz w:val="21"/>
           <w:szCs w:val="21"/>
         </w:rPr>
-        <w:t xml:space="preserve"> 只在 </w:t>
+        <w:t xml:space="preserve"> 仅在 </w:t>
       </w:r>
       <w:r>
         <w:rPr>
@@ -8143,7 +8125,7 @@
           <w:sz w:val="21"/>
           <w:szCs w:val="21"/>
         </w:rPr>
-        <w:t xml:space="preserve"> 的紧邻处才严格线性，有限窗口上的拟合于是带上了一个由曲率造成的偏置；实测这个偏置的符号会随窗口位置翻过来——窗口取 </w:t>
+        <w:t xml:space="preserve"> 的紧邻严格线性，有限窗口上的拟合因而带一个由曲率所致的偏置；实测该偏置的符号随窗口位置翻转——窗口取 </w:t>
       </w:r>
       <w:r>
         <w:rPr>
@@ -8171,7 +8153,7 @@
           <w:sz w:val="21"/>
           <w:szCs w:val="21"/>
         </w:rPr>
-        <w:t xml:space="preserve"> 时是负的、取 </w:t>
+        <w:t xml:space="preserve"> 时为负、取 </w:t>
       </w:r>
       <w:r>
         <w:rPr>
@@ -8199,7 +8181,7 @@
           <w:sz w:val="21"/>
           <w:szCs w:val="21"/>
         </w:rPr>
-        <w:t xml:space="preserve"> 时是正的——它的量级和 σ 相当，所以根本没法和真实偏离区分开。</w:t>
+        <w:t xml:space="preserve"> 时为正——其量级和 σ 相当，故无法和真实偏离区分。</w:t>
       </w:r>
     </w:p>
     <w:p>
@@ -8301,7 +8283,7 @@
           <w:sz w:val="18"/>
           <w:szCs w:val="18"/>
         </w:rPr>
-        <w:t xml:space="preserve">，并和 </w:t>
+        <w:t xml:space="preserve">，并与 </w:t>
       </w:r>
       <w:r>
         <w:rPr>
@@ -8365,7 +8347,7 @@
           <w:sz w:val="18"/>
           <w:szCs w:val="18"/>
         </w:rPr>
-        <w:t xml:space="preserve"> 线性趋零，示例的三组构型是双层 </w:t>
+        <w:t xml:space="preserve"> 线性趋零，示例三组构型为双层 </w:t>
       </w:r>
       <w:r>
         <w:rPr>
@@ -8383,7 +8365,7 @@
           <w:sz w:val="18"/>
           <w:szCs w:val="18"/>
         </w:rPr>
-        <w:t xml:space="preserve">、成对 6-正则和单层 </w:t>
+        <w:t xml:space="preserve">、成对 6-正则与单层 </w:t>
       </w:r>
       <w:r>
         <w:rPr>
@@ -8401,7 +8383,7 @@
           <w:sz w:val="18"/>
           <w:szCs w:val="18"/>
         </w:rPr>
-        <w:t xml:space="preserve">；散点是 </w:t>
+        <w:t xml:space="preserve">；散点为 </w:t>
       </w:r>
       <w:r>
         <w:rPr>
@@ -8419,7 +8401,7 @@
           <w:sz w:val="18"/>
           <w:szCs w:val="18"/>
         </w:rPr>
-        <w:t xml:space="preserve"> 外推后的闭合终态，实线是窗口 </w:t>
+        <w:t xml:space="preserve"> 外推后的闭合终态，实线为窗口 </w:t>
       </w:r>
       <w:r>
         <w:rPr>
@@ -8447,7 +8429,7 @@
           <w:sz w:val="18"/>
           <w:szCs w:val="18"/>
         </w:rPr>
-        <w:t xml:space="preserve"> 内的线性拟合，虚线是它向零点的延长，空心圆标出 </w:t>
+        <w:t xml:space="preserve"> 内的线性拟合，虚线为其向零点的延长，空心圆标出 </w:t>
       </w:r>
       <w:r>
         <w:rPr>
@@ -8465,7 +8447,7 @@
           <w:sz w:val="18"/>
           <w:szCs w:val="18"/>
         </w:rPr>
-        <w:t xml:space="preserve"> 的预言（也就是横坐标 1，和竖虚线同处）；三条延长线各自的零点分别在 1.000616、1.000386 和 1.000336，都在它右侧、可在此标度下和它分不开。(b) 八组构型的外推值和 </w:t>
+        <w:t xml:space="preserve"> 的预言（即横坐标 1，与竖虚线同处）；三条延长线各自的零点分别位于 1.000616、1.000386 与 1.000336，皆在其右侧而在此标度下与之不可分辨。(b) 八组构型的外推值与 </w:t>
       </w:r>
       <w:r>
         <w:rPr>
@@ -8511,7 +8493,7 @@
           <w:sz w:val="18"/>
           <w:szCs w:val="18"/>
         </w:rPr>
-        <w:t xml:space="preserve">，误差棒是回归标准误 σ，在此标度下比标记还小。(c) 偏离的 σ 数 </w:t>
+        <w:t xml:space="preserve">，误差棒为回归标准误 σ，在此标度下小于标记。(c) 偏离的 σ 数 </w:t>
       </w:r>
       <w:r>
         <w:rPr>
@@ -8587,7 +8569,7 @@
           <w:sz w:val="18"/>
           <w:szCs w:val="18"/>
         </w:rPr>
-        <w:t xml:space="preserve">，最大 1.51σ，阴影分别是 ±1σ 和 ±2σ 带。</w:t>
+        <w:t xml:space="preserve">，最大者 1.51σ，阴影分别为 ±1σ 与 ±2σ 带。</w:t>
       </w:r>
     </w:p>
     <w:p>
@@ -8620,7 +8602,7 @@
           <w:sz w:val="21"/>
           <w:szCs w:val="21"/>
         </w:rPr>
-        <w:t xml:space="preserve">阈值只经由度矩进入 N，所以可以取一族</w:t>
+        <w:t xml:space="preserve">阈值只经由度矩进入 N，故可取一族</w:t>
       </w:r>
       <w:r>
         <w:rPr>
@@ -8631,16 +8613,16 @@
           <w:sz w:val="21"/>
           <w:szCs w:val="21"/>
         </w:rPr>
-        <w:t xml:space="preserve">边缘固定、只有相关不同</w:t>
-      </w:r>
-      <w:r>
-        <w:rPr>
-          <w:rFonts w:ascii="SimSun" w:cs="SimSun" w:eastAsia="SimSun" w:hAnsi="SimSun"/>
-          <w:color w:val="000000"/>
-          <w:sz w:val="21"/>
-          <w:szCs w:val="21"/>
-        </w:rPr>
-        <w:t xml:space="preserve">的构型，把层间参与相关的效应单独隔出来。设两层度各以等概率取 2 或 4（边缘均值 3、方差 1），联合分布取 </w:t>
+        <w:t xml:space="preserve">边缘固定、仅相关不同</w:t>
+      </w:r>
+      <w:r>
+        <w:rPr>
+          <w:rFonts w:ascii="SimSun" w:cs="SimSun" w:eastAsia="SimSun" w:hAnsi="SimSun"/>
+          <w:color w:val="000000"/>
+          <w:sz w:val="21"/>
+          <w:szCs w:val="21"/>
+        </w:rPr>
+        <w:t xml:space="preserve">的构型，隔离出层间参与相关的效应。设两层度各以等概率为 2 或 4（边缘均值 3、方差 1），联合分布取 </w:t>
       </w:r>
       <w:r>
         <w:rPr>
@@ -8742,7 +8724,7 @@
           <w:sz w:val="21"/>
           <w:szCs w:val="21"/>
         </w:rPr>
-        <w:t xml:space="preserve"> 恰好就是两层度的 Pearson 相关。</w:t>
+        <w:t xml:space="preserve"> 恰为两层度的 Pearson 相关。</w:t>
       </w:r>
       <w:r>
         <w:rPr>
@@ -8770,7 +8752,7 @@
           <w:sz w:val="21"/>
           <w:szCs w:val="21"/>
         </w:rPr>
-        <w:t xml:space="preserve"> 从 −1（反相关）扫到 +1（正相关）时，边缘一直不变，只有交叉矩 </w:t>
+        <w:t xml:space="preserve"> 由 −1（反相关）扫到 +1（正相关）时边缘不变，只有交叉矩 </w:t>
       </w:r>
       <w:r>
         <w:rPr>
@@ -8836,7 +8818,7 @@
           <w:sz w:val="21"/>
           <w:szCs w:val="21"/>
         </w:rPr>
-        <w:t xml:space="preserve"> 跟着改变。</w:t>
+        <w:t xml:space="preserve"> 随之改变。</w:t>
       </w:r>
     </w:p>
     <w:p>
@@ -8954,7 +8936,7 @@
           <w:sz w:val="21"/>
           <w:szCs w:val="21"/>
         </w:rPr>
-        <w:t xml:space="preserve"> 没关系，非对角元 </w:t>
+        <w:t xml:space="preserve"> 无关，非对角元 </w:t>
       </w:r>
       <w:r>
         <w:rPr>
@@ -9057,7 +9039,7 @@
           <w:sz w:val="21"/>
           <w:szCs w:val="21"/>
         </w:rPr>
-        <w:t xml:space="preserve"> 线性变大，所以 </w:t>
+        <w:t xml:space="preserve"> 线性增大，故 </w:t>
       </w:r>
       <w:r>
         <w:rPr>
@@ -9150,7 +9132,7 @@
           <w:sz w:val="21"/>
           <w:szCs w:val="21"/>
         </w:rPr>
-        <w:t xml:space="preserve"> 定出来——</w:t>
+        <w:t xml:space="preserve"> 定出——</w:t>
       </w:r>
       <w:r>
         <w:rPr>
@@ -9170,7 +9152,7 @@
           <w:sz w:val="21"/>
           <w:szCs w:val="21"/>
         </w:rPr>
-        <w:t xml:space="preserve">。图 4 里的实线就是这条曲线：</w:t>
+        <w:t xml:space="preserve">。图 4 的实线即此曲线：</w:t>
       </w:r>
       <w:r>
         <w:rPr>
@@ -9272,7 +9254,7 @@
           <w:sz w:val="21"/>
           <w:szCs w:val="21"/>
         </w:rPr>
-        <w:t xml:space="preserve"> 处的 0.0930，一共降了大约 12.5%。同一族构型在位形模型多重超图上的直接 Gillespie 仿真（靠亚临界簇规模外推 </w:t>
+        <w:t xml:space="preserve"> 处的 0.0930，共约 12.5%。同一族构型在位形模型多重超图上的直接 Gillespie 仿真（由亚临界簇规模外推 </w:t>
       </w:r>
       <w:r>
         <w:rPr>
@@ -9318,7 +9300,7 @@
           <w:sz w:val="21"/>
           <w:szCs w:val="21"/>
         </w:rPr>
-        <w:t xml:space="preserve">），在六个 </w:t>
+        <w:t xml:space="preserve">）在六个 </w:t>
       </w:r>
       <w:r>
         <w:rPr>
@@ -9346,7 +9328,7 @@
           <w:sz w:val="21"/>
           <w:szCs w:val="21"/>
         </w:rPr>
-        <w:t xml:space="preserve"> 上都把这条曲线复现了出来，偏离最大 1.9σ、相对差不超过 1.1%。更值得说的是它背后的机制：同一批节点在两层同时当枢纽，会在边缘结构没变的情况下把跨层传播能力集中起来、压低阈值；反相关则把阈值抬高。</w:t>
+        <w:t xml:space="preserve"> 上复现该曲线，偏离最大 1.9σ、相对差不超过 1.1%。更值得强调的是其机制：相同节点在两层同时充当枢纽，会在边缘结构不变时集中跨层传播能力、压低阈值；反相关则抬高阈值。</w:t>
       </w:r>
     </w:p>
     <w:p>
@@ -9484,7 +9466,7 @@
           <w:sz w:val="18"/>
           <w:szCs w:val="18"/>
         </w:rPr>
-        <w:t xml:space="preserve">），只调节两层度的 Pearson 相关 </w:t>
+        <w:t xml:space="preserve">），仅调节两层度的 Pearson 相关 </w:t>
       </w:r>
       <w:r>
         <w:rPr>
@@ -9512,7 +9494,7 @@
           <w:sz w:val="18"/>
           <w:szCs w:val="18"/>
         </w:rPr>
-        <w:t xml:space="preserve">。（a）结果：蓝线是 </w:t>
+        <w:t xml:space="preserve">。（a）结果：蓝线为 </w:t>
       </w:r>
       <w:r>
         <w:rPr>
@@ -9530,7 +9512,7 @@
           <w:sz w:val="18"/>
           <w:szCs w:val="18"/>
         </w:rPr>
-        <w:t xml:space="preserve"> 的精确阈值，箱线是多重超图上直接 Gillespie 仿真所得阈值的自助分布（</w:t>
+        <w:t xml:space="preserve"> 的精确阈值，箱线为多重超图上直接 Gillespie 仿真所得阈值的自助分布（</w:t>
       </w:r>
       <w:r>
         <w:rPr>
@@ -9558,7 +9540,7 @@
           <w:sz w:val="18"/>
           <w:szCs w:val="18"/>
         </w:rPr>
-        <w:t xml:space="preserve">；箱体是四分位距、须是 5–95 百分位、中线是中位数），</w:t>
+        <w:t xml:space="preserve">；箱体为四分位距、须为 5–95 百分位、中线为中位数），</w:t>
       </w:r>
       <w:r>
         <w:rPr>
@@ -9614,7 +9596,7 @@
           <w:sz w:val="18"/>
           <w:szCs w:val="18"/>
         </w:rPr>
-        <w:t xml:space="preserve"> 单调下降大约 12.5%，六点上一致到 1.9σ。（b）测量：各 </w:t>
+        <w:t xml:space="preserve"> 单调下降约 12.5%，六点上一致至 1.9σ。（b）测量：各 </w:t>
       </w:r>
       <w:r>
         <w:rPr>
@@ -9678,7 +9660,7 @@
           <w:sz w:val="18"/>
           <w:szCs w:val="18"/>
         </w:rPr>
-        <w:t xml:space="preserve"> 线性趋零，它的 </w:t>
+        <w:t xml:space="preserve"> 线性趋零，其 </w:t>
       </w:r>
       <w:r>
         <w:rPr>
@@ -9696,7 +9678,7 @@
           <w:sz w:val="18"/>
           <w:szCs w:val="18"/>
         </w:rPr>
-        <w:t xml:space="preserve"> 截距（空心圈）就是 </w:t>
+        <w:t xml:space="preserve"> 截距（空心圈）即 </w:t>
       </w:r>
       <w:r>
         <w:rPr>
@@ -9752,7 +9734,7 @@
           <w:sz w:val="18"/>
           <w:szCs w:val="18"/>
         </w:rPr>
-        <w:t xml:space="preserve"> 着色，也就是（a）中各个箱子的来源。（c）机制：固定 </w:t>
+        <w:t xml:space="preserve"> 着色，即（a）中各箱之来源。（c）机制：固定 </w:t>
       </w:r>
       <w:r>
         <w:rPr>
@@ -9853,7 +9835,7 @@
           <w:sz w:val="18"/>
           <w:szCs w:val="18"/>
         </w:rPr>
-        <w:t xml:space="preserve"> 那条线恰好在 </w:t>
+        <w:t xml:space="preserve"> 一线恰在 </w:t>
       </w:r>
       <w:r>
         <w:rPr>
@@ -9908,7 +9890,7 @@
           <w:sz w:val="18"/>
           <w:szCs w:val="18"/>
         </w:rPr>
-        <w:t xml:space="preserve">——这正是相关参与集中跨层传播能力、压低阈值的机制。</w:t>
+        <w:t xml:space="preserve">——即相关参与集中跨层传播能力、压低阈值的机制。</w:t>
       </w:r>
     </w:p>
     <w:p>
@@ -9941,7 +9923,7 @@
           <w:sz w:val="21"/>
           <w:szCs w:val="21"/>
         </w:rPr>
-        <w:t xml:space="preserve">校验分四层：闭合内部的自洽、阈值公式的解析锚点、亚临界规模的独立复算，还有级联量本身的蒙特卡洛复核。脚本见 verify.py、verify_ode.py、datacheck.py 和 recheck_mc.py。</w:t>
+        <w:t xml:space="preserve">校验分四层：闭合内部的自洽、阈值公式的解析锚点、亚临界规模的独立复算，以及级联量本身的蒙特卡洛复核。脚本见 verify.py、verify_ode.py、datacheck.py 和 recheck_mc.py。</w:t>
       </w:r>
     </w:p>
     <w:p>
@@ -9968,7 +9950,7 @@
           <w:sz w:val="21"/>
           <w:szCs w:val="21"/>
         </w:rPr>
-        <w:t xml:space="preserve">把 (2.2) 那组方程逐项求和，外部风险项、群内项和康复项各自守恒、两两相消，只剩下 </w:t>
+        <w:t xml:space="preserve">对 (2.2) 的方程组求和，外部风险项、群内项和康复项各自守恒相消，只余 </w:t>
       </w:r>
       <w:r>
         <w:rPr>
@@ -10044,7 +10026,7 @@
           <w:sz w:val="21"/>
           <w:szCs w:val="21"/>
         </w:rPr>
-        <w:t xml:space="preserve">；数值上，这条求和规则的残差在 </w:t>
+        <w:t xml:space="preserve">；数值上该求和规则的残差为 </w:t>
       </w:r>
       <w:r>
         <w:rPr>
@@ -10072,7 +10054,7 @@
           <w:sz w:val="21"/>
           <w:szCs w:val="21"/>
         </w:rPr>
-        <w:t xml:space="preserve"> 量级，到了机器精度。全部成员都易感，就意味着群体从没激活过、因此也必定没传递过，所以 </w:t>
+        <w:t xml:space="preserve"> 量级，达机器精度。全部成员易感蕴含群体从未激活、因而必未传递，故 </w:t>
       </w:r>
       <w:r>
         <w:rPr>
@@ -10148,7 +10130,7 @@
           <w:sz w:val="21"/>
           <w:szCs w:val="21"/>
         </w:rPr>
-        <w:t xml:space="preserve"> 对一切 t 都成立；这条恒等式不是额外加的假设，而是方程组本身的推论，它的残差在 </w:t>
+        <w:t xml:space="preserve"> 对一切 t 成立；该恒等式不是额外假设而是方程组的推论，其残差为 </w:t>
       </w:r>
       <w:r>
         <w:rPr>
@@ -10176,7 +10158,7 @@
           <w:sz w:val="21"/>
           <w:szCs w:val="21"/>
         </w:rPr>
-        <w:t xml:space="preserve"> 量级，纯粹是积分误差。另外，把 (2.2) 在无病定态处取数值 Jacobian，它的谱横标在 </w:t>
+        <w:t xml:space="preserve"> 量级，纯属积分误差。此外，把 (2.2) 在无病定态作数值 Jacobian，其谱横标在 </w:t>
       </w:r>
       <w:r>
         <w:rPr>
@@ -10194,7 +10176,7 @@
           <w:sz w:val="21"/>
           <w:szCs w:val="21"/>
         </w:rPr>
-        <w:t xml:space="preserve"> 给出的那个 </w:t>
+        <w:t xml:space="preserve"> 所给的 </w:t>
       </w:r>
       <w:r>
         <w:rPr>
@@ -10222,7 +10204,7 @@
           <w:sz w:val="21"/>
           <w:szCs w:val="21"/>
         </w:rPr>
-        <w:t xml:space="preserve"> 处为零，也到机器精度：闭合和次代矩阵共享同一个阈值，所以 (2.9) 的外推测的，确实就是 (2.7) 的阈值。</w:t>
+        <w:t xml:space="preserve"> 处为零，达机器精度：闭合和次代矩阵共享同一阈值，(2.9) 的外推所测者因而确为 (2.7) 的阈值。</w:t>
       </w:r>
     </w:p>
     <w:p>
@@ -10303,7 +10285,7 @@
           <w:sz w:val="21"/>
           <w:szCs w:val="21"/>
         </w:rPr>
-        <w:t xml:space="preserve"> 和 2 处和解析值相差不超过 </w:t>
+        <w:t xml:space="preserve"> 与 2 处和解析值相差不超过 </w:t>
       </w:r>
       <w:r>
         <w:rPr>
@@ -10349,7 +10331,7 @@
           <w:sz w:val="21"/>
           <w:szCs w:val="21"/>
         </w:rPr>
-        <w:t xml:space="preserve"> 时它恒等于零。阈值公式 (2.7) 在成对退化的 5-正则单层上给出 </w:t>
+        <w:t xml:space="preserve"> 时恒为零。阈值公式 (2.7) 在成对退化的 5-正则单层上给出 </w:t>
       </w:r>
       <w:r>
         <w:rPr>
@@ -10386,7 +10368,7 @@
           <w:sz w:val="21"/>
           <w:szCs w:val="21"/>
         </w:rPr>
-        <w:t xml:space="preserve">，和解析值逐位相同、一直对到十位有效数字。在 </w:t>
+        <w:t xml:space="preserve">，和解析值逐位相同至十位有效数字。在 </w:t>
       </w:r>
       <w:r>
         <w:rPr>
@@ -10440,7 +10422,7 @@
           <w:sz w:val="21"/>
           <w:szCs w:val="21"/>
         </w:rPr>
-        <w:t xml:space="preserve"> 处，</w:t>
+        <w:t xml:space="preserve"> 处 </w:t>
       </w:r>
       <w:r>
         <w:rPr>
@@ -10496,7 +10478,7 @@
           <w:sz w:val="21"/>
           <w:szCs w:val="21"/>
         </w:rPr>
-        <w:t xml:space="preserve">，两层各自都还在深度亚临界，可合并起来 </w:t>
+        <w:t xml:space="preserve">，两层各自处于深度亚临界，而合并后 </w:t>
       </w:r>
       <w:r>
         <w:rPr>
@@ -10514,7 +10496,7 @@
           <w:sz w:val="21"/>
           <w:szCs w:val="21"/>
         </w:rPr>
-        <w:t xml:space="preserve"> 就已经越过临界了——两条各自亚临界的弱渠道，合到一起之后能变成超临界。最后，</w:t>
+        <w:t xml:space="preserve"> 已越过临界——两条各自亚临界的弱渠道合并之后可以超临界。最后，</w:t>
       </w:r>
       <w:r>
         <w:rPr>
@@ -10532,7 +10514,7 @@
           <w:sz w:val="21"/>
           <w:szCs w:val="21"/>
         </w:rPr>
-        <w:t xml:space="preserve"> 的那一层因为 </w:t>
+        <w:t xml:space="preserve"> 的层因 </w:t>
       </w:r>
       <w:r>
         <w:rPr>
@@ -10550,7 +10532,7 @@
           <w:sz w:val="21"/>
           <w:szCs w:val="21"/>
         </w:rPr>
-        <w:t xml:space="preserve">，在 N 里整列都是零、精确地出了列，算出来的阈值和对应单层的值逐位相同：一条高门槛的渠道并不改变爆不爆发，它只改变爆发的规模。</w:t>
+        <w:t xml:space="preserve"> 而在 N 中整列为零，精确出列，所得阈值和相应单层值逐位相同：一条高门槛渠道不改变爆发与否，只改变爆发规模。</w:t>
       </w:r>
     </w:p>
     <w:p>
@@ -10577,7 +10559,7 @@
           <w:sz w:val="21"/>
           <w:szCs w:val="21"/>
         </w:rPr>
-        <w:t xml:space="preserve">闭合的亚临界终态和 (2.8) 的解析值不共享代码——一边积分非线性方程组，另一边求一个矩阵的逆。用均匀播种写出 </w:t>
+        <w:t xml:space="preserve">闭合的亚临界终态和 (2.8) 的解析值不共享代码——一侧积分非线性方程组，另一侧求一个矩阵逆。以均匀播种写出 </w:t>
       </w:r>
       <w:r>
         <w:rPr>
@@ -10765,7 +10747,7 @@
           <w:sz w:val="21"/>
           <w:szCs w:val="21"/>
         </w:rPr>
-        <w:t xml:space="preserve">，两者的相对差随 ε 单调下降：ε 依次取 </w:t>
+        <w:t xml:space="preserve">，二者的相对差随 ε 单调下降：ε 依次取 </w:t>
       </w:r>
       <w:r>
         <w:rPr>
@@ -10877,7 +10859,7 @@
           <w:sz w:val="21"/>
           <w:szCs w:val="21"/>
         </w:rPr>
-        <w:t xml:space="preserve"> 和 </w:t>
+        <w:t xml:space="preserve"> 与 </w:t>
       </w:r>
       <w:r>
         <w:rPr>
@@ -10905,7 +10887,7 @@
           <w:sz w:val="21"/>
           <w:szCs w:val="21"/>
         </w:rPr>
-        <w:t xml:space="preserve"> 时，相对差依次是 </w:t>
+        <w:t xml:space="preserve"> 时，相对差依次为 </w:t>
       </w:r>
       <w:r>
         <w:rPr>
@@ -11017,7 +10999,7 @@
           <w:sz w:val="21"/>
           <w:szCs w:val="21"/>
         </w:rPr>
-        <w:t xml:space="preserve"> 和 </w:t>
+        <w:t xml:space="preserve"> 与 </w:t>
       </w:r>
       <w:r>
         <w:rPr>
@@ -11045,7 +11027,7 @@
           <w:sz w:val="21"/>
           <w:szCs w:val="21"/>
         </w:rPr>
-        <w:t xml:space="preserve">。这就证实了，闭合的亚临界终态在 </w:t>
+        <w:t xml:space="preserve">。这证实闭合的亚临界终态在 </w:t>
       </w:r>
       <w:r>
         <w:rPr>
@@ -11063,7 +11045,7 @@
           <w:sz w:val="21"/>
           <w:szCs w:val="21"/>
         </w:rPr>
-        <w:t xml:space="preserve"> 的极限下就是 (2.8)，它的极点严格落在 </w:t>
+        <w:t xml:space="preserve"> 极限下即为 (2.8)，其极点严格位于 </w:t>
       </w:r>
       <w:r>
         <w:rPr>
@@ -11081,7 +11063,7 @@
           <w:sz w:val="21"/>
           <w:szCs w:val="21"/>
         </w:rPr>
-        <w:t xml:space="preserve">。终态本身也已经收敛：在 </w:t>
+        <w:t xml:space="preserve">。终态本身亦已收敛：在 </w:t>
       </w:r>
       <w:r>
         <w:rPr>
@@ -11156,7 +11138,7 @@
           <w:sz w:val="21"/>
           <w:szCs w:val="21"/>
         </w:rPr>
-        <w:t xml:space="preserve"> 上 χ 逐位不变，剩下那点激活了、却没传递的质量在 </w:t>
+        <w:t xml:space="preserve"> 上 χ 逐位不变，残余的激活且未传递质量在 </w:t>
       </w:r>
       <w:r>
         <w:rPr>
@@ -11211,7 +11193,7 @@
           <w:sz w:val="21"/>
           <w:szCs w:val="21"/>
         </w:rPr>
-        <w:t xml:space="preserve">级联递推 (2.5) 还由单群体的直接 Gillespie 抽样独立复核了一遍，这个检验既不用方程组、也不用次代矩阵。在 </w:t>
+        <w:t xml:space="preserve">级联递推 (2.5) 由单群体的直接 Gillespie 抽样独立复核，该检验既不使用方程组也不使用次代矩阵。在 </w:t>
       </w:r>
       <w:r>
         <w:rPr>
@@ -11257,7 +11239,7 @@
           <w:sz w:val="21"/>
           <w:szCs w:val="21"/>
         </w:rPr>
-        <w:t xml:space="preserve"> 次实现给出的估计和递推值一致，偏离大多在一个统计标准误以内；其中 </w:t>
+        <w:t xml:space="preserve"> 次实现给出的估计和递推值一致，偏离多在一个统计标准误以内；其中 </w:t>
       </w:r>
       <w:r>
         <w:rPr>
@@ -11275,7 +11257,7 @@
           <w:sz w:val="21"/>
           <w:szCs w:val="21"/>
         </w:rPr>
-        <w:t xml:space="preserve"> 那一组初次测出 3.4σ，改用 </w:t>
+        <w:t xml:space="preserve"> 一组初次测得 3.4σ，以 </w:t>
       </w:r>
       <w:r>
         <w:rPr>
@@ -11303,7 +11285,7 @@
           <w:sz w:val="21"/>
           <w:szCs w:val="21"/>
         </w:rPr>
-        <w:t xml:space="preserve"> 次实现、四个独立随机种子复测之后，分别是 0.64σ、0.74σ、1.12σ 和 1.03σ，确认这个偏离纯粹是统计涨落，而不是递推的系统误差。作为整体行为的一个旁证，</w:t>
+        <w:t xml:space="preserve"> 次实现、四个独立随机种子复测后分别为 0.64σ、0.74σ、1.12σ 与 1.03σ，确认该偏离纯属统计涨落而非递推的系统误差。作为整体行为的旁证，</w:t>
       </w:r>
       <w:r>
         <w:rPr>
@@ -11321,7 +11303,7 @@
           <w:sz w:val="21"/>
           <w:szCs w:val="21"/>
         </w:rPr>
-        <w:t xml:space="preserve"> 在扫描区间上严格单调递增（从 0.207 一直增到 2.715），二分因此是适定的；而拿 </w:t>
+        <w:t xml:space="preserve"> 在扫描区间上严格单调递增（由 0.207 增至 2.715），二分因而适定；而以 </w:t>
       </w:r>
       <w:r>
         <w:rPr>
@@ -11339,7 +11321,7 @@
           <w:sz w:val="21"/>
           <w:szCs w:val="21"/>
         </w:rPr>
-        <w:t xml:space="preserve"> 跨过阈值去积分时，</w:t>
+        <w:t xml:space="preserve"> 跨越阈值积分时，</w:t>
       </w:r>
       <w:r>
         <w:rPr>
@@ -11357,7 +11339,7 @@
           <w:sz w:val="21"/>
           <w:szCs w:val="21"/>
         </w:rPr>
-        <w:t xml:space="preserve"> 在阈值以下维持 </w:t>
+        <w:t xml:space="preserve"> 在阈值以下保持 </w:t>
       </w:r>
       <w:r>
         <w:rPr>
@@ -11375,7 +11357,7 @@
           <w:sz w:val="21"/>
           <w:szCs w:val="21"/>
         </w:rPr>
-        <w:t xml:space="preserve"> 量级、到阈值以上就抬成 </w:t>
+        <w:t xml:space="preserve"> 量级、在阈值以上抬升为 </w:t>
       </w:r>
       <w:r>
         <w:rPr>
@@ -11409,7 +11391,7 @@
           <w:sz w:val="21"/>
           <w:szCs w:val="21"/>
         </w:rPr>
-        <w:t xml:space="preserve">这四层校验合起来看：由亚临界终态外推测得的 </w:t>
+        <w:t xml:space="preserve">四项校验合起来：由亚临界终态外推测得的 </w:t>
       </w:r>
       <w:r>
         <w:rPr>
@@ -11437,7 +11419,7 @@
           <w:sz w:val="21"/>
           <w:szCs w:val="21"/>
         </w:rPr>
-        <w:t xml:space="preserve">，和 </w:t>
+        <w:t xml:space="preserve"> 与 </w:t>
       </w:r>
       <w:r>
         <w:rPr>
@@ -11483,7 +11465,7 @@
           <w:sz w:val="21"/>
           <w:szCs w:val="21"/>
         </w:rPr>
-        <w:t xml:space="preserve">、偏离最大 1.51σ。这是对爆发阈值的一次全非线性的独立确认，和前面的 Jacobian 复核正好互补——后者检验的是线性化的谱，前者检验的是非线性终态所继承的同一个阈值。</w:t>
+        <w:t xml:space="preserve">、偏离最大 1.51σ。这是对爆发阈值的一次全非线性独立确认，与前述 Jacobian 复核互补——后者检验线性化谱，前者检验非线性终态所继承的同一阈值。</w:t>
       </w:r>
     </w:p>
     <w:sectPr>

</xml_diff>

<commit_message>
de-AI rewrite: strip demonstrative fillers and AI patterns from manuscript
Section 1: cut '一切...最终只', '源于此' filler, tighten finite-size
sentence. Section 2: '更值得强调的是' → direct, drop 'これは' filler
in closing. Section 3 (first de-AI pass): remove 这一/这一条/这一点
demonstratives, drop '值得留意'/'更能说明...的是' AI patterns,
replace '不是X而是Y' filler contrasts with direct statements,
strip '就此', tighten 9 sentences total. All E() formula tokens
unchanged; combined doc rebuilt and verified.

Co-Authored-By: Claude Opus 4.6 <noreply@anthropic.com>
Claude-Session: https://claude.ai/code/session_01GMqZS1ZXii3SRe677Qn7Mk
</commit_message>
<xml_diff>
--- a/multiplex-hypergraph-sir/combined_cn.docx
+++ b/multiplex-hypergraph-sir/combined_cn.docx
@@ -899,7 +899,7 @@
           <w:sz w:val="21"/>
           <w:szCs w:val="21"/>
         </w:rPr>
-        <w:t xml:space="preserve"> 是本模型的结构输入，层间的一切效应最终只经由 </w:t>
+        <w:t xml:space="preserve"> 是本模型的结构输入，层间效应只经由 </w:t>
       </w:r>
       <w:r>
         <w:rPr>
@@ -1455,7 +1455,7 @@
           <w:sz w:val="21"/>
           <w:szCs w:val="21"/>
         </w:rPr>
-        <w:t xml:space="preserve"> 即均匀初始感染比例。和有向超图不同，无向群体中每个成员既是传染源也是传染靶：一个成员被感染后群体激活，可感染同群其他成员，后者被感染又延长群体的激活时长，形成群内级联。本模型的新内容都源于此。</w:t>
+        <w:t xml:space="preserve"> 即均匀初始感染比例。和有向超图不同，无向群体中每个成员既是传染源也是传染靶：一个成员被感染后群体激活，可感染同群其他成员，后者被感染又延长群体的激活时长，形成群内级联，后续分析均围绕它展开。</w:t>
       </w:r>
     </w:p>
     <w:p>
@@ -4581,7 +4581,7 @@
           <w:sz w:val="21"/>
           <w:szCs w:val="21"/>
         </w:rPr>
-        <w:t xml:space="preserve">、400 次独立实现（脚本 figure2_evolution.py，含 Fenwick 树加速的精确 Gillespie）。残余偏差随系统规模增大而单调趋零，是可由增大系统消除的有限尺寸效应，而非闭合层级的系统偏差。</w:t>
+        <w:t xml:space="preserve">、400 次独立实现（脚本 figure2_evolution.py，含 Fenwick 树加速的精确 Gillespie）。残余偏差随系统规模增大单调趋零，属有限尺寸效应，增大系统即可消除。</w:t>
       </w:r>
     </w:p>
     <w:p>
@@ -9034,7 +9034,7 @@
           <w:sz w:val="21"/>
           <w:szCs w:val="21"/>
         </w:rPr>
-        <w:t xml:space="preserve"> 上复现该曲线（图 3(b) 箱线），偏离最大 1.9σ、相对差不超过 1.1%。更值得强调的是其机制：相同节点在两层同时充当枢纽，会在边缘结构不变时集中跨层传播能力、压低阈值；反相关则抬高阈值——这一移动在图 3 的相图中表现为临界曲线整体内移（图 3(c)、(d)）。</w:t>
+        <w:t xml:space="preserve"> 上复现该曲线（图 3(b) 箱线），偏离最大 1.9σ、相对差不超过 1.1%。机制明确：相同节点在两层同时充当枢纽，会在边缘结构不变时集中跨层传播能力、压低阈值；反相关则抬高阈值——这一移动在图 3 的相图中表现为临界曲线整体内移（图 3(c)、(d)）。</w:t>
       </w:r>
     </w:p>
     <w:p>
@@ -10609,7 +10609,7 @@
           <w:sz w:val="21"/>
           <w:szCs w:val="21"/>
         </w:rPr>
-        <w:t xml:space="preserve">、偏离最大 1.51σ。这是对爆发阈值的一次全非线性独立确认，与前述 Jacobian 复核互补——后者检验线性化谱，前者检验非线性终态所继承的同一阈值。</w:t>
+        <w:t xml:space="preserve">、偏离最大 1.51σ，构成对爆发阈值的全非线性独立确认——与 Jacobian 复核互补：后者检验线性化谱，前者检验非线性终态所继承的同一阈值。</w:t>
       </w:r>
     </w:p>
     <w:p>
@@ -10777,7 +10777,7 @@
           <w:sz w:val="21"/>
           <w:szCs w:val="21"/>
         </w:rPr>
-        <w:t xml:space="preserve"> 统一定标。放开这一约束，令两层各自的速率 </w:t>
+        <w:t xml:space="preserve"> 统一定标。放开约束，令两层各自的速率 </w:t>
       </w:r>
       <w:r>
         <w:rPr>
@@ -11300,7 +11300,7 @@
           <w:sz w:val="21"/>
           <w:szCs w:val="21"/>
         </w:rPr>
-        <w:t xml:space="preserve">）正落在楔内紧贴边界处，图中以菱形标出。楔形之大值得留意：它并非临界线附近的一条窄缝，而是占据了整个 </w:t>
+        <w:t xml:space="preserve">）正落在楔内紧贴边界处，图中以菱形标出。楔形并非临界线附近的窄缝，而是占据了整个 </w:t>
       </w:r>
       <w:r>
         <w:rPr>
@@ -11447,7 +11447,7 @@
           <w:sz w:val="21"/>
           <w:szCs w:val="21"/>
         </w:rPr>
-        <w:t xml:space="preserve"> 由 −1 增到 +1 而整体内移（图 3c），对称阈值由 0.106203 降到 0.092956，与 §2.4 的两个端点逐位相同；图 3(d) 把这一移动画成 </w:t>
+        <w:t xml:space="preserve"> 由 −1 增到 +1 而整体内移（图 3c），对称阈值由 0.106203 降到 0.092956，与 §2.4 的两个端点逐位相同；图 3(d) 把移动量画成</w:t>
       </w:r>
       <w:r>
         <w:rPr>
@@ -11533,16 +11533,16 @@
           <w:sz w:val="21"/>
           <w:szCs w:val="21"/>
         </w:rPr>
-        <w:t xml:space="preserve">协同不是可有可无的修饰，而是多重结构的默认状态</w:t>
-      </w:r>
-      <w:r>
-        <w:rPr>
-          <w:rFonts w:ascii="SimSun" w:cs="SimSun" w:eastAsia="SimSun" w:hAnsi="SimSun"/>
-          <w:color w:val="000000"/>
-          <w:sz w:val="21"/>
-          <w:szCs w:val="21"/>
-        </w:rPr>
-        <w:t xml:space="preserve">：只要两层都不是完全孤立，合并阈值就严格低于任一单层阈值——这一点在 §2.1 已由 </w:t>
+        <w:t xml:space="preserve">协同是多重结构的默认状态</w:t>
+      </w:r>
+      <w:r>
+        <w:rPr>
+          <w:rFonts w:ascii="SimSun" w:cs="SimSun" w:eastAsia="SimSun" w:hAnsi="SimSun"/>
+          <w:color w:val="000000"/>
+          <w:sz w:val="21"/>
+          <w:szCs w:val="21"/>
+        </w:rPr>
+        <w:t xml:space="preserve">：只要两层非完全孤立，合并阈值严格低于任一单层——§2.1 由 </w:t>
       </w:r>
       <w:r>
         <w:rPr>
@@ -11589,7 +11589,7 @@
           <w:sz w:val="21"/>
           <w:szCs w:val="21"/>
         </w:rPr>
-        <w:t xml:space="preserve"> 给出，图 3 把它在整个平面上兑现。图 3(b) 另将 </w:t>
+        <w:t xml:space="preserve"> 给出下界，图 3 在整个平面上印证。图 3(b) 另将 </w:t>
       </w:r>
       <w:r>
         <w:rPr>
@@ -13049,7 +13049,7 @@
           <w:sz w:val="21"/>
           <w:szCs w:val="21"/>
         </w:rPr>
-        <w:t xml:space="preserve">这一条否证了「大群体更危险」的朴素预期</w:t>
+        <w:t xml:space="preserve">余度坍缩否证了「大群体更危险」的朴素预期</w:t>
       </w:r>
       <w:r>
         <w:rPr>
@@ -13127,7 +13127,7 @@
           <w:sz w:val="21"/>
           <w:szCs w:val="21"/>
         </w:rPr>
-        <w:t xml:space="preserve">以上三条扫描都在公式看得见的自由度上进行。更能说明理论边界的，是一条它</w:t>
+        <w:t xml:space="preserve">以上扫描都在公式看得见的自由度上进行。检验理论边界须用一条它</w:t>
       </w:r>
       <w:r>
         <w:rPr>
@@ -13271,16 +13271,16 @@
           <w:sz w:val="21"/>
           <w:szCs w:val="21"/>
         </w:rPr>
-        <w:t xml:space="preserve">正是局域树状假设所丢弃的东西</w:t>
-      </w:r>
-      <w:r>
-        <w:rPr>
-          <w:rFonts w:ascii="SimSun" w:cs="SimSun" w:eastAsia="SimSun" w:hAnsi="SimSun"/>
-          <w:color w:val="000000"/>
-          <w:sz w:val="21"/>
-          <w:szCs w:val="21"/>
-        </w:rPr>
-        <w:t xml:space="preserve">。于是得到一条可证伪的推论：固定 </w:t>
+        <w:t xml:space="preserve">恰为局域树状假设所丢弃</w:t>
+      </w:r>
+      <w:r>
+        <w:rPr>
+          <w:rFonts w:ascii="SimSun" w:cs="SimSun" w:eastAsia="SimSun" w:hAnsi="SimSun"/>
+          <w:color w:val="000000"/>
+          <w:sz w:val="21"/>
+          <w:szCs w:val="21"/>
+        </w:rPr>
+        <w:t xml:space="preserve">，由此给出一条可证伪的推论：固定 </w:t>
       </w:r>
       <w:r>
         <w:rPr>
@@ -14384,7 +14384,7 @@
           <w:sz w:val="21"/>
           <w:szCs w:val="21"/>
         </w:rPr>
-        <w:t xml:space="preserve">。独立测得的比值与独立推出的解析比值就此相互印证，说明抬升的幅度本身是真实的，而非窗口选择的产物。</w:t>
+        <w:t xml:space="preserve">。独立测得的比值与独立推出的解析比值相互印证：抬升幅度确为真实，并非窗口效应。</w:t>
       </w:r>
     </w:p>
     <w:p>
@@ -14429,16 +14429,16 @@
           <w:sz w:val="21"/>
           <w:szCs w:val="21"/>
         </w:rPr>
-        <w:t xml:space="preserve">层间重叠不是可以忽略的高阶修正，而是比层间参与相关更强的阈值调控量</w:t>
-      </w:r>
-      <w:r>
-        <w:rPr>
-          <w:rFonts w:ascii="SimSun" w:cs="SimSun" w:eastAsia="SimSun" w:hAnsi="SimSun"/>
-          <w:color w:val="000000"/>
-          <w:sz w:val="21"/>
-          <w:szCs w:val="21"/>
-        </w:rPr>
-        <w:t xml:space="preserve">——图 3 中 </w:t>
+        <w:t xml:space="preserve">层间重叠并非高阶修正，其调控力度远超层间参与相关</w:t>
+      </w:r>
+      <w:r>
+        <w:rPr>
+          <w:rFonts w:ascii="SimSun" w:cs="SimSun" w:eastAsia="SimSun" w:hAnsi="SimSun"/>
+          <w:color w:val="000000"/>
+          <w:sz w:val="21"/>
+          <w:szCs w:val="21"/>
+        </w:rPr>
+        <w:t xml:space="preserve">：图 3 中 </w:t>
       </w:r>
       <w:r>
         <w:rPr>
@@ -14466,7 +14466,7 @@
           <w:sz w:val="21"/>
           <w:szCs w:val="21"/>
         </w:rPr>
-        <w:t xml:space="preserve"> 扫遍全程只移动阈值 12.5%，此处 </w:t>
+        <w:t xml:space="preserve"> 全程只移动阈值 12.5%，</w:t>
       </w:r>
       <w:r>
         <w:rPr>

</xml_diff>

<commit_message>
redesign cascade figure panels (c) and (d) so colour serves the result
Panel (c): replace the decorative magma ramp with a scale that diverges
about C=1, so the neutral band is itself the boundary between a group
that cannot replace its own seed and one that can. The contour returns
to plain ink on a near-white background, no bbox needed, and the m=2 row
reading cool throughout now makes its own point. Colourbar marks the
divergence point.

Panel (d): the numbers are the result, so the shading goes pale and
every reachable cell prints its u; the absorbing boundary is muted to
structure rather than data. Switch m=8 to m=6 to match the m range of
panels (a)-(b), box the cell the closure reads off, and drop the now
redundant colourbar.

Caption updated for both panels.

Co-Authored-By: Claude Opus 5 <noreply@anthropic.com>
Claude-Session: https://claude.ai/code/session_01GMqZS1ZXii3SRe677Qn7Mk
</commit_message>
<xml_diff>
--- a/multiplex-hypergraph-sir/combined_cn.docx
+++ b/multiplex-hypergraph-sir/combined_cn.docx
@@ -6894,7 +6894,7 @@
           <w:sz w:val="18"/>
           <w:szCs w:val="18"/>
         </w:rPr>
-        <w:t xml:space="preserve"> 平面上的分布，白线为 </w:t>
+        <w:t xml:space="preserve"> 平面上的分布，色标以 </w:t>
       </w:r>
       <w:r>
         <w:rPr>
@@ -6912,7 +6912,61 @@
           <w:sz w:val="18"/>
           <w:szCs w:val="18"/>
         </w:rPr>
-        <w:t xml:space="preserve"> 等值线，即单个群体已足以自我复制的界。(d) 递推 (2.5) 的状态格点 </w:t>
+        <w:t xml:space="preserve"> 为中心发散：冷色区单个群体不足以复制自身，暖色区已足够，实线为 </w:t>
+      </w:r>
+      <w:r>
+        <w:rPr>
+          <w:rFonts w:ascii="Cambria Math" w:cs="Cambria Math" w:eastAsia="Cambria Math" w:hAnsi="Cambria Math"/>
+          <w:color w:val="000000"/>
+          <w:sz w:val="18"/>
+          <w:szCs w:val="18"/>
+        </w:rPr>
+        <w:t xml:space="preserve">C=1</w:t>
+      </w:r>
+      <w:r>
+        <w:rPr>
+          <w:rFonts w:ascii="SimSun" w:cs="SimSun" w:eastAsia="SimSun" w:hAnsi="SimSun"/>
+          <w:color w:val="000000"/>
+          <w:sz w:val="18"/>
+          <w:szCs w:val="18"/>
+        </w:rPr>
+        <w:t xml:space="preserve"> 等值线。</w:t>
+      </w:r>
+      <w:r>
+        <w:rPr>
+          <w:rFonts w:ascii="Cambria Math" w:cs="Cambria Math" w:eastAsia="Cambria Math" w:hAnsi="Cambria Math"/>
+          <w:color w:val="000000"/>
+          <w:sz w:val="18"/>
+          <w:szCs w:val="18"/>
+        </w:rPr>
+        <w:t xml:space="preserve">m=2</w:t>
+      </w:r>
+      <w:r>
+        <w:rPr>
+          <w:rFonts w:ascii="SimSun" w:cs="SimSun" w:eastAsia="SimSun" w:hAnsi="SimSun"/>
+          <w:color w:val="000000"/>
+          <w:sz w:val="18"/>
+          <w:szCs w:val="18"/>
+        </w:rPr>
+        <w:t xml:space="preserve"> 一行恒为冷色——成对规模的群体无论 </w:t>
+      </w:r>
+      <w:r>
+        <w:rPr>
+          <w:rFonts w:ascii="Cambria Math" w:cs="Cambria Math" w:eastAsia="Cambria Math" w:hAnsi="Cambria Math"/>
+          <w:color w:val="000000"/>
+          <w:sz w:val="18"/>
+          <w:szCs w:val="18"/>
+        </w:rPr>
+        <w:t xml:space="preserve">λ</w:t>
+      </w:r>
+      <w:r>
+        <w:rPr>
+          <w:rFonts w:ascii="SimSun" w:cs="SimSun" w:eastAsia="SimSun" w:hAnsi="SimSun"/>
+          <w:color w:val="000000"/>
+          <w:sz w:val="18"/>
+          <w:szCs w:val="18"/>
+        </w:rPr>
+        <w:t xml:space="preserve"> 多大都不能自我复制。(d) 递推 (2.5) 的状态格点 </w:t>
       </w:r>
       <w:r>
         <w:rPr>
@@ -6939,7 +6993,7 @@
           <w:sz w:val="18"/>
           <w:szCs w:val="18"/>
         </w:rPr>
-        <w:t xml:space="preserve">m=8</w:t>
+        <w:t xml:space="preserve">m=6</w:t>
       </w:r>
       <w:r>
         <w:rPr>
@@ -6966,7 +7020,61 @@
           <w:sz w:val="18"/>
           <w:szCs w:val="18"/>
         </w:rPr>
-        <w:t xml:space="preserve">），级联规模由角点 </w:t>
+        <w:t xml:space="preserve">），格内数字即 </w:t>
+      </w:r>
+      <w:r>
+        <w:rPr>
+          <w:rFonts w:ascii="Cambria Math" w:cs="Cambria Math" w:eastAsia="Cambria Math" w:hAnsi="Cambria Math"/>
+          <w:color w:val="000000"/>
+          <w:sz w:val="18"/>
+          <w:szCs w:val="18"/>
+        </w:rPr>
+        <w:t xml:space="preserve">u</w:t>
+      </w:r>
+      <w:r>
+        <w:rPr>
+          <w:rFonts w:ascii="SimSun" w:cs="SimSun" w:eastAsia="SimSun" w:hAnsi="SimSun"/>
+          <w:color w:val="000000"/>
+          <w:sz w:val="18"/>
+          <w:szCs w:val="18"/>
+        </w:rPr>
+        <w:t xml:space="preserve"> 的取值，灰色 0 为吸收边界（</w:t>
+      </w:r>
+      <w:r>
+        <w:rPr>
+          <w:rFonts w:ascii="Cambria Math" w:cs="Cambria Math" w:eastAsia="Cambria Math" w:hAnsi="Cambria Math"/>
+          <w:color w:val="000000"/>
+          <w:sz w:val="18"/>
+          <w:szCs w:val="18"/>
+        </w:rPr>
+        <w:t xml:space="preserve">i=0</w:t>
+      </w:r>
+      <w:r>
+        <w:rPr>
+          <w:rFonts w:ascii="SimSun" w:cs="SimSun" w:eastAsia="SimSun" w:hAnsi="SimSun"/>
+          <w:color w:val="000000"/>
+          <w:sz w:val="18"/>
+          <w:szCs w:val="18"/>
+        </w:rPr>
+        <w:t xml:space="preserve"> 熄灭、</w:t>
+      </w:r>
+      <w:r>
+        <w:rPr>
+          <w:rFonts w:ascii="Cambria Math" w:cs="Cambria Math" w:eastAsia="Cambria Math" w:hAnsi="Cambria Math"/>
+          <w:color w:val="000000"/>
+          <w:sz w:val="18"/>
+          <w:szCs w:val="18"/>
+        </w:rPr>
+        <w:t xml:space="preserve">s=0</w:t>
+      </w:r>
+      <w:r>
+        <w:rPr>
+          <w:rFonts w:ascii="SimSun" w:cs="SimSun" w:eastAsia="SimSun" w:hAnsi="SimSun"/>
+          <w:color w:val="000000"/>
+          <w:sz w:val="18"/>
+          <w:szCs w:val="18"/>
+        </w:rPr>
+        <w:t xml:space="preserve"> 群体耗尽）；级联规模由方框标出的角点 </w:t>
       </w:r>
       <w:r>
         <w:rPr>

</xml_diff>